<commit_message>
3.A.22: GFPU con tramos convexos; 3.A.22 y 3.A.23: tema aprobado
Co-Authored-By: Claude Opus 5.5 <noreply@anthropic.com>
Claude-Session: https://claude.ai/code/session_01PWJgAjs4PN1Rvp3aLA4tqT
</commit_message>
<xml_diff>
--- a/oposicion/temario/tercer-ejercicio/3A22.docx
+++ b/oposicion/temario/tercer-ejercicio/3A22.docx
@@ -10609,78 +10609,10 @@
           <w:i/>
           <w:iCs/>
         </w:rPr>
-        <w:t xml:space="preserve">Implicación</w:t>
-      </w:r>
-      <w:r>
-        <w:t xml:space="preserve">: hay infinitos óptimos globales, toda la GFPU, y el criterio de</w:t>
-      </w:r>
-      <w:r>
-        <w:t xml:space="preserve"> </w:t>
-      </w:r>
-      <w:r>
-        <w:rPr>
-          <w:smallCaps/>
-        </w:rPr>
-        <w:t xml:space="preserve">Pareto</w:t>
-      </w:r>
-      <w:r>
-        <w:t xml:space="preserve"> </w:t>
-      </w:r>
-      <w:r>
-        <w:t xml:space="preserve">no los ordena.</w:t>
-      </w:r>
-      <w:r>
-        <w:rPr>
-          <w:rStyle w:val="FootnoteReference"/>
-        </w:rPr>
-        <w:footnoteReference w:id="64"/>
-      </w:r>
-      <w:r>
-        <w:t xml:space="preserve"> </w:t>
-      </w:r>
-      <w:r>
-        <w:t xml:space="preserve">La optimalidad de</w:t>
-      </w:r>
-      <w:r>
-        <w:t xml:space="preserve"> </w:t>
-      </w:r>
-      <w:r>
-        <w:rPr>
-          <w:smallCaps/>
-        </w:rPr>
-        <w:t xml:space="preserve">Pareto</w:t>
-      </w:r>
-      <w:r>
-        <w:t xml:space="preserve"> </w:t>
-      </w:r>
-      <w:r>
-        <w:t xml:space="preserve">es una condición</w:t>
-      </w:r>
-      <w:r>
-        <w:t xml:space="preserve"> </w:t>
-      </w:r>
-      <w:r>
-        <w:rPr>
-          <w:i/>
-          <w:iCs/>
-        </w:rPr>
-        <w:t xml:space="preserve">necesaria pero no suficiente</w:t>
-      </w:r>
-      <w:r>
-        <w:t xml:space="preserve"> </w:t>
-      </w:r>
-      <w:r>
-        <w:t xml:space="preserve">para maximizar el bienestar social.</w:t>
-      </w:r>
-    </w:p>
-    <w:bookmarkEnd w:id="65"/>
-    <w:bookmarkStart w:id="71" w:name="elegir_entre___ptimos_la_funci__n__90752"/>
-    <w:p>
-      <w:pPr>
-        <w:pStyle w:val="Heading4"/>
-      </w:pPr>
-      <w:r>
-        <w:t xml:space="preserve">Elegir entre óptimos: la función de bienestar social</w:t>
+        <w:t xml:space="preserve">Forma de la GFPU</w:t>
+      </w:r>
+      <w:r>
+        <w:t xml:space="preserve">: como la utilidad es ordinal, ni las FPU ni la GFPU tienen por qué ser cóncavas. La GFPU solo tiene que ser decreciente y puede tener tramos convexos (hondonadas), como en el gráfico.</w:t>
       </w:r>
     </w:p>
     <w:p>
@@ -10688,6 +10620,92 @@
         <w:numPr>
           <w:ilvl w:val="0"/>
           <w:numId w:val="1033"/>
+        </w:numPr>
+      </w:pPr>
+      <w:r>
+        <w:rPr>
+          <w:i/>
+          <w:iCs/>
+        </w:rPr>
+        <w:t xml:space="preserve">Implicación</w:t>
+      </w:r>
+      <w:r>
+        <w:t xml:space="preserve">: hay infinitos óptimos globales, toda la GFPU, y el criterio de</w:t>
+      </w:r>
+      <w:r>
+        <w:t xml:space="preserve"> </w:t>
+      </w:r>
+      <w:r>
+        <w:rPr>
+          <w:smallCaps/>
+        </w:rPr>
+        <w:t xml:space="preserve">Pareto</w:t>
+      </w:r>
+      <w:r>
+        <w:t xml:space="preserve"> </w:t>
+      </w:r>
+      <w:r>
+        <w:t xml:space="preserve">no los ordena.</w:t>
+      </w:r>
+      <w:r>
+        <w:rPr>
+          <w:rStyle w:val="FootnoteReference"/>
+        </w:rPr>
+        <w:footnoteReference w:id="64"/>
+      </w:r>
+      <w:r>
+        <w:t xml:space="preserve"> </w:t>
+      </w:r>
+      <w:r>
+        <w:t xml:space="preserve">La optimalidad de</w:t>
+      </w:r>
+      <w:r>
+        <w:t xml:space="preserve"> </w:t>
+      </w:r>
+      <w:r>
+        <w:rPr>
+          <w:smallCaps/>
+        </w:rPr>
+        <w:t xml:space="preserve">Pareto</w:t>
+      </w:r>
+      <w:r>
+        <w:t xml:space="preserve"> </w:t>
+      </w:r>
+      <w:r>
+        <w:t xml:space="preserve">es una condición</w:t>
+      </w:r>
+      <w:r>
+        <w:t xml:space="preserve"> </w:t>
+      </w:r>
+      <w:r>
+        <w:rPr>
+          <w:i/>
+          <w:iCs/>
+        </w:rPr>
+        <w:t xml:space="preserve">necesaria pero no suficiente</w:t>
+      </w:r>
+      <w:r>
+        <w:t xml:space="preserve"> </w:t>
+      </w:r>
+      <w:r>
+        <w:t xml:space="preserve">para maximizar el bienestar social.</w:t>
+      </w:r>
+    </w:p>
+    <w:bookmarkEnd w:id="65"/>
+    <w:bookmarkStart w:id="71" w:name="elegir_entre___ptimos_la_funci__n__90752"/>
+    <w:p>
+      <w:pPr>
+        <w:pStyle w:val="Heading4"/>
+      </w:pPr>
+      <w:r>
+        <w:t xml:space="preserve">Elegir entre óptimos: la función de bienestar social</w:t>
+      </w:r>
+    </w:p>
+    <w:p>
+      <w:pPr>
+        <w:numPr>
+          <w:ilvl w:val="0"/>
+          <w:numId w:val="1034"/>
         </w:numPr>
       </w:pPr>
       <w:r>
@@ -10844,7 +10862,7 @@
       <w:pPr>
         <w:numPr>
           <w:ilvl w:val="0"/>
-          <w:numId w:val="1033"/>
+          <w:numId w:val="1034"/>
         </w:numPr>
       </w:pPr>
       <w:r>
@@ -10899,14 +10917,44 @@
         <w:t xml:space="preserve">bliss point</w:t>
       </w:r>
       <w:r>
-        <w:t xml:space="preserve">).</w:t>
+        <w:t xml:space="preserve">). Como la GFPU puede tener hondonadas, una tangencia no basta: el punto de felicidad es el máximo</w:t>
+      </w:r>
+      <w:r>
+        <w:t xml:space="preserve"> </w:t>
+      </w:r>
+      <w:r>
+        <w:rPr>
+          <w:i/>
+          <w:iCs/>
+        </w:rPr>
+        <w:t xml:space="preserve">global</w:t>
+      </w:r>
+      <w:r>
+        <w:t xml:space="preserve"> </w:t>
+      </w:r>
+      <w:r>
+        <w:t xml:space="preserve">de</w:t>
+      </w:r>
+      <w:r>
+        <w:t xml:space="preserve"> </w:t>
+      </w:r>
+      <m:oMath>
+        <m:r>
+          <m:t>W</m:t>
+        </m:r>
+      </m:oMath>
+      <w:r>
+        <w:t xml:space="preserve"> </w:t>
+      </w:r>
+      <w:r>
+        <w:t xml:space="preserve">sobre la GFPU.</w:t>
       </w:r>
     </w:p>
     <w:p>
       <w:pPr>
         <w:numPr>
           <w:ilvl w:val="0"/>
-          <w:numId w:val="1033"/>
+          <w:numId w:val="1034"/>
         </w:numPr>
       </w:pPr>
       <w:r>
@@ -11028,7 +11076,7 @@
       <w:pPr>
         <w:numPr>
           <w:ilvl w:val="0"/>
-          <w:numId w:val="1033"/>
+          <w:numId w:val="1034"/>
         </w:numPr>
       </w:pPr>
       <w:r>
@@ -11251,7 +11299,7 @@
         <w:keepNext/>
         <w:numPr>
           <w:ilvl w:val="0"/>
-          <w:numId w:val="1034"/>
+          <w:numId w:val="1035"/>
         </w:numPr>
       </w:pPr>
       <w:r>
@@ -11269,7 +11317,7 @@
       <w:pPr>
         <w:numPr>
           <w:ilvl w:val="1"/>
-          <w:numId w:val="1035"/>
+          <w:numId w:val="1036"/>
         </w:numPr>
       </w:pPr>
       <w:r>
@@ -11293,7 +11341,7 @@
       <w:pPr>
         <w:numPr>
           <w:ilvl w:val="1"/>
-          <w:numId w:val="1035"/>
+          <w:numId w:val="1036"/>
         </w:numPr>
       </w:pPr>
       <w:r>
@@ -11317,7 +11365,7 @@
       <w:pPr>
         <w:numPr>
           <w:ilvl w:val="1"/>
-          <w:numId w:val="1035"/>
+          <w:numId w:val="1036"/>
         </w:numPr>
       </w:pPr>
       <w:r>
@@ -11356,7 +11404,7 @@
         <w:keepNext/>
         <w:numPr>
           <w:ilvl w:val="0"/>
-          <w:numId w:val="1034"/>
+          <w:numId w:val="1035"/>
         </w:numPr>
       </w:pPr>
       <w:r>
@@ -11374,7 +11422,7 @@
       <w:pPr>
         <w:numPr>
           <w:ilvl w:val="1"/>
-          <w:numId w:val="1036"/>
+          <w:numId w:val="1037"/>
         </w:numPr>
       </w:pPr>
       <w:r>
@@ -11432,7 +11480,7 @@
       <w:pPr>
         <w:numPr>
           <w:ilvl w:val="1"/>
-          <w:numId w:val="1036"/>
+          <w:numId w:val="1037"/>
         </w:numPr>
       </w:pPr>
       <w:r>
@@ -11466,7 +11514,7 @@
       <w:pPr>
         <w:numPr>
           <w:ilvl w:val="1"/>
-          <w:numId w:val="1036"/>
+          <w:numId w:val="1037"/>
         </w:numPr>
       </w:pPr>
       <w:r>
@@ -11484,7 +11532,7 @@
       <w:pPr>
         <w:numPr>
           <w:ilvl w:val="1"/>
-          <w:numId w:val="1036"/>
+          <w:numId w:val="1037"/>
         </w:numPr>
       </w:pPr>
       <w:r>
@@ -11564,7 +11612,7 @@
       <w:pPr>
         <w:numPr>
           <w:ilvl w:val="1"/>
-          <w:numId w:val="1036"/>
+          <w:numId w:val="1037"/>
         </w:numPr>
       </w:pPr>
       <w:r>
@@ -11589,7 +11637,7 @@
         <w:keepNext/>
         <w:numPr>
           <w:ilvl w:val="0"/>
-          <w:numId w:val="1034"/>
+          <w:numId w:val="1035"/>
         </w:numPr>
       </w:pPr>
       <w:r>
@@ -11607,7 +11655,7 @@
       <w:pPr>
         <w:numPr>
           <w:ilvl w:val="1"/>
-          <w:numId w:val="1037"/>
+          <w:numId w:val="1038"/>
         </w:numPr>
       </w:pPr>
       <w:r>
@@ -11766,7 +11814,7 @@
       <w:pPr>
         <w:numPr>
           <w:ilvl w:val="1"/>
-          <w:numId w:val="1037"/>
+          <w:numId w:val="1038"/>
         </w:numPr>
       </w:pPr>
       <w:r>
@@ -11837,7 +11885,7 @@
       <w:pPr>
         <w:numPr>
           <w:ilvl w:val="0"/>
-          <w:numId w:val="1034"/>
+          <w:numId w:val="1035"/>
         </w:numPr>
       </w:pPr>
       <w:r>
@@ -11892,7 +11940,7 @@
       <w:pPr>
         <w:numPr>
           <w:ilvl w:val="0"/>
-          <w:numId w:val="1038"/>
+          <w:numId w:val="1039"/>
         </w:numPr>
       </w:pPr>
       <w:r>
@@ -11923,7 +11971,7 @@
         <w:keepNext/>
         <w:numPr>
           <w:ilvl w:val="0"/>
-          <w:numId w:val="1038"/>
+          <w:numId w:val="1039"/>
         </w:numPr>
       </w:pPr>
       <w:r>
@@ -11941,7 +11989,7 @@
       <w:pPr>
         <w:numPr>
           <w:ilvl w:val="1"/>
-          <w:numId w:val="1039"/>
+          <w:numId w:val="1040"/>
         </w:numPr>
       </w:pPr>
       <w:r>
@@ -11968,7 +12016,7 @@
       <w:pPr>
         <w:numPr>
           <w:ilvl w:val="1"/>
-          <w:numId w:val="1039"/>
+          <w:numId w:val="1040"/>
         </w:numPr>
       </w:pPr>
       <w:r>
@@ -12007,7 +12055,7 @@
         <w:keepNext/>
         <w:numPr>
           <w:ilvl w:val="0"/>
-          <w:numId w:val="1038"/>
+          <w:numId w:val="1039"/>
         </w:numPr>
       </w:pPr>
       <w:r>
@@ -12166,7 +12214,7 @@
       <w:pPr>
         <w:numPr>
           <w:ilvl w:val="1"/>
-          <w:numId w:val="1040"/>
+          <w:numId w:val="1041"/>
         </w:numPr>
       </w:pPr>
       <w:r>
@@ -12297,7 +12345,7 @@
       <w:pPr>
         <w:numPr>
           <w:ilvl w:val="1"/>
-          <w:numId w:val="1040"/>
+          <w:numId w:val="1041"/>
         </w:numPr>
       </w:pPr>
       <w:r>
@@ -12524,7 +12572,7 @@
       <w:pPr>
         <w:numPr>
           <w:ilvl w:val="1"/>
-          <w:numId w:val="1040"/>
+          <w:numId w:val="1041"/>
         </w:numPr>
       </w:pPr>
       <w:r>
@@ -12791,7 +12839,7 @@
       <w:pPr>
         <w:numPr>
           <w:ilvl w:val="0"/>
-          <w:numId w:val="1038"/>
+          <w:numId w:val="1039"/>
         </w:numPr>
       </w:pPr>
       <w:r>
@@ -13044,7 +13092,7 @@
       <w:pPr>
         <w:numPr>
           <w:ilvl w:val="0"/>
-          <w:numId w:val="1041"/>
+          <w:numId w:val="1042"/>
         </w:numPr>
       </w:pPr>
       <w:r>
@@ -13135,7 +13183,7 @@
       <w:pPr>
         <w:numPr>
           <w:ilvl w:val="0"/>
-          <w:numId w:val="1041"/>
+          <w:numId w:val="1042"/>
         </w:numPr>
       </w:pPr>
       <w:r>
@@ -13207,7 +13255,7 @@
         <w:keepNext/>
         <w:numPr>
           <w:ilvl w:val="0"/>
-          <w:numId w:val="1041"/>
+          <w:numId w:val="1042"/>
         </w:numPr>
       </w:pPr>
       <w:r>
@@ -13258,7 +13306,7 @@
       <w:pPr>
         <w:numPr>
           <w:ilvl w:val="1"/>
-          <w:numId w:val="1042"/>
+          <w:numId w:val="1043"/>
         </w:numPr>
       </w:pPr>
       <w:r>
@@ -13269,7 +13317,7 @@
       <w:pPr>
         <w:numPr>
           <w:ilvl w:val="1"/>
-          <w:numId w:val="1042"/>
+          <w:numId w:val="1043"/>
         </w:numPr>
       </w:pPr>
       <w:r>
@@ -13315,7 +13363,7 @@
         <w:keepNext/>
         <w:numPr>
           <w:ilvl w:val="0"/>
-          <w:numId w:val="1043"/>
+          <w:numId w:val="1044"/>
         </w:numPr>
       </w:pPr>
       <w:r>
@@ -13359,7 +13407,7 @@
       <w:pPr>
         <w:numPr>
           <w:ilvl w:val="1"/>
-          <w:numId w:val="1044"/>
+          <w:numId w:val="1045"/>
         </w:numPr>
       </w:pPr>
       <w:r>
@@ -13460,7 +13508,7 @@
       <w:pPr>
         <w:numPr>
           <w:ilvl w:val="1"/>
-          <w:numId w:val="1044"/>
+          <w:numId w:val="1045"/>
         </w:numPr>
       </w:pPr>
       <w:r>
@@ -13656,7 +13704,7 @@
       <w:pPr>
         <w:numPr>
           <w:ilvl w:val="1"/>
-          <w:numId w:val="1044"/>
+          <w:numId w:val="1045"/>
         </w:numPr>
       </w:pPr>
       <w:r>
@@ -13674,7 +13722,7 @@
       <w:pPr>
         <w:numPr>
           <w:ilvl w:val="0"/>
-          <w:numId w:val="1043"/>
+          <w:numId w:val="1044"/>
         </w:numPr>
       </w:pPr>
       <w:r>
@@ -14380,7 +14428,7 @@
       <w:pPr>
         <w:numPr>
           <w:ilvl w:val="0"/>
-          <w:numId w:val="1045"/>
+          <w:numId w:val="1046"/>
         </w:numPr>
       </w:pPr>
       <w:r>
@@ -14435,7 +14483,7 @@
       <w:pPr>
         <w:numPr>
           <w:ilvl w:val="0"/>
-          <w:numId w:val="1045"/>
+          <w:numId w:val="1046"/>
         </w:numPr>
       </w:pPr>
       <w:r>
@@ -14463,7 +14511,7 @@
       <w:pPr>
         <w:numPr>
           <w:ilvl w:val="0"/>
-          <w:numId w:val="1046"/>
+          <w:numId w:val="1047"/>
         </w:numPr>
       </w:pPr>
       <w:r>
@@ -15064,7 +15112,7 @@
       <w:pPr>
         <w:numPr>
           <w:ilvl w:val="1"/>
-          <w:numId w:val="1047"/>
+          <w:numId w:val="1048"/>
         </w:numPr>
       </w:pPr>
       <w:r>
@@ -15110,7 +15158,7 @@
       <w:pPr>
         <w:numPr>
           <w:ilvl w:val="1"/>
-          <w:numId w:val="1047"/>
+          <w:numId w:val="1048"/>
         </w:numPr>
       </w:pPr>
       <w:r>
@@ -15162,7 +15210,7 @@
       <w:pPr>
         <w:numPr>
           <w:ilvl w:val="0"/>
-          <w:numId w:val="1046"/>
+          <w:numId w:val="1047"/>
         </w:numPr>
       </w:pPr>
       <w:r>
@@ -15741,7 +15789,7 @@
       <w:pPr>
         <w:numPr>
           <w:ilvl w:val="1"/>
-          <w:numId w:val="1048"/>
+          <w:numId w:val="1049"/>
         </w:numPr>
       </w:pPr>
       <w:r>
@@ -15759,7 +15807,7 @@
       <w:pPr>
         <w:numPr>
           <w:ilvl w:val="1"/>
-          <w:numId w:val="1048"/>
+          <w:numId w:val="1049"/>
         </w:numPr>
       </w:pPr>
       <w:r>
@@ -15783,7 +15831,7 @@
       <w:pPr>
         <w:numPr>
           <w:ilvl w:val="0"/>
-          <w:numId w:val="1046"/>
+          <w:numId w:val="1047"/>
         </w:numPr>
       </w:pPr>
       <w:r>
@@ -16182,7 +16230,7 @@
       <w:pPr>
         <w:numPr>
           <w:ilvl w:val="1"/>
-          <w:numId w:val="1049"/>
+          <w:numId w:val="1050"/>
         </w:numPr>
       </w:pPr>
       <w:r>
@@ -16225,7 +16273,7 @@
       <w:pPr>
         <w:numPr>
           <w:ilvl w:val="1"/>
-          <w:numId w:val="1049"/>
+          <w:numId w:val="1050"/>
         </w:numPr>
       </w:pPr>
       <w:r>
@@ -16373,7 +16421,7 @@
       <w:pPr>
         <w:numPr>
           <w:ilvl w:val="0"/>
-          <w:numId w:val="1046"/>
+          <w:numId w:val="1047"/>
         </w:numPr>
       </w:pPr>
       <w:r>
@@ -16768,7 +16816,7 @@
       <w:pPr>
         <w:numPr>
           <w:ilvl w:val="1"/>
-          <w:numId w:val="1050"/>
+          <w:numId w:val="1051"/>
         </w:numPr>
       </w:pPr>
       <w:r>
@@ -16791,7 +16839,7 @@
       <w:pPr>
         <w:numPr>
           <w:ilvl w:val="1"/>
-          <w:numId w:val="1050"/>
+          <w:numId w:val="1051"/>
         </w:numPr>
       </w:pPr>
       <w:r>
@@ -16857,7 +16905,7 @@
       <w:pPr>
         <w:numPr>
           <w:ilvl w:val="0"/>
-          <w:numId w:val="1046"/>
+          <w:numId w:val="1047"/>
         </w:numPr>
       </w:pPr>
       <w:r>
@@ -17360,7 +17408,7 @@
       <w:pPr>
         <w:numPr>
           <w:ilvl w:val="1"/>
-          <w:numId w:val="1051"/>
+          <w:numId w:val="1052"/>
         </w:numPr>
       </w:pPr>
       <w:r>
@@ -17400,7 +17448,7 @@
       <w:pPr>
         <w:numPr>
           <w:ilvl w:val="1"/>
-          <w:numId w:val="1051"/>
+          <w:numId w:val="1052"/>
         </w:numPr>
       </w:pPr>
       <w:r>
@@ -18603,7 +18651,7 @@
       <w:pPr>
         <w:numPr>
           <w:ilvl w:val="0"/>
-          <w:numId w:val="1052"/>
+          <w:numId w:val="1053"/>
         </w:numPr>
       </w:pPr>
       <w:r>
@@ -19019,7 +19067,7 @@
       <w:pPr>
         <w:numPr>
           <w:ilvl w:val="0"/>
-          <w:numId w:val="1053"/>
+          <w:numId w:val="1054"/>
         </w:numPr>
       </w:pPr>
       <w:r>
@@ -19064,7 +19112,7 @@
       <w:pPr>
         <w:numPr>
           <w:ilvl w:val="0"/>
-          <w:numId w:val="1053"/>
+          <w:numId w:val="1054"/>
         </w:numPr>
       </w:pPr>
       <w:r>
@@ -19082,7 +19130,7 @@
       <w:pPr>
         <w:numPr>
           <w:ilvl w:val="0"/>
-          <w:numId w:val="1053"/>
+          <w:numId w:val="1054"/>
         </w:numPr>
       </w:pPr>
       <w:r>
@@ -19118,7 +19166,7 @@
         <w:keepNext/>
         <w:numPr>
           <w:ilvl w:val="0"/>
-          <w:numId w:val="1054"/>
+          <w:numId w:val="1055"/>
         </w:numPr>
       </w:pPr>
       <w:r>
@@ -19287,7 +19335,7 @@
       <w:pPr>
         <w:numPr>
           <w:ilvl w:val="1"/>
-          <w:numId w:val="1055"/>
+          <w:numId w:val="1056"/>
         </w:numPr>
       </w:pPr>
       <w:r>
@@ -19384,7 +19432,7 @@
       <w:pPr>
         <w:numPr>
           <w:ilvl w:val="1"/>
-          <w:numId w:val="1055"/>
+          <w:numId w:val="1056"/>
         </w:numPr>
       </w:pPr>
       <w:r>
@@ -19481,7 +19529,7 @@
       <w:pPr>
         <w:numPr>
           <w:ilvl w:val="1"/>
-          <w:numId w:val="1055"/>
+          <w:numId w:val="1056"/>
         </w:numPr>
       </w:pPr>
       <w:r>
@@ -19578,7 +19626,7 @@
       <w:pPr>
         <w:numPr>
           <w:ilvl w:val="1"/>
-          <w:numId w:val="1055"/>
+          <w:numId w:val="1056"/>
         </w:numPr>
       </w:pPr>
       <w:r>
@@ -20221,7 +20269,7 @@
       <w:pPr>
         <w:numPr>
           <w:ilvl w:val="1"/>
-          <w:numId w:val="1055"/>
+          <w:numId w:val="1056"/>
         </w:numPr>
       </w:pPr>
       <w:r>
@@ -20393,7 +20441,7 @@
       <w:pPr>
         <w:numPr>
           <w:ilvl w:val="0"/>
-          <w:numId w:val="1054"/>
+          <w:numId w:val="1055"/>
         </w:numPr>
       </w:pPr>
       <w:r>
@@ -20433,7 +20481,7 @@
         <w:keepNext/>
         <w:numPr>
           <w:ilvl w:val="0"/>
-          <w:numId w:val="1056"/>
+          <w:numId w:val="1057"/>
         </w:numPr>
       </w:pPr>
       <w:r>
@@ -20451,7 +20499,7 @@
       <w:pPr>
         <w:numPr>
           <w:ilvl w:val="1"/>
-          <w:numId w:val="1057"/>
+          <w:numId w:val="1058"/>
         </w:numPr>
       </w:pPr>
       <w:r>
@@ -20503,7 +20551,7 @@
       <w:pPr>
         <w:numPr>
           <w:ilvl w:val="1"/>
-          <w:numId w:val="1057"/>
+          <w:numId w:val="1058"/>
         </w:numPr>
       </w:pPr>
       <w:r>
@@ -20555,7 +20603,7 @@
       <w:pPr>
         <w:numPr>
           <w:ilvl w:val="0"/>
-          <w:numId w:val="1056"/>
+          <w:numId w:val="1057"/>
         </w:numPr>
       </w:pPr>
       <w:r>
@@ -20597,7 +20645,7 @@
       <w:pPr>
         <w:numPr>
           <w:ilvl w:val="0"/>
-          <w:numId w:val="1058"/>
+          <w:numId w:val="1059"/>
         </w:numPr>
       </w:pPr>
       <w:r>
@@ -20616,7 +20664,7 @@
         <w:keepNext/>
         <w:numPr>
           <w:ilvl w:val="0"/>
-          <w:numId w:val="1058"/>
+          <w:numId w:val="1059"/>
         </w:numPr>
       </w:pPr>
       <w:r>
@@ -20661,7 +20709,7 @@
       <w:pPr>
         <w:numPr>
           <w:ilvl w:val="1"/>
-          <w:numId w:val="1059"/>
+          <w:numId w:val="1060"/>
         </w:numPr>
       </w:pPr>
       <w:r>
@@ -20686,7 +20734,7 @@
       <w:pPr>
         <w:numPr>
           <w:ilvl w:val="1"/>
-          <w:numId w:val="1059"/>
+          <w:numId w:val="1060"/>
         </w:numPr>
       </w:pPr>
       <w:r>
@@ -20733,7 +20781,7 @@
       <w:pPr>
         <w:numPr>
           <w:ilvl w:val="1"/>
-          <w:numId w:val="1059"/>
+          <w:numId w:val="1060"/>
         </w:numPr>
       </w:pPr>
       <w:r>
@@ -20758,7 +20806,7 @@
       <w:pPr>
         <w:numPr>
           <w:ilvl w:val="1"/>
-          <w:numId w:val="1059"/>
+          <w:numId w:val="1060"/>
         </w:numPr>
       </w:pPr>
       <w:r>
@@ -20846,7 +20894,7 @@
       <w:pPr>
         <w:numPr>
           <w:ilvl w:val="0"/>
-          <w:numId w:val="1058"/>
+          <w:numId w:val="1059"/>
         </w:numPr>
       </w:pPr>
       <w:r>
@@ -20881,7 +20929,7 @@
       <w:pPr>
         <w:numPr>
           <w:ilvl w:val="0"/>
-          <w:numId w:val="1058"/>
+          <w:numId w:val="1059"/>
         </w:numPr>
       </w:pPr>
       <w:r>
@@ -20899,7 +20947,7 @@
       <w:pPr>
         <w:numPr>
           <w:ilvl w:val="0"/>
-          <w:numId w:val="1058"/>
+          <w:numId w:val="1059"/>
         </w:numPr>
       </w:pPr>
       <w:r>
@@ -20972,7 +21020,7 @@
       <w:pPr>
         <w:numPr>
           <w:ilvl w:val="0"/>
-          <w:numId w:val="1060"/>
+          <w:numId w:val="1061"/>
         </w:numPr>
       </w:pPr>
       <w:r>
@@ -21099,7 +21147,7 @@
       <w:pPr>
         <w:numPr>
           <w:ilvl w:val="0"/>
-          <w:numId w:val="1060"/>
+          <w:numId w:val="1061"/>
         </w:numPr>
       </w:pPr>
       <w:r>
@@ -21136,7 +21184,7 @@
       <w:pPr>
         <w:numPr>
           <w:ilvl w:val="0"/>
-          <w:numId w:val="1061"/>
+          <w:numId w:val="1062"/>
         </w:numPr>
       </w:pPr>
       <w:r>
@@ -21158,7 +21206,7 @@
       <w:pPr>
         <w:numPr>
           <w:ilvl w:val="0"/>
-          <w:numId w:val="1061"/>
+          <w:numId w:val="1062"/>
         </w:numPr>
       </w:pPr>
       <w:r>
@@ -21179,7 +21227,7 @@
       <w:pPr>
         <w:numPr>
           <w:ilvl w:val="0"/>
-          <w:numId w:val="1061"/>
+          <w:numId w:val="1062"/>
         </w:numPr>
       </w:pPr>
       <w:r>
@@ -21214,7 +21262,7 @@
       <w:pPr>
         <w:numPr>
           <w:ilvl w:val="0"/>
-          <w:numId w:val="1061"/>
+          <w:numId w:val="1062"/>
         </w:numPr>
       </w:pPr>
       <w:r>
@@ -21249,7 +21297,7 @@
         <w:keepNext/>
         <w:numPr>
           <w:ilvl w:val="0"/>
-          <w:numId w:val="1062"/>
+          <w:numId w:val="1063"/>
         </w:numPr>
       </w:pPr>
       <w:r>
@@ -21327,7 +21375,7 @@
       <w:pPr>
         <w:numPr>
           <w:ilvl w:val="1"/>
-          <w:numId w:val="1063"/>
+          <w:numId w:val="1064"/>
         </w:numPr>
       </w:pPr>
       <w:r>
@@ -21483,7 +21531,7 @@
       <w:pPr>
         <w:numPr>
           <w:ilvl w:val="1"/>
-          <w:numId w:val="1063"/>
+          <w:numId w:val="1064"/>
         </w:numPr>
       </w:pPr>
       <w:r>
@@ -21576,7 +21624,7 @@
       <w:pPr>
         <w:numPr>
           <w:ilvl w:val="1"/>
-          <w:numId w:val="1063"/>
+          <w:numId w:val="1064"/>
         </w:numPr>
       </w:pPr>
       <w:r>
@@ -21863,7 +21911,7 @@
         <w:keepNext/>
         <w:numPr>
           <w:ilvl w:val="0"/>
-          <w:numId w:val="1064"/>
+          <w:numId w:val="1065"/>
         </w:numPr>
       </w:pPr>
       <w:r>
@@ -21966,7 +22014,7 @@
       <w:pPr>
         <w:numPr>
           <w:ilvl w:val="1"/>
-          <w:numId w:val="1065"/>
+          <w:numId w:val="1066"/>
         </w:numPr>
       </w:pPr>
       <w:r>
@@ -22221,7 +22269,7 @@
       <w:pPr>
         <w:numPr>
           <w:ilvl w:val="1"/>
-          <w:numId w:val="1065"/>
+          <w:numId w:val="1066"/>
         </w:numPr>
       </w:pPr>
       <w:r>
@@ -22313,7 +22361,7 @@
       <w:pPr>
         <w:numPr>
           <w:ilvl w:val="1"/>
-          <w:numId w:val="1065"/>
+          <w:numId w:val="1066"/>
         </w:numPr>
       </w:pPr>
       <w:r>
@@ -22554,7 +22602,7 @@
       <w:pPr>
         <w:numPr>
           <w:ilvl w:val="1"/>
-          <w:numId w:val="1065"/>
+          <w:numId w:val="1066"/>
         </w:numPr>
       </w:pPr>
       <w:r>
@@ -22965,7 +23013,7 @@
       <w:pPr>
         <w:numPr>
           <w:ilvl w:val="0"/>
-          <w:numId w:val="1064"/>
+          <w:numId w:val="1065"/>
         </w:numPr>
       </w:pPr>
       <w:r>
@@ -23200,7 +23248,7 @@
       <w:pPr>
         <w:numPr>
           <w:ilvl w:val="0"/>
-          <w:numId w:val="1066"/>
+          <w:numId w:val="1067"/>
         </w:numPr>
       </w:pPr>
       <w:r>
@@ -23218,7 +23266,7 @@
       <w:pPr>
         <w:numPr>
           <w:ilvl w:val="0"/>
-          <w:numId w:val="1066"/>
+          <w:numId w:val="1067"/>
         </w:numPr>
       </w:pPr>
       <w:r>
@@ -23266,7 +23314,7 @@
       <w:pPr>
         <w:numPr>
           <w:ilvl w:val="0"/>
-          <w:numId w:val="1066"/>
+          <w:numId w:val="1067"/>
         </w:numPr>
       </w:pPr>
       <w:r>
@@ -23357,7 +23405,7 @@
         <w:keepNext/>
         <w:numPr>
           <w:ilvl w:val="0"/>
-          <w:numId w:val="1067"/>
+          <w:numId w:val="1068"/>
         </w:numPr>
       </w:pPr>
       <w:r>
@@ -23375,7 +23423,7 @@
       <w:pPr>
         <w:numPr>
           <w:ilvl w:val="1"/>
-          <w:numId w:val="1068"/>
+          <w:numId w:val="1069"/>
         </w:numPr>
       </w:pPr>
       <w:r>
@@ -23420,7 +23468,7 @@
       <w:pPr>
         <w:numPr>
           <w:ilvl w:val="1"/>
-          <w:numId w:val="1068"/>
+          <w:numId w:val="1069"/>
         </w:numPr>
       </w:pPr>
       <w:r>
@@ -23452,7 +23500,7 @@
       <w:pPr>
         <w:numPr>
           <w:ilvl w:val="1"/>
-          <w:numId w:val="1068"/>
+          <w:numId w:val="1069"/>
         </w:numPr>
       </w:pPr>
       <w:r>
@@ -23497,7 +23545,7 @@
       <w:pPr>
         <w:numPr>
           <w:ilvl w:val="1"/>
-          <w:numId w:val="1068"/>
+          <w:numId w:val="1069"/>
         </w:numPr>
       </w:pPr>
       <w:r>
@@ -23571,7 +23619,7 @@
         <w:keepNext/>
         <w:numPr>
           <w:ilvl w:val="0"/>
-          <w:numId w:val="1067"/>
+          <w:numId w:val="1068"/>
         </w:numPr>
       </w:pPr>
       <w:r>
@@ -23589,7 +23637,7 @@
       <w:pPr>
         <w:numPr>
           <w:ilvl w:val="1"/>
-          <w:numId w:val="1069"/>
+          <w:numId w:val="1070"/>
         </w:numPr>
       </w:pPr>
       <w:r>
@@ -23671,7 +23719,7 @@
       <w:pPr>
         <w:numPr>
           <w:ilvl w:val="1"/>
-          <w:numId w:val="1069"/>
+          <w:numId w:val="1070"/>
         </w:numPr>
       </w:pPr>
       <w:r>
@@ -23734,7 +23782,7 @@
       <w:pPr>
         <w:numPr>
           <w:ilvl w:val="1"/>
-          <w:numId w:val="1069"/>
+          <w:numId w:val="1070"/>
         </w:numPr>
       </w:pPr>
       <w:r>
@@ -23797,7 +23845,7 @@
       <w:pPr>
         <w:numPr>
           <w:ilvl w:val="1"/>
-          <w:numId w:val="1069"/>
+          <w:numId w:val="1070"/>
         </w:numPr>
       </w:pPr>
       <w:r>
@@ -23864,7 +23912,7 @@
       <w:pPr>
         <w:numPr>
           <w:ilvl w:val="0"/>
-          <w:numId w:val="1067"/>
+          <w:numId w:val="1068"/>
         </w:numPr>
       </w:pPr>
       <w:r>
@@ -23932,7 +23980,7 @@
       <w:pPr>
         <w:numPr>
           <w:ilvl w:val="0"/>
-          <w:numId w:val="1070"/>
+          <w:numId w:val="1071"/>
         </w:numPr>
       </w:pPr>
       <w:r>
@@ -23966,7 +24014,7 @@
         <w:keepNext/>
         <w:numPr>
           <w:ilvl w:val="0"/>
-          <w:numId w:val="1070"/>
+          <w:numId w:val="1071"/>
         </w:numPr>
       </w:pPr>
       <w:r>
@@ -23984,7 +24032,7 @@
       <w:pPr>
         <w:numPr>
           <w:ilvl w:val="1"/>
-          <w:numId w:val="1071"/>
+          <w:numId w:val="1072"/>
         </w:numPr>
       </w:pPr>
       <w:r>
@@ -24021,7 +24069,7 @@
       <w:pPr>
         <w:numPr>
           <w:ilvl w:val="1"/>
-          <w:numId w:val="1071"/>
+          <w:numId w:val="1072"/>
         </w:numPr>
       </w:pPr>
       <w:r>
@@ -24048,7 +24096,7 @@
       <w:pPr>
         <w:numPr>
           <w:ilvl w:val="0"/>
-          <w:numId w:val="1070"/>
+          <w:numId w:val="1071"/>
         </w:numPr>
       </w:pPr>
       <w:r>
@@ -24140,7 +24188,7 @@
       <w:pPr>
         <w:numPr>
           <w:ilvl w:val="0"/>
-          <w:numId w:val="1072"/>
+          <w:numId w:val="1073"/>
         </w:numPr>
       </w:pPr>
       <w:r>
@@ -24173,7 +24221,7 @@
       <w:pPr>
         <w:numPr>
           <w:ilvl w:val="0"/>
-          <w:numId w:val="1072"/>
+          <w:numId w:val="1073"/>
         </w:numPr>
       </w:pPr>
       <w:r>
@@ -24220,7 +24268,7 @@
       <w:pPr>
         <w:numPr>
           <w:ilvl w:val="0"/>
-          <w:numId w:val="1072"/>
+          <w:numId w:val="1073"/>
         </w:numPr>
       </w:pPr>
       <w:r>
@@ -24336,7 +24384,7 @@
       <w:pPr>
         <w:numPr>
           <w:ilvl w:val="0"/>
-          <w:numId w:val="1073"/>
+          <w:numId w:val="1074"/>
         </w:numPr>
       </w:pPr>
       <w:r>
@@ -24606,7 +24654,7 @@
       <w:pPr>
         <w:numPr>
           <w:ilvl w:val="0"/>
-          <w:numId w:val="1073"/>
+          <w:numId w:val="1074"/>
         </w:numPr>
       </w:pPr>
       <w:r>
@@ -24813,7 +24861,7 @@
         <w:keepNext/>
         <w:numPr>
           <w:ilvl w:val="0"/>
-          <w:numId w:val="1073"/>
+          <w:numId w:val="1074"/>
         </w:numPr>
       </w:pPr>
       <w:r>
@@ -24831,7 +24879,7 @@
       <w:pPr>
         <w:numPr>
           <w:ilvl w:val="1"/>
-          <w:numId w:val="1074"/>
+          <w:numId w:val="1075"/>
         </w:numPr>
       </w:pPr>
       <w:r>
@@ -24849,7 +24897,7 @@
       <w:pPr>
         <w:numPr>
           <w:ilvl w:val="1"/>
-          <w:numId w:val="1074"/>
+          <w:numId w:val="1075"/>
         </w:numPr>
       </w:pPr>
       <w:r>
@@ -24867,7 +24915,7 @@
       <w:pPr>
         <w:numPr>
           <w:ilvl w:val="1"/>
-          <w:numId w:val="1074"/>
+          <w:numId w:val="1075"/>
         </w:numPr>
       </w:pPr>
       <w:r>
@@ -24885,7 +24933,7 @@
       <w:pPr>
         <w:numPr>
           <w:ilvl w:val="1"/>
-          <w:numId w:val="1074"/>
+          <w:numId w:val="1075"/>
         </w:numPr>
       </w:pPr>
       <w:r>
@@ -24924,7 +24972,7 @@
       <w:pPr>
         <w:numPr>
           <w:ilvl w:val="0"/>
-          <w:numId w:val="1075"/>
+          <w:numId w:val="1076"/>
         </w:numPr>
       </w:pPr>
       <w:r>
@@ -25419,7 +25467,7 @@
       <w:pPr>
         <w:numPr>
           <w:ilvl w:val="0"/>
-          <w:numId w:val="1075"/>
+          <w:numId w:val="1076"/>
         </w:numPr>
       </w:pPr>
       <w:r>
@@ -25499,7 +25547,7 @@
         <w:keepNext/>
         <w:numPr>
           <w:ilvl w:val="0"/>
-          <w:numId w:val="1075"/>
+          <w:numId w:val="1076"/>
         </w:numPr>
       </w:pPr>
       <w:r>
@@ -25531,7 +25579,7 @@
       <w:pPr>
         <w:numPr>
           <w:ilvl w:val="1"/>
-          <w:numId w:val="1076"/>
+          <w:numId w:val="1077"/>
         </w:numPr>
       </w:pPr>
       <w:r>
@@ -25556,7 +25604,7 @@
       <w:pPr>
         <w:numPr>
           <w:ilvl w:val="1"/>
-          <w:numId w:val="1076"/>
+          <w:numId w:val="1077"/>
         </w:numPr>
       </w:pPr>
       <w:r>
@@ -25598,7 +25646,7 @@
       <w:pPr>
         <w:numPr>
           <w:ilvl w:val="1"/>
-          <w:numId w:val="1076"/>
+          <w:numId w:val="1077"/>
         </w:numPr>
       </w:pPr>
       <m:oMath>
@@ -25649,7 +25697,7 @@
       <w:pPr>
         <w:numPr>
           <w:ilvl w:val="1"/>
-          <w:numId w:val="1076"/>
+          <w:numId w:val="1077"/>
         </w:numPr>
       </w:pPr>
       <m:oMath>
@@ -25703,7 +25751,7 @@
       <w:pPr>
         <w:numPr>
           <w:ilvl w:val="1"/>
-          <w:numId w:val="1076"/>
+          <w:numId w:val="1077"/>
         </w:numPr>
       </w:pPr>
       <w:r>
@@ -25799,7 +25847,7 @@
       <w:r>
         <w:drawing>
           <wp:inline>
-            <wp:extent cx="2954215" cy="2853294"/>
+            <wp:extent cx="2954215" cy="3097950"/>
             <wp:effectExtent b="0" l="0" r="0" t="0"/>
             <wp:docPr descr="Gráfico 8.– El segundo óptimo en el espacio de las utilidades: con la restricción, la zona sombreada, por encima de la restricción, no es alcanzable; el punto de felicidad F queda en ella, y el punto ineficiente Q da más bienestar que el óptimo de Pareto accesible P" title="" id="130" name="Picture"/>
             <a:graphic>
@@ -25820,7 +25868,7 @@
                   <pic:spPr bwMode="auto">
                     <a:xfrm>
                       <a:off x="0" y="0"/>
-                      <a:ext cx="2954215" cy="2853294"/>
+                      <a:ext cx="2954215" cy="3097950"/>
                     </a:xfrm>
                     <a:prstGeom prst="rect">
                       <a:avLst/>
@@ -25896,7 +25944,7 @@
       <w:pPr>
         <w:numPr>
           <w:ilvl w:val="0"/>
-          <w:numId w:val="1077"/>
+          <w:numId w:val="1078"/>
         </w:numPr>
       </w:pPr>
       <w:r>
@@ -26123,7 +26171,7 @@
       <w:pPr>
         <w:numPr>
           <w:ilvl w:val="0"/>
-          <w:numId w:val="1078"/>
+          <w:numId w:val="1079"/>
         </w:numPr>
       </w:pPr>
       <w:r>
@@ -26156,7 +26204,7 @@
       <w:pPr>
         <w:numPr>
           <w:ilvl w:val="0"/>
-          <w:numId w:val="1078"/>
+          <w:numId w:val="1079"/>
         </w:numPr>
       </w:pPr>
       <w:r>
@@ -26177,7 +26225,7 @@
       <w:pPr>
         <w:numPr>
           <w:ilvl w:val="0"/>
-          <w:numId w:val="1078"/>
+          <w:numId w:val="1079"/>
         </w:numPr>
       </w:pPr>
       <w:r>
@@ -26204,7 +26252,7 @@
       <w:pPr>
         <w:numPr>
           <w:ilvl w:val="0"/>
-          <w:numId w:val="1078"/>
+          <w:numId w:val="1079"/>
         </w:numPr>
       </w:pPr>
       <w:r>
@@ -26233,7 +26281,7 @@
       <w:pPr>
         <w:numPr>
           <w:ilvl w:val="0"/>
-          <w:numId w:val="1079"/>
+          <w:numId w:val="1080"/>
         </w:numPr>
       </w:pPr>
       <w:r>
@@ -26360,7 +26408,7 @@
       <w:pPr>
         <w:numPr>
           <w:ilvl w:val="0"/>
-          <w:numId w:val="1079"/>
+          <w:numId w:val="1080"/>
         </w:numPr>
       </w:pPr>
       <w:r>
@@ -26430,7 +26478,7 @@
       <w:pPr>
         <w:numPr>
           <w:ilvl w:val="0"/>
-          <w:numId w:val="1079"/>
+          <w:numId w:val="1080"/>
         </w:numPr>
       </w:pPr>
       <w:r>
@@ -26500,7 +26548,7 @@
       <w:pPr>
         <w:numPr>
           <w:ilvl w:val="0"/>
-          <w:numId w:val="1079"/>
+          <w:numId w:val="1080"/>
         </w:numPr>
       </w:pPr>
       <w:r>
@@ -26536,7 +26584,7 @@
         <w:keepNext/>
         <w:numPr>
           <w:ilvl w:val="0"/>
-          <w:numId w:val="1080"/>
+          <w:numId w:val="1081"/>
         </w:numPr>
       </w:pPr>
       <w:r>
@@ -26592,7 +26640,7 @@
       <w:pPr>
         <w:numPr>
           <w:ilvl w:val="1"/>
-          <w:numId w:val="1081"/>
+          <w:numId w:val="1082"/>
         </w:numPr>
       </w:pPr>
       <w:r>
@@ -26603,7 +26651,7 @@
       <w:pPr>
         <w:numPr>
           <w:ilvl w:val="1"/>
-          <w:numId w:val="1081"/>
+          <w:numId w:val="1082"/>
         </w:numPr>
       </w:pPr>
       <w:r>
@@ -26669,7 +26717,7 @@
         <w:keepNext/>
         <w:numPr>
           <w:ilvl w:val="0"/>
-          <w:numId w:val="1080"/>
+          <w:numId w:val="1081"/>
         </w:numPr>
       </w:pPr>
       <w:r>
@@ -26709,7 +26757,7 @@
       <w:pPr>
         <w:numPr>
           <w:ilvl w:val="1"/>
-          <w:numId w:val="1082"/>
+          <w:numId w:val="1083"/>
         </w:numPr>
       </w:pPr>
       <w:r>
@@ -27204,7 +27252,7 @@
       <w:pPr>
         <w:numPr>
           <w:ilvl w:val="1"/>
-          <w:numId w:val="1082"/>
+          <w:numId w:val="1083"/>
         </w:numPr>
       </w:pPr>
       <w:r>
@@ -27229,7 +27277,7 @@
       <w:pPr>
         <w:numPr>
           <w:ilvl w:val="0"/>
-          <w:numId w:val="1080"/>
+          <w:numId w:val="1081"/>
         </w:numPr>
       </w:pPr>
       <w:r>
@@ -27311,7 +27359,7 @@
         <w:keepNext/>
         <w:numPr>
           <w:ilvl w:val="0"/>
-          <w:numId w:val="1080"/>
+          <w:numId w:val="1081"/>
         </w:numPr>
       </w:pPr>
       <w:r>
@@ -27372,7 +27420,7 @@
       <w:pPr>
         <w:numPr>
           <w:ilvl w:val="1"/>
-          <w:numId w:val="1083"/>
+          <w:numId w:val="1084"/>
         </w:numPr>
       </w:pPr>
       <w:r>
@@ -27437,7 +27485,7 @@
       <w:pPr>
         <w:numPr>
           <w:ilvl w:val="1"/>
-          <w:numId w:val="1083"/>
+          <w:numId w:val="1084"/>
         </w:numPr>
       </w:pPr>
       <w:r>
@@ -27463,7 +27511,7 @@
         <w:keepNext/>
         <w:numPr>
           <w:ilvl w:val="0"/>
-          <w:numId w:val="1080"/>
+          <w:numId w:val="1081"/>
         </w:numPr>
       </w:pPr>
       <w:r>
@@ -27481,7 +27529,7 @@
       <w:pPr>
         <w:numPr>
           <w:ilvl w:val="1"/>
-          <w:numId w:val="1084"/>
+          <w:numId w:val="1085"/>
         </w:numPr>
       </w:pPr>
       <w:r>
@@ -27555,7 +27603,7 @@
       <w:pPr>
         <w:numPr>
           <w:ilvl w:val="1"/>
-          <w:numId w:val="1084"/>
+          <w:numId w:val="1085"/>
         </w:numPr>
       </w:pPr>
       <w:r>
@@ -27615,7 +27663,7 @@
       <w:pPr>
         <w:numPr>
           <w:ilvl w:val="1"/>
-          <w:numId w:val="1084"/>
+          <w:numId w:val="1085"/>
         </w:numPr>
       </w:pPr>
       <w:r>
@@ -27667,7 +27715,7 @@
         <w:keepNext/>
         <w:numPr>
           <w:ilvl w:val="0"/>
-          <w:numId w:val="1085"/>
+          <w:numId w:val="1086"/>
         </w:numPr>
       </w:pPr>
       <w:r>
@@ -27696,7 +27744,7 @@
       <w:pPr>
         <w:numPr>
           <w:ilvl w:val="1"/>
-          <w:numId w:val="1086"/>
+          <w:numId w:val="1087"/>
         </w:numPr>
       </w:pPr>
       <w:r>
@@ -27720,7 +27768,7 @@
       <w:pPr>
         <w:numPr>
           <w:ilvl w:val="1"/>
-          <w:numId w:val="1086"/>
+          <w:numId w:val="1087"/>
         </w:numPr>
       </w:pPr>
       <w:r>
@@ -27732,7 +27780,7 @@
         <w:keepNext/>
         <w:numPr>
           <w:ilvl w:val="0"/>
-          <w:numId w:val="1085"/>
+          <w:numId w:val="1086"/>
         </w:numPr>
       </w:pPr>
       <w:r>
@@ -27764,7 +27812,7 @@
       <w:pPr>
         <w:numPr>
           <w:ilvl w:val="1"/>
-          <w:numId w:val="1087"/>
+          <w:numId w:val="1088"/>
         </w:numPr>
       </w:pPr>
       <w:r>
@@ -27802,7 +27850,7 @@
       <w:pPr>
         <w:numPr>
           <w:ilvl w:val="1"/>
-          <w:numId w:val="1087"/>
+          <w:numId w:val="1088"/>
         </w:numPr>
       </w:pPr>
       <w:r>
@@ -27895,7 +27943,7 @@
         <w:keepNext/>
         <w:numPr>
           <w:ilvl w:val="0"/>
-          <w:numId w:val="1085"/>
+          <w:numId w:val="1086"/>
         </w:numPr>
       </w:pPr>
       <w:r>
@@ -27960,7 +28008,7 @@
       <w:pPr>
         <w:numPr>
           <w:ilvl w:val="1"/>
-          <w:numId w:val="1088"/>
+          <w:numId w:val="1089"/>
         </w:numPr>
       </w:pPr>
       <w:r>
@@ -28056,7 +28104,7 @@
       <w:pPr>
         <w:numPr>
           <w:ilvl w:val="1"/>
-          <w:numId w:val="1088"/>
+          <w:numId w:val="1089"/>
         </w:numPr>
       </w:pPr>
       <w:r>
@@ -28322,7 +28370,7 @@
       <w:pPr>
         <w:numPr>
           <w:ilvl w:val="1"/>
-          <w:numId w:val="1088"/>
+          <w:numId w:val="1089"/>
         </w:numPr>
       </w:pPr>
       <w:r>
@@ -29126,7 +29174,7 @@
       <w:pPr>
         <w:numPr>
           <w:ilvl w:val="0"/>
-          <w:numId w:val="1089"/>
+          <w:numId w:val="1090"/>
         </w:numPr>
       </w:pPr>
       <w:r>
@@ -29182,7 +29230,7 @@
       <w:pPr>
         <w:numPr>
           <w:ilvl w:val="0"/>
-          <w:numId w:val="1089"/>
+          <w:numId w:val="1090"/>
         </w:numPr>
       </w:pPr>
       <w:r>
@@ -29216,7 +29264,7 @@
       <w:pPr>
         <w:numPr>
           <w:ilvl w:val="0"/>
-          <w:numId w:val="1090"/>
+          <w:numId w:val="1091"/>
         </w:numPr>
       </w:pPr>
       <w:r>
@@ -29270,7 +29318,7 @@
       <w:pPr>
         <w:numPr>
           <w:ilvl w:val="0"/>
-          <w:numId w:val="1090"/>
+          <w:numId w:val="1091"/>
         </w:numPr>
       </w:pPr>
       <w:r>
@@ -29288,7 +29336,7 @@
       <w:pPr>
         <w:numPr>
           <w:ilvl w:val="0"/>
-          <w:numId w:val="1090"/>
+          <w:numId w:val="1091"/>
         </w:numPr>
       </w:pPr>
       <w:r>
@@ -29306,7 +29354,7 @@
       <w:pPr>
         <w:numPr>
           <w:ilvl w:val="0"/>
-          <w:numId w:val="1090"/>
+          <w:numId w:val="1091"/>
         </w:numPr>
       </w:pPr>
       <w:r>
@@ -29352,7 +29400,7 @@
         <w:keepNext/>
         <w:numPr>
           <w:ilvl w:val="0"/>
-          <w:numId w:val="1090"/>
+          <w:numId w:val="1091"/>
         </w:numPr>
       </w:pPr>
       <w:r>
@@ -29370,7 +29418,7 @@
       <w:pPr>
         <w:numPr>
           <w:ilvl w:val="1"/>
-          <w:numId w:val="1091"/>
+          <w:numId w:val="1092"/>
         </w:numPr>
       </w:pPr>
       <w:r>
@@ -29381,7 +29429,7 @@
       <w:pPr>
         <w:numPr>
           <w:ilvl w:val="1"/>
-          <w:numId w:val="1091"/>
+          <w:numId w:val="1092"/>
         </w:numPr>
       </w:pPr>
       <w:r>
@@ -29422,7 +29470,7 @@
       <w:pPr>
         <w:numPr>
           <w:ilvl w:val="1"/>
-          <w:numId w:val="1091"/>
+          <w:numId w:val="1092"/>
         </w:numPr>
       </w:pPr>
       <w:r>
@@ -29456,7 +29504,7 @@
       <w:pPr>
         <w:numPr>
           <w:ilvl w:val="0"/>
-          <w:numId w:val="1090"/>
+          <w:numId w:val="1091"/>
         </w:numPr>
       </w:pPr>
       <w:r>
@@ -29526,7 +29574,7 @@
         <w:keepNext/>
         <w:numPr>
           <w:ilvl w:val="0"/>
-          <w:numId w:val="1092"/>
+          <w:numId w:val="1093"/>
         </w:numPr>
       </w:pPr>
       <w:r>
@@ -29546,7 +29594,7 @@
       <w:pPr>
         <w:numPr>
           <w:ilvl w:val="1"/>
-          <w:numId w:val="1093"/>
+          <w:numId w:val="1094"/>
         </w:numPr>
       </w:pPr>
       <w:r>
@@ -29572,7 +29620,7 @@
       <w:pPr>
         <w:numPr>
           <w:ilvl w:val="1"/>
-          <w:numId w:val="1093"/>
+          <w:numId w:val="1094"/>
         </w:numPr>
       </w:pPr>
       <w:r>
@@ -29583,7 +29631,7 @@
       <w:pPr>
         <w:numPr>
           <w:ilvl w:val="1"/>
-          <w:numId w:val="1093"/>
+          <w:numId w:val="1094"/>
         </w:numPr>
       </w:pPr>
       <w:r>
@@ -29607,7 +29655,7 @@
       <w:pPr>
         <w:numPr>
           <w:ilvl w:val="0"/>
-          <w:numId w:val="1092"/>
+          <w:numId w:val="1093"/>
         </w:numPr>
       </w:pPr>
       <w:r>
@@ -29643,7 +29691,7 @@
       <w:pPr>
         <w:numPr>
           <w:ilvl w:val="0"/>
-          <w:numId w:val="1092"/>
+          <w:numId w:val="1093"/>
         </w:numPr>
       </w:pPr>
       <w:r>
@@ -29745,7 +29793,7 @@
       <w:pPr>
         <w:numPr>
           <w:ilvl w:val="0"/>
-          <w:numId w:val="1092"/>
+          <w:numId w:val="1093"/>
         </w:numPr>
       </w:pPr>
       <w:r>
@@ -29781,7 +29829,7 @@
       <w:pPr>
         <w:numPr>
           <w:ilvl w:val="0"/>
-          <w:numId w:val="1092"/>
+          <w:numId w:val="1093"/>
         </w:numPr>
       </w:pPr>
       <w:r>
@@ -29926,7 +29974,7 @@
       <w:pPr>
         <w:numPr>
           <w:ilvl w:val="0"/>
-          <w:numId w:val="1094"/>
+          <w:numId w:val="1095"/>
         </w:numPr>
       </w:pPr>
       <w:r>
@@ -29965,7 +30013,7 @@
       <w:pPr>
         <w:numPr>
           <w:ilvl w:val="0"/>
-          <w:numId w:val="1094"/>
+          <w:numId w:val="1095"/>
         </w:numPr>
       </w:pPr>
       <w:r>
@@ -30024,7 +30072,7 @@
       <w:pPr>
         <w:numPr>
           <w:ilvl w:val="0"/>
-          <w:numId w:val="1094"/>
+          <w:numId w:val="1095"/>
         </w:numPr>
       </w:pPr>
       <w:r>
@@ -30058,27 +30106,6 @@
       </w:r>
       <w:r>
         <w:t xml:space="preserve">compensar a los que pierden y seguir ganando, aunque la compensación no se pague.</w:t>
-      </w:r>
-    </w:p>
-    <w:p>
-      <w:pPr>
-        <w:numPr>
-          <w:ilvl w:val="0"/>
-          <w:numId w:val="1094"/>
-        </w:numPr>
-      </w:pPr>
-      <w:r>
-        <w:t xml:space="preserve">Se trabaja en el espacio de las utilidades: cada situación, que corresponde a una producción eficiente distinta, tiene su FPU.</w:t>
-      </w:r>
-    </w:p>
-    <w:bookmarkEnd w:id="156"/>
-    <w:bookmarkStart w:id="180" w:name="los_criterios"/>
-    <w:p>
-      <w:pPr>
-        <w:pStyle w:val="Heading4"/>
-      </w:pPr>
-      <w:r>
-        <w:t xml:space="preserve">Los criterios</w:t>
       </w:r>
     </w:p>
     <w:p>
@@ -30086,6 +30113,27 @@
         <w:numPr>
           <w:ilvl w:val="0"/>
           <w:numId w:val="1095"/>
+        </w:numPr>
+      </w:pPr>
+      <w:r>
+        <w:t xml:space="preserve">Se trabaja en el espacio de las utilidades: cada situación, que corresponde a una producción eficiente distinta, tiene su FPU.</w:t>
+      </w:r>
+    </w:p>
+    <w:bookmarkEnd w:id="156"/>
+    <w:bookmarkStart w:id="180" w:name="los_criterios"/>
+    <w:p>
+      <w:pPr>
+        <w:pStyle w:val="Heading4"/>
+      </w:pPr>
+      <w:r>
+        <w:t xml:space="preserve">Los criterios</w:t>
+      </w:r>
+    </w:p>
+    <w:p>
+      <w:pPr>
+        <w:numPr>
+          <w:ilvl w:val="0"/>
+          <w:numId w:val="1096"/>
         </w:numPr>
       </w:pPr>
       <w:r>
@@ -30197,7 +30245,7 @@
       <w:pPr>
         <w:numPr>
           <w:ilvl w:val="0"/>
-          <w:numId w:val="1095"/>
+          <w:numId w:val="1096"/>
         </w:numPr>
       </w:pPr>
       <w:r>
@@ -30310,7 +30358,7 @@
       <w:pPr>
         <w:numPr>
           <w:ilvl w:val="0"/>
-          <w:numId w:val="1095"/>
+          <w:numId w:val="1096"/>
         </w:numPr>
       </w:pPr>
       <w:r>
@@ -30478,7 +30526,7 @@
         <w:keepNext/>
         <w:numPr>
           <w:ilvl w:val="0"/>
-          <w:numId w:val="1095"/>
+          <w:numId w:val="1096"/>
         </w:numPr>
       </w:pPr>
       <w:r>
@@ -30569,7 +30617,7 @@
       <w:pPr>
         <w:numPr>
           <w:ilvl w:val="1"/>
-          <w:numId w:val="1096"/>
+          <w:numId w:val="1097"/>
         </w:numPr>
       </w:pPr>
       <w:r>
@@ -30637,7 +30685,7 @@
       <w:pPr>
         <w:numPr>
           <w:ilvl w:val="1"/>
-          <w:numId w:val="1096"/>
+          <w:numId w:val="1097"/>
         </w:numPr>
       </w:pPr>
       <w:r>
@@ -30665,7 +30713,7 @@
       <w:pPr>
         <w:numPr>
           <w:ilvl w:val="1"/>
-          <w:numId w:val="1096"/>
+          <w:numId w:val="1097"/>
         </w:numPr>
       </w:pPr>
       <w:r>
@@ -30714,7 +30762,7 @@
         <w:keepNext/>
         <w:numPr>
           <w:ilvl w:val="0"/>
-          <w:numId w:val="1095"/>
+          <w:numId w:val="1096"/>
         </w:numPr>
       </w:pPr>
       <w:r>
@@ -30808,7 +30856,7 @@
       <w:pPr>
         <w:numPr>
           <w:ilvl w:val="1"/>
-          <w:numId w:val="1097"/>
+          <w:numId w:val="1098"/>
         </w:numPr>
       </w:pPr>
       <w:r>
@@ -30819,7 +30867,7 @@
       <w:pPr>
         <w:numPr>
           <w:ilvl w:val="1"/>
-          <w:numId w:val="1097"/>
+          <w:numId w:val="1098"/>
         </w:numPr>
       </w:pPr>
       <w:r>
@@ -30858,7 +30906,7 @@
       <w:pPr>
         <w:numPr>
           <w:ilvl w:val="0"/>
-          <w:numId w:val="1095"/>
+          <w:numId w:val="1096"/>
         </w:numPr>
       </w:pPr>
       <w:r>
@@ -33688,7 +33736,7 @@
       <w:pPr>
         <w:numPr>
           <w:ilvl w:val="0"/>
-          <w:numId w:val="1098"/>
+          <w:numId w:val="1099"/>
         </w:numPr>
       </w:pPr>
       <w:r>
@@ -33744,7 +33792,7 @@
       <w:pPr>
         <w:numPr>
           <w:ilvl w:val="0"/>
-          <w:numId w:val="1098"/>
+          <w:numId w:val="1099"/>
         </w:numPr>
       </w:pPr>
       <w:r>
@@ -33804,7 +33852,7 @@
       <w:pPr>
         <w:numPr>
           <w:ilvl w:val="0"/>
-          <w:numId w:val="1098"/>
+          <w:numId w:val="1099"/>
         </w:numPr>
       </w:pPr>
       <w:r>
@@ -33991,7 +34039,7 @@
         <w:keepNext/>
         <w:numPr>
           <w:ilvl w:val="0"/>
-          <w:numId w:val="1099"/>
+          <w:numId w:val="1100"/>
         </w:numPr>
       </w:pPr>
       <w:r>
@@ -34041,7 +34089,7 @@
       <w:pPr>
         <w:numPr>
           <w:ilvl w:val="1"/>
-          <w:numId w:val="1100"/>
+          <w:numId w:val="1101"/>
         </w:numPr>
       </w:pPr>
       <w:r>
@@ -34172,7 +34220,7 @@
       <w:pPr>
         <w:numPr>
           <w:ilvl w:val="1"/>
-          <w:numId w:val="1100"/>
+          <w:numId w:val="1101"/>
         </w:numPr>
       </w:pPr>
       <w:r>
@@ -34267,7 +34315,7 @@
       <w:pPr>
         <w:numPr>
           <w:ilvl w:val="1"/>
-          <w:numId w:val="1100"/>
+          <w:numId w:val="1101"/>
         </w:numPr>
       </w:pPr>
       <w:r>
@@ -34278,7 +34326,7 @@
       <w:pPr>
         <w:numPr>
           <w:ilvl w:val="0"/>
-          <w:numId w:val="1099"/>
+          <w:numId w:val="1100"/>
         </w:numPr>
       </w:pPr>
       <m:oMath>
@@ -34363,7 +34411,7 @@
       <w:pPr>
         <w:numPr>
           <w:ilvl w:val="0"/>
-          <w:numId w:val="1099"/>
+          <w:numId w:val="1100"/>
         </w:numPr>
       </w:pPr>
       <w:r>
@@ -34384,7 +34432,7 @@
       <w:pPr>
         <w:numPr>
           <w:ilvl w:val="0"/>
-          <w:numId w:val="1099"/>
+          <w:numId w:val="1100"/>
         </w:numPr>
       </w:pPr>
       <m:oMath>
@@ -34519,7 +34567,7 @@
       <w:pPr>
         <w:numPr>
           <w:ilvl w:val="0"/>
-          <w:numId w:val="1099"/>
+          <w:numId w:val="1100"/>
         </w:numPr>
       </w:pPr>
       <m:oMath>
@@ -34609,7 +34657,7 @@
       <w:pPr>
         <w:numPr>
           <w:ilvl w:val="0"/>
-          <w:numId w:val="1099"/>
+          <w:numId w:val="1100"/>
         </w:numPr>
       </w:pPr>
       <w:r>
@@ -35808,7 +35856,7 @@
       <w:pPr>
         <w:numPr>
           <w:ilvl w:val="0"/>
-          <w:numId w:val="1101"/>
+          <w:numId w:val="1102"/>
         </w:numPr>
       </w:pPr>
       <w:r>
@@ -36182,7 +36230,7 @@
       <w:pPr>
         <w:numPr>
           <w:ilvl w:val="0"/>
-          <w:numId w:val="1101"/>
+          <w:numId w:val="1102"/>
         </w:numPr>
       </w:pPr>
       <w:r>
@@ -36473,7 +36521,7 @@
       <w:pPr>
         <w:numPr>
           <w:ilvl w:val="0"/>
-          <w:numId w:val="1101"/>
+          <w:numId w:val="1102"/>
         </w:numPr>
       </w:pPr>
       <w:r>
@@ -36837,7 +36885,7 @@
       <w:pPr>
         <w:numPr>
           <w:ilvl w:val="0"/>
-          <w:numId w:val="1101"/>
+          <w:numId w:val="1102"/>
         </w:numPr>
       </w:pPr>
       <w:r>
@@ -37081,7 +37129,7 @@
       <w:pPr>
         <w:numPr>
           <w:ilvl w:val="0"/>
-          <w:numId w:val="1102"/>
+          <w:numId w:val="1103"/>
         </w:numPr>
       </w:pPr>
       <w:r>
@@ -37099,7 +37147,7 @@
       <w:pPr>
         <w:numPr>
           <w:ilvl w:val="0"/>
-          <w:numId w:val="1102"/>
+          <w:numId w:val="1103"/>
         </w:numPr>
       </w:pPr>
       <w:r>
@@ -37117,7 +37165,7 @@
       <w:pPr>
         <w:numPr>
           <w:ilvl w:val="0"/>
-          <w:numId w:val="1102"/>
+          <w:numId w:val="1103"/>
         </w:numPr>
       </w:pPr>
       <w:r>
@@ -37312,7 +37360,7 @@
       <w:pPr>
         <w:numPr>
           <w:ilvl w:val="0"/>
-          <w:numId w:val="1103"/>
+          <w:numId w:val="1104"/>
         </w:numPr>
       </w:pPr>
       <w:r>
@@ -37668,7 +37716,7 @@
       <w:pPr>
         <w:numPr>
           <w:ilvl w:val="0"/>
-          <w:numId w:val="1103"/>
+          <w:numId w:val="1104"/>
         </w:numPr>
       </w:pPr>
       <w:r>
@@ -38400,7 +38448,7 @@
       <w:pPr>
         <w:numPr>
           <w:ilvl w:val="0"/>
-          <w:numId w:val="1103"/>
+          <w:numId w:val="1104"/>
         </w:numPr>
       </w:pPr>
       <w:r>
@@ -38909,7 +38957,7 @@
       <w:pPr>
         <w:numPr>
           <w:ilvl w:val="0"/>
-          <w:numId w:val="1103"/>
+          <w:numId w:val="1104"/>
         </w:numPr>
       </w:pPr>
       <w:r>
@@ -39010,7 +39058,7 @@
       <w:pPr>
         <w:numPr>
           <w:ilvl w:val="0"/>
-          <w:numId w:val="1103"/>
+          <w:numId w:val="1104"/>
         </w:numPr>
       </w:pPr>
       <w:r>
@@ -39414,7 +39462,7 @@
       <w:pPr>
         <w:numPr>
           <w:ilvl w:val="0"/>
-          <w:numId w:val="1104"/>
+          <w:numId w:val="1105"/>
         </w:numPr>
       </w:pPr>
       <w:r>
@@ -39817,7 +39865,7 @@
         <w:keepNext/>
         <w:numPr>
           <w:ilvl w:val="0"/>
-          <w:numId w:val="1104"/>
+          <w:numId w:val="1105"/>
         </w:numPr>
       </w:pPr>
       <w:r>
@@ -39835,7 +39883,7 @@
       <w:pPr>
         <w:numPr>
           <w:ilvl w:val="1"/>
-          <w:numId w:val="1105"/>
+          <w:numId w:val="1106"/>
         </w:numPr>
       </w:pPr>
       <w:r>
@@ -40119,7 +40167,7 @@
       <w:pPr>
         <w:numPr>
           <w:ilvl w:val="1"/>
-          <w:numId w:val="1105"/>
+          <w:numId w:val="1106"/>
         </w:numPr>
       </w:pPr>
       <w:r>
@@ -40360,7 +40408,7 @@
       <w:pPr>
         <w:numPr>
           <w:ilvl w:val="1"/>
-          <w:numId w:val="1105"/>
+          <w:numId w:val="1106"/>
         </w:numPr>
       </w:pPr>
       <w:r>
@@ -40776,7 +40824,7 @@
       <w:pPr>
         <w:numPr>
           <w:ilvl w:val="1"/>
-          <w:numId w:val="1105"/>
+          <w:numId w:val="1106"/>
         </w:numPr>
       </w:pPr>
       <w:r>
@@ -41067,7 +41115,7 @@
       <w:pPr>
         <w:numPr>
           <w:ilvl w:val="1"/>
-          <w:numId w:val="1105"/>
+          <w:numId w:val="1106"/>
         </w:numPr>
       </w:pPr>
       <w:r>
@@ -41415,7 +41463,7 @@
       <w:pPr>
         <w:numPr>
           <w:ilvl w:val="1"/>
-          <w:numId w:val="1105"/>
+          <w:numId w:val="1106"/>
         </w:numPr>
       </w:pPr>
       <w:r>
@@ -41575,7 +41623,7 @@
       <w:pPr>
         <w:numPr>
           <w:ilvl w:val="0"/>
-          <w:numId w:val="1104"/>
+          <w:numId w:val="1105"/>
         </w:numPr>
       </w:pPr>
       <w:r>
@@ -41603,7 +41651,7 @@
       <w:pPr>
         <w:numPr>
           <w:ilvl w:val="0"/>
-          <w:numId w:val="1106"/>
+          <w:numId w:val="1107"/>
         </w:numPr>
       </w:pPr>
       <w:r>
@@ -42000,7 +42048,7 @@
         <w:keepNext/>
         <w:numPr>
           <w:ilvl w:val="0"/>
-          <w:numId w:val="1106"/>
+          <w:numId w:val="1107"/>
         </w:numPr>
       </w:pPr>
       <w:r>
@@ -42018,7 +42066,7 @@
       <w:pPr>
         <w:numPr>
           <w:ilvl w:val="1"/>
-          <w:numId w:val="1107"/>
+          <w:numId w:val="1108"/>
         </w:numPr>
       </w:pPr>
       <w:r>
@@ -42228,7 +42276,7 @@
       <w:pPr>
         <w:numPr>
           <w:ilvl w:val="1"/>
-          <w:numId w:val="1107"/>
+          <w:numId w:val="1108"/>
         </w:numPr>
       </w:pPr>
       <w:r>
@@ -42377,7 +42425,7 @@
       <w:pPr>
         <w:numPr>
           <w:ilvl w:val="1"/>
-          <w:numId w:val="1107"/>
+          <w:numId w:val="1108"/>
         </w:numPr>
       </w:pPr>
       <m:oMath>
@@ -42620,7 +42668,7 @@
       <w:pPr>
         <w:numPr>
           <w:ilvl w:val="1"/>
-          <w:numId w:val="1107"/>
+          <w:numId w:val="1108"/>
         </w:numPr>
       </w:pPr>
       <w:r>
@@ -42862,7 +42910,7 @@
       <w:pPr>
         <w:numPr>
           <w:ilvl w:val="1"/>
-          <w:numId w:val="1107"/>
+          <w:numId w:val="1108"/>
         </w:numPr>
       </w:pPr>
       <w:r>
@@ -43274,7 +43322,7 @@
       <w:pPr>
         <w:numPr>
           <w:ilvl w:val="1"/>
-          <w:numId w:val="1107"/>
+          <w:numId w:val="1108"/>
         </w:numPr>
       </w:pPr>
       <w:r>
@@ -43618,7 +43666,7 @@
       <w:pPr>
         <w:numPr>
           <w:ilvl w:val="1"/>
-          <w:numId w:val="1107"/>
+          <w:numId w:val="1108"/>
         </w:numPr>
       </w:pPr>
       <w:r>
@@ -43900,7 +43948,7 @@
       <w:pPr>
         <w:numPr>
           <w:ilvl w:val="1"/>
-          <w:numId w:val="1107"/>
+          <w:numId w:val="1108"/>
         </w:numPr>
       </w:pPr>
       <w:r>
@@ -44115,7 +44163,7 @@
       <w:pPr>
         <w:numPr>
           <w:ilvl w:val="0"/>
-          <w:numId w:val="1106"/>
+          <w:numId w:val="1107"/>
         </w:numPr>
       </w:pPr>
       <w:r>
@@ -44355,7 +44403,7 @@
       <w:pPr>
         <w:numPr>
           <w:ilvl w:val="0"/>
-          <w:numId w:val="1108"/>
+          <w:numId w:val="1109"/>
         </w:numPr>
       </w:pPr>
       <w:r>
@@ -44851,7 +44899,7 @@
       <w:pPr>
         <w:numPr>
           <w:ilvl w:val="0"/>
-          <w:numId w:val="1108"/>
+          <w:numId w:val="1109"/>
         </w:numPr>
       </w:pPr>
       <w:r>
@@ -45948,7 +45996,7 @@
       <w:pPr>
         <w:numPr>
           <w:ilvl w:val="0"/>
-          <w:numId w:val="1108"/>
+          <w:numId w:val="1109"/>
         </w:numPr>
       </w:pPr>
       <w:r>
@@ -46169,7 +46217,7 @@
       <w:pPr>
         <w:numPr>
           <w:ilvl w:val="0"/>
-          <w:numId w:val="1108"/>
+          <w:numId w:val="1109"/>
         </w:numPr>
       </w:pPr>
       <w:r>
@@ -46459,7 +46507,7 @@
       <w:pPr>
         <w:numPr>
           <w:ilvl w:val="0"/>
-          <w:numId w:val="1109"/>
+          <w:numId w:val="1110"/>
         </w:numPr>
       </w:pPr>
       <w:r>
@@ -46488,7 +46536,7 @@
       <w:pPr>
         <w:numPr>
           <w:ilvl w:val="0"/>
-          <w:numId w:val="1109"/>
+          <w:numId w:val="1110"/>
         </w:numPr>
       </w:pPr>
       <w:r>
@@ -46529,7 +46577,7 @@
       <w:pPr>
         <w:numPr>
           <w:ilvl w:val="0"/>
-          <w:numId w:val="1109"/>
+          <w:numId w:val="1110"/>
         </w:numPr>
       </w:pPr>
       <w:r>
@@ -46586,7 +46634,7 @@
       <w:pPr>
         <w:numPr>
           <w:ilvl w:val="0"/>
-          <w:numId w:val="1109"/>
+          <w:numId w:val="1110"/>
         </w:numPr>
       </w:pPr>
       <w:r>
@@ -46615,7 +46663,7 @@
       <w:pPr>
         <w:numPr>
           <w:ilvl w:val="0"/>
-          <w:numId w:val="1109"/>
+          <w:numId w:val="1110"/>
         </w:numPr>
       </w:pPr>
       <w:r>
@@ -46644,7 +46692,7 @@
       <w:pPr>
         <w:numPr>
           <w:ilvl w:val="0"/>
-          <w:numId w:val="1109"/>
+          <w:numId w:val="1110"/>
         </w:numPr>
       </w:pPr>
       <w:r>
@@ -46748,7 +46796,7 @@
       <w:pPr>
         <w:numPr>
           <w:ilvl w:val="0"/>
-          <w:numId w:val="1110"/>
+          <w:numId w:val="1111"/>
         </w:numPr>
       </w:pPr>
       <w:r>
@@ -46781,7 +46829,7 @@
       <w:pPr>
         <w:numPr>
           <w:ilvl w:val="0"/>
-          <w:numId w:val="1110"/>
+          <w:numId w:val="1111"/>
         </w:numPr>
       </w:pPr>
       <w:r>
@@ -47062,7 +47110,7 @@
       <w:pPr>
         <w:numPr>
           <w:ilvl w:val="0"/>
-          <w:numId w:val="1110"/>
+          <w:numId w:val="1111"/>
         </w:numPr>
       </w:pPr>
       <w:r>
@@ -47074,397 +47122,6 @@
       </w:r>
       <w:r>
         <w:t xml:space="preserve">: decreciente, de curvatura indeterminada (utilidad ordinal); la GFPU es la envolvente de las FPU.</w:t>
-      </w:r>
-    </w:p>
-    <w:p>
-      <w:pPr>
-        <w:numPr>
-          <w:ilvl w:val="0"/>
-          <w:numId w:val="1110"/>
-        </w:numPr>
-      </w:pPr>
-      <w:r>
-        <w:rPr>
-          <w:i/>
-          <w:iCs/>
-        </w:rPr>
-        <w:t xml:space="preserve">1TFEB</w:t>
-      </w:r>
-      <w:r>
-        <w:t xml:space="preserve">: solo necesita no saciedad local (y mercados completos, precio-aceptación, precios comunes, información perfecta); no necesita convexidad.</w:t>
-      </w:r>
-      <w:r>
-        <w:t xml:space="preserve"> </w:t>
-      </w:r>
-      <w:r>
-        <w:rPr>
-          <w:i/>
-          <w:iCs/>
-        </w:rPr>
-        <w:t xml:space="preserve">2TFEB</w:t>
-      </w:r>
-      <w:r>
-        <w:t xml:space="preserve">: necesita convexidad y transferencias de suma fija.</w:t>
-      </w:r>
-    </w:p>
-    <w:p>
-      <w:pPr>
-        <w:numPr>
-          <w:ilvl w:val="0"/>
-          <w:numId w:val="1110"/>
-        </w:numPr>
-      </w:pPr>
-      <w:r>
-        <w:rPr>
-          <w:i/>
-          <w:iCs/>
-        </w:rPr>
-        <w:t xml:space="preserve">Fechas</w:t>
-      </w:r>
-      <w:r>
-        <w:t xml:space="preserve">:</w:t>
-      </w:r>
-      <w:r>
-        <w:t xml:space="preserve"> </w:t>
-      </w:r>
-      <w:r>
-        <w:rPr>
-          <w:smallCaps/>
-        </w:rPr>
-        <w:t xml:space="preserve">Pareto</w:t>
-      </w:r>
-      <w:r>
-        <w:t xml:space="preserve"> </w:t>
-      </w:r>
-      <w:r>
-        <w:t xml:space="preserve">(1906),</w:t>
-      </w:r>
-      <w:r>
-        <w:t xml:space="preserve"> </w:t>
-      </w:r>
-      <w:r>
-        <w:rPr>
-          <w:smallCaps/>
-        </w:rPr>
-        <w:t xml:space="preserve">Bergson</w:t>
-      </w:r>
-      <w:r>
-        <w:t xml:space="preserve"> </w:t>
-      </w:r>
-      <w:r>
-        <w:t xml:space="preserve">(1938),</w:t>
-      </w:r>
-      <w:r>
-        <w:t xml:space="preserve"> </w:t>
-      </w:r>
-      <w:r>
-        <w:rPr>
-          <w:smallCaps/>
-        </w:rPr>
-        <w:t xml:space="preserve">Kaldor</w:t>
-      </w:r>
-      <w:r>
-        <w:t xml:space="preserve"> </w:t>
-      </w:r>
-      <w:r>
-        <w:t xml:space="preserve">y</w:t>
-      </w:r>
-      <w:r>
-        <w:t xml:space="preserve"> </w:t>
-      </w:r>
-      <w:r>
-        <w:rPr>
-          <w:smallCaps/>
-        </w:rPr>
-        <w:t xml:space="preserve">Hicks</w:t>
-      </w:r>
-      <w:r>
-        <w:t xml:space="preserve"> </w:t>
-      </w:r>
-      <w:r>
-        <w:t xml:space="preserve">(1939),</w:t>
-      </w:r>
-      <w:r>
-        <w:t xml:space="preserve"> </w:t>
-      </w:r>
-      <w:r>
-        <w:rPr>
-          <w:smallCaps/>
-        </w:rPr>
-        <w:t xml:space="preserve">Scitovsky</w:t>
-      </w:r>
-      <w:r>
-        <w:t xml:space="preserve"> </w:t>
-      </w:r>
-      <w:r>
-        <w:t xml:space="preserve">(1941),</w:t>
-      </w:r>
-      <w:r>
-        <w:t xml:space="preserve"> </w:t>
-      </w:r>
-      <w:r>
-        <w:rPr>
-          <w:smallCaps/>
-        </w:rPr>
-        <w:t xml:space="preserve">Lange</w:t>
-      </w:r>
-      <w:r>
-        <w:t xml:space="preserve"> </w:t>
-      </w:r>
-      <w:r>
-        <w:t xml:space="preserve">(1942),</w:t>
-      </w:r>
-      <w:r>
-        <w:t xml:space="preserve"> </w:t>
-      </w:r>
-      <w:r>
-        <w:rPr>
-          <w:smallCaps/>
-        </w:rPr>
-        <w:t xml:space="preserve">Little</w:t>
-      </w:r>
-      <w:r>
-        <w:t xml:space="preserve"> </w:t>
-      </w:r>
-      <w:r>
-        <w:t xml:space="preserve">(1949-1950),</w:t>
-      </w:r>
-      <w:r>
-        <w:t xml:space="preserve"> </w:t>
-      </w:r>
-      <w:r>
-        <w:rPr>
-          <w:smallCaps/>
-        </w:rPr>
-        <w:t xml:space="preserve">Samuelson</w:t>
-      </w:r>
-      <w:r>
-        <w:t xml:space="preserve"> </w:t>
-      </w:r>
-      <w:r>
-        <w:t xml:space="preserve">(1950),</w:t>
-      </w:r>
-      <w:r>
-        <w:t xml:space="preserve"> </w:t>
-      </w:r>
-      <w:r>
-        <w:rPr>
-          <w:smallCaps/>
-        </w:rPr>
-        <w:t xml:space="preserve">Arrow</w:t>
-      </w:r>
-      <w:r>
-        <w:t xml:space="preserve"> </w:t>
-      </w:r>
-      <w:r>
-        <w:t xml:space="preserve">(1951),</w:t>
-      </w:r>
-      <w:r>
-        <w:t xml:space="preserve"> </w:t>
-      </w:r>
-      <w:r>
-        <w:rPr>
-          <w:smallCaps/>
-        </w:rPr>
-        <w:t xml:space="preserve">Debreu</w:t>
-      </w:r>
-      <w:r>
-        <w:t xml:space="preserve"> </w:t>
-      </w:r>
-      <w:r>
-        <w:t xml:space="preserve">(1951, 1954, 1959),</w:t>
-      </w:r>
-      <w:r>
-        <w:t xml:space="preserve"> </w:t>
-      </w:r>
-      <w:r>
-        <w:rPr>
-          <w:smallCaps/>
-        </w:rPr>
-        <w:t xml:space="preserve">Gorman</w:t>
-      </w:r>
-      <w:r>
-        <w:t xml:space="preserve"> </w:t>
-      </w:r>
-      <w:r>
-        <w:t xml:space="preserve">(1955),</w:t>
-      </w:r>
-      <w:r>
-        <w:t xml:space="preserve"> </w:t>
-      </w:r>
-      <w:r>
-        <w:rPr>
-          <w:smallCaps/>
-        </w:rPr>
-        <w:t xml:space="preserve">Meade</w:t>
-      </w:r>
-      <w:r>
-        <w:t xml:space="preserve"> </w:t>
-      </w:r>
-      <w:r>
-        <w:t xml:space="preserve">(1955),</w:t>
-      </w:r>
-      <w:r>
-        <w:t xml:space="preserve"> </w:t>
-      </w:r>
-      <w:r>
-        <w:rPr>
-          <w:smallCaps/>
-        </w:rPr>
-        <w:t xml:space="preserve">Lipsey</w:t>
-      </w:r>
-      <w:r>
-        <w:t xml:space="preserve"> </w:t>
-      </w:r>
-      <w:r>
-        <w:t xml:space="preserve">y</w:t>
-      </w:r>
-      <w:r>
-        <w:t xml:space="preserve"> </w:t>
-      </w:r>
-      <w:r>
-        <w:rPr>
-          <w:smallCaps/>
-        </w:rPr>
-        <w:t xml:space="preserve">Lancaster</w:t>
-      </w:r>
-      <w:r>
-        <w:t xml:space="preserve"> </w:t>
-      </w:r>
-      <w:r>
-        <w:t xml:space="preserve">(1956),</w:t>
-      </w:r>
-      <w:r>
-        <w:t xml:space="preserve"> </w:t>
-      </w:r>
-      <w:r>
-        <w:rPr>
-          <w:smallCaps/>
-        </w:rPr>
-        <w:t xml:space="preserve">Davis</w:t>
-      </w:r>
-      <w:r>
-        <w:t xml:space="preserve"> </w:t>
-      </w:r>
-      <w:r>
-        <w:t xml:space="preserve">y</w:t>
-      </w:r>
-      <w:r>
-        <w:t xml:space="preserve"> </w:t>
-      </w:r>
-      <w:r>
-        <w:rPr>
-          <w:smallCaps/>
-        </w:rPr>
-        <w:t xml:space="preserve">Whinston</w:t>
-      </w:r>
-      <w:r>
-        <w:t xml:space="preserve"> </w:t>
-      </w:r>
-      <w:r>
-        <w:t xml:space="preserve">(1965),</w:t>
-      </w:r>
-      <w:r>
-        <w:t xml:space="preserve"> </w:t>
-      </w:r>
-      <w:r>
-        <w:rPr>
-          <w:smallCaps/>
-        </w:rPr>
-        <w:t xml:space="preserve">Diamond</w:t>
-      </w:r>
-      <w:r>
-        <w:t xml:space="preserve"> </w:t>
-      </w:r>
-      <w:r>
-        <w:t xml:space="preserve">y</w:t>
-      </w:r>
-      <w:r>
-        <w:t xml:space="preserve"> </w:t>
-      </w:r>
-      <w:r>
-        <w:rPr>
-          <w:smallCaps/>
-        </w:rPr>
-        <w:t xml:space="preserve">Mirrlees</w:t>
-      </w:r>
-      <w:r>
-        <w:t xml:space="preserve"> </w:t>
-      </w:r>
-      <w:r>
-        <w:t xml:space="preserve">(1971),</w:t>
-      </w:r>
-      <w:r>
-        <w:t xml:space="preserve"> </w:t>
-      </w:r>
-      <w:r>
-        <w:rPr>
-          <w:smallCaps/>
-        </w:rPr>
-        <w:t xml:space="preserve">Hart</w:t>
-      </w:r>
-      <w:r>
-        <w:t xml:space="preserve"> </w:t>
-      </w:r>
-      <w:r>
-        <w:t xml:space="preserve">(1975),</w:t>
-      </w:r>
-      <w:r>
-        <w:t xml:space="preserve"> </w:t>
-      </w:r>
-      <w:r>
-        <w:rPr>
-          <w:smallCaps/>
-        </w:rPr>
-        <w:t xml:space="preserve">Greenwald</w:t>
-      </w:r>
-      <w:r>
-        <w:t xml:space="preserve"> </w:t>
-      </w:r>
-      <w:r>
-        <w:t xml:space="preserve">y</w:t>
-      </w:r>
-      <w:r>
-        <w:t xml:space="preserve"> </w:t>
-      </w:r>
-      <w:r>
-        <w:rPr>
-          <w:smallCaps/>
-        </w:rPr>
-        <w:t xml:space="preserve">Stiglitz</w:t>
-      </w:r>
-      <w:r>
-        <w:t xml:space="preserve"> </w:t>
-      </w:r>
-      <w:r>
-        <w:t xml:space="preserve">(1986).</w:t>
-      </w:r>
-    </w:p>
-    <w:p>
-      <w:pPr>
-        <w:numPr>
-          <w:ilvl w:val="0"/>
-          <w:numId w:val="1110"/>
-        </w:numPr>
-      </w:pPr>
-      <w:r>
-        <w:rPr>
-          <w:i/>
-          <w:iCs/>
-        </w:rPr>
-        <w:t xml:space="preserve">Second best</w:t>
-      </w:r>
-      <w:r>
-        <w:t xml:space="preserve">: con una condición imposible, las demás dejan en general de ser deseables; no es lo mismo que el óptimo restringido de la información asimétrica.</w:t>
-      </w:r>
-    </w:p>
-    <w:bookmarkStart w:id="199" w:name="preguntas_probables_del_tribunal"/>
-    <w:p>
-      <w:pPr>
-        <w:pStyle w:val="Heading4"/>
-      </w:pPr>
-      <w:r>
-        <w:t xml:space="preserve">Preguntas probables del tribunal</w:t>
       </w:r>
     </w:p>
     <w:p>
@@ -47475,7 +47132,27 @@
         </w:numPr>
       </w:pPr>
       <w:r>
-        <w:t xml:space="preserve">¿Por qué la utilidad marginal decreciente no es un supuesto del modelo? ¿Qué forma tiene la FPU y por qué?</w:t>
+        <w:rPr>
+          <w:i/>
+          <w:iCs/>
+        </w:rPr>
+        <w:t xml:space="preserve">1TFEB</w:t>
+      </w:r>
+      <w:r>
+        <w:t xml:space="preserve">: solo necesita no saciedad local (y mercados completos, precio-aceptación, precios comunes, información perfecta); no necesita convexidad.</w:t>
+      </w:r>
+      <w:r>
+        <w:t xml:space="preserve"> </w:t>
+      </w:r>
+      <w:r>
+        <w:rPr>
+          <w:i/>
+          <w:iCs/>
+        </w:rPr>
+        <w:t xml:space="preserve">2TFEB</w:t>
+      </w:r>
+      <w:r>
+        <w:t xml:space="preserve">: necesita convexidad y transferencias de suma fija.</w:t>
       </w:r>
     </w:p>
     <w:p>
@@ -47486,7 +47163,329 @@
         </w:numPr>
       </w:pPr>
       <w:r>
-        <w:t xml:space="preserve">¿Por qué una asignación eficiente en la producción y en el consumo puede no ser un óptimo global?</w:t>
+        <w:rPr>
+          <w:i/>
+          <w:iCs/>
+        </w:rPr>
+        <w:t xml:space="preserve">Fechas</w:t>
+      </w:r>
+      <w:r>
+        <w:t xml:space="preserve">:</w:t>
+      </w:r>
+      <w:r>
+        <w:t xml:space="preserve"> </w:t>
+      </w:r>
+      <w:r>
+        <w:rPr>
+          <w:smallCaps/>
+        </w:rPr>
+        <w:t xml:space="preserve">Pareto</w:t>
+      </w:r>
+      <w:r>
+        <w:t xml:space="preserve"> </w:t>
+      </w:r>
+      <w:r>
+        <w:t xml:space="preserve">(1906),</w:t>
+      </w:r>
+      <w:r>
+        <w:t xml:space="preserve"> </w:t>
+      </w:r>
+      <w:r>
+        <w:rPr>
+          <w:smallCaps/>
+        </w:rPr>
+        <w:t xml:space="preserve">Bergson</w:t>
+      </w:r>
+      <w:r>
+        <w:t xml:space="preserve"> </w:t>
+      </w:r>
+      <w:r>
+        <w:t xml:space="preserve">(1938),</w:t>
+      </w:r>
+      <w:r>
+        <w:t xml:space="preserve"> </w:t>
+      </w:r>
+      <w:r>
+        <w:rPr>
+          <w:smallCaps/>
+        </w:rPr>
+        <w:t xml:space="preserve">Kaldor</w:t>
+      </w:r>
+      <w:r>
+        <w:t xml:space="preserve"> </w:t>
+      </w:r>
+      <w:r>
+        <w:t xml:space="preserve">y</w:t>
+      </w:r>
+      <w:r>
+        <w:t xml:space="preserve"> </w:t>
+      </w:r>
+      <w:r>
+        <w:rPr>
+          <w:smallCaps/>
+        </w:rPr>
+        <w:t xml:space="preserve">Hicks</w:t>
+      </w:r>
+      <w:r>
+        <w:t xml:space="preserve"> </w:t>
+      </w:r>
+      <w:r>
+        <w:t xml:space="preserve">(1939),</w:t>
+      </w:r>
+      <w:r>
+        <w:t xml:space="preserve"> </w:t>
+      </w:r>
+      <w:r>
+        <w:rPr>
+          <w:smallCaps/>
+        </w:rPr>
+        <w:t xml:space="preserve">Scitovsky</w:t>
+      </w:r>
+      <w:r>
+        <w:t xml:space="preserve"> </w:t>
+      </w:r>
+      <w:r>
+        <w:t xml:space="preserve">(1941),</w:t>
+      </w:r>
+      <w:r>
+        <w:t xml:space="preserve"> </w:t>
+      </w:r>
+      <w:r>
+        <w:rPr>
+          <w:smallCaps/>
+        </w:rPr>
+        <w:t xml:space="preserve">Lange</w:t>
+      </w:r>
+      <w:r>
+        <w:t xml:space="preserve"> </w:t>
+      </w:r>
+      <w:r>
+        <w:t xml:space="preserve">(1942),</w:t>
+      </w:r>
+      <w:r>
+        <w:t xml:space="preserve"> </w:t>
+      </w:r>
+      <w:r>
+        <w:rPr>
+          <w:smallCaps/>
+        </w:rPr>
+        <w:t xml:space="preserve">Little</w:t>
+      </w:r>
+      <w:r>
+        <w:t xml:space="preserve"> </w:t>
+      </w:r>
+      <w:r>
+        <w:t xml:space="preserve">(1949-1950),</w:t>
+      </w:r>
+      <w:r>
+        <w:t xml:space="preserve"> </w:t>
+      </w:r>
+      <w:r>
+        <w:rPr>
+          <w:smallCaps/>
+        </w:rPr>
+        <w:t xml:space="preserve">Samuelson</w:t>
+      </w:r>
+      <w:r>
+        <w:t xml:space="preserve"> </w:t>
+      </w:r>
+      <w:r>
+        <w:t xml:space="preserve">(1950),</w:t>
+      </w:r>
+      <w:r>
+        <w:t xml:space="preserve"> </w:t>
+      </w:r>
+      <w:r>
+        <w:rPr>
+          <w:smallCaps/>
+        </w:rPr>
+        <w:t xml:space="preserve">Arrow</w:t>
+      </w:r>
+      <w:r>
+        <w:t xml:space="preserve"> </w:t>
+      </w:r>
+      <w:r>
+        <w:t xml:space="preserve">(1951),</w:t>
+      </w:r>
+      <w:r>
+        <w:t xml:space="preserve"> </w:t>
+      </w:r>
+      <w:r>
+        <w:rPr>
+          <w:smallCaps/>
+        </w:rPr>
+        <w:t xml:space="preserve">Debreu</w:t>
+      </w:r>
+      <w:r>
+        <w:t xml:space="preserve"> </w:t>
+      </w:r>
+      <w:r>
+        <w:t xml:space="preserve">(1951, 1954, 1959),</w:t>
+      </w:r>
+      <w:r>
+        <w:t xml:space="preserve"> </w:t>
+      </w:r>
+      <w:r>
+        <w:rPr>
+          <w:smallCaps/>
+        </w:rPr>
+        <w:t xml:space="preserve">Gorman</w:t>
+      </w:r>
+      <w:r>
+        <w:t xml:space="preserve"> </w:t>
+      </w:r>
+      <w:r>
+        <w:t xml:space="preserve">(1955),</w:t>
+      </w:r>
+      <w:r>
+        <w:t xml:space="preserve"> </w:t>
+      </w:r>
+      <w:r>
+        <w:rPr>
+          <w:smallCaps/>
+        </w:rPr>
+        <w:t xml:space="preserve">Meade</w:t>
+      </w:r>
+      <w:r>
+        <w:t xml:space="preserve"> </w:t>
+      </w:r>
+      <w:r>
+        <w:t xml:space="preserve">(1955),</w:t>
+      </w:r>
+      <w:r>
+        <w:t xml:space="preserve"> </w:t>
+      </w:r>
+      <w:r>
+        <w:rPr>
+          <w:smallCaps/>
+        </w:rPr>
+        <w:t xml:space="preserve">Lipsey</w:t>
+      </w:r>
+      <w:r>
+        <w:t xml:space="preserve"> </w:t>
+      </w:r>
+      <w:r>
+        <w:t xml:space="preserve">y</w:t>
+      </w:r>
+      <w:r>
+        <w:t xml:space="preserve"> </w:t>
+      </w:r>
+      <w:r>
+        <w:rPr>
+          <w:smallCaps/>
+        </w:rPr>
+        <w:t xml:space="preserve">Lancaster</w:t>
+      </w:r>
+      <w:r>
+        <w:t xml:space="preserve"> </w:t>
+      </w:r>
+      <w:r>
+        <w:t xml:space="preserve">(1956),</w:t>
+      </w:r>
+      <w:r>
+        <w:t xml:space="preserve"> </w:t>
+      </w:r>
+      <w:r>
+        <w:rPr>
+          <w:smallCaps/>
+        </w:rPr>
+        <w:t xml:space="preserve">Davis</w:t>
+      </w:r>
+      <w:r>
+        <w:t xml:space="preserve"> </w:t>
+      </w:r>
+      <w:r>
+        <w:t xml:space="preserve">y</w:t>
+      </w:r>
+      <w:r>
+        <w:t xml:space="preserve"> </w:t>
+      </w:r>
+      <w:r>
+        <w:rPr>
+          <w:smallCaps/>
+        </w:rPr>
+        <w:t xml:space="preserve">Whinston</w:t>
+      </w:r>
+      <w:r>
+        <w:t xml:space="preserve"> </w:t>
+      </w:r>
+      <w:r>
+        <w:t xml:space="preserve">(1965),</w:t>
+      </w:r>
+      <w:r>
+        <w:t xml:space="preserve"> </w:t>
+      </w:r>
+      <w:r>
+        <w:rPr>
+          <w:smallCaps/>
+        </w:rPr>
+        <w:t xml:space="preserve">Diamond</w:t>
+      </w:r>
+      <w:r>
+        <w:t xml:space="preserve"> </w:t>
+      </w:r>
+      <w:r>
+        <w:t xml:space="preserve">y</w:t>
+      </w:r>
+      <w:r>
+        <w:t xml:space="preserve"> </w:t>
+      </w:r>
+      <w:r>
+        <w:rPr>
+          <w:smallCaps/>
+        </w:rPr>
+        <w:t xml:space="preserve">Mirrlees</w:t>
+      </w:r>
+      <w:r>
+        <w:t xml:space="preserve"> </w:t>
+      </w:r>
+      <w:r>
+        <w:t xml:space="preserve">(1971),</w:t>
+      </w:r>
+      <w:r>
+        <w:t xml:space="preserve"> </w:t>
+      </w:r>
+      <w:r>
+        <w:rPr>
+          <w:smallCaps/>
+        </w:rPr>
+        <w:t xml:space="preserve">Hart</w:t>
+      </w:r>
+      <w:r>
+        <w:t xml:space="preserve"> </w:t>
+      </w:r>
+      <w:r>
+        <w:t xml:space="preserve">(1975),</w:t>
+      </w:r>
+      <w:r>
+        <w:t xml:space="preserve"> </w:t>
+      </w:r>
+      <w:r>
+        <w:rPr>
+          <w:smallCaps/>
+        </w:rPr>
+        <w:t xml:space="preserve">Greenwald</w:t>
+      </w:r>
+      <w:r>
+        <w:t xml:space="preserve"> </w:t>
+      </w:r>
+      <w:r>
+        <w:t xml:space="preserve">y</w:t>
+      </w:r>
+      <w:r>
+        <w:t xml:space="preserve"> </w:t>
+      </w:r>
+      <w:r>
+        <w:rPr>
+          <w:smallCaps/>
+        </w:rPr>
+        <w:t xml:space="preserve">Stiglitz</w:t>
+      </w:r>
+      <w:r>
+        <w:t xml:space="preserve"> </w:t>
+      </w:r>
+      <w:r>
+        <w:t xml:space="preserve">(1986).</w:t>
       </w:r>
     </w:p>
     <w:p>
@@ -47497,125 +47496,174 @@
         </w:numPr>
       </w:pPr>
       <w:r>
-        <w:t xml:space="preserve">¿Qué interpretación tienen los multiplicadores del problema del planificador? ¿Qué relación guardan con los precios de equilibrio?</w:t>
+        <w:rPr>
+          <w:i/>
+          <w:iCs/>
+        </w:rPr>
+        <w:t xml:space="preserve">Second best</w:t>
+      </w:r>
+      <w:r>
+        <w:t xml:space="preserve">: con una condición imposible, las demás dejan en general de ser deseables; no es lo mismo que el óptimo restringido de la información asimétrica.</w:t>
+      </w:r>
+    </w:p>
+    <w:bookmarkStart w:id="199" w:name="preguntas_probables_del_tribunal"/>
+    <w:p>
+      <w:pPr>
+        <w:pStyle w:val="Heading4"/>
+      </w:pPr>
+      <w:r>
+        <w:t xml:space="preserve">Preguntas probables del tribunal</w:t>
       </w:r>
     </w:p>
     <w:p>
       <w:pPr>
         <w:numPr>
           <w:ilvl w:val="0"/>
-          <w:numId w:val="1111"/>
+          <w:numId w:val="1112"/>
         </w:numPr>
       </w:pPr>
       <w:r>
-        <w:t xml:space="preserve">En el equilibrio general competitivo, ¿qué agente cumple cada condición de</w:t>
-      </w:r>
-      <w:r>
-        <w:t xml:space="preserve"> </w:t>
-      </w:r>
-      <w:r>
-        <w:rPr>
-          <w:smallCaps/>
-        </w:rPr>
-        <w:t xml:space="preserve">Pareto</w:t>
-      </w:r>
-      <w:r>
-        <w:t xml:space="preserve"> </w:t>
-      </w:r>
-      <w:r>
-        <w:t xml:space="preserve">y al resolver qué problema? ¿Para qué hace falta el vaciado de los mercados?</w:t>
+        <w:t xml:space="preserve">¿Por qué la utilidad marginal decreciente no es un supuesto del modelo? ¿Qué forma tiene la FPU y por qué?</w:t>
       </w:r>
     </w:p>
     <w:p>
       <w:pPr>
         <w:numPr>
           <w:ilvl w:val="0"/>
-          <w:numId w:val="1111"/>
+          <w:numId w:val="1112"/>
         </w:numPr>
       </w:pPr>
       <w:r>
-        <w:t xml:space="preserve">¿Necesita el primer teorema la convexidad? ¿Y el segundo? ¿Por qué?</w:t>
+        <w:t xml:space="preserve">¿Por qué una asignación eficiente en la producción y en el consumo puede no ser un óptimo global?</w:t>
       </w:r>
     </w:p>
     <w:p>
       <w:pPr>
         <w:numPr>
           <w:ilvl w:val="0"/>
-          <w:numId w:val="1111"/>
+          <w:numId w:val="1112"/>
         </w:numPr>
       </w:pPr>
       <w:r>
-        <w:t xml:space="preserve">¿Qué es un cuasiequilibrio y por qué hace falta la condición de renta en el 2TFEB?</w:t>
+        <w:t xml:space="preserve">¿Qué interpretación tienen los multiplicadores del problema del planificador? ¿Qué relación guardan con los precios de equilibrio?</w:t>
       </w:r>
     </w:p>
     <w:p>
       <w:pPr>
         <w:numPr>
           <w:ilvl w:val="0"/>
-          <w:numId w:val="1111"/>
+          <w:numId w:val="1112"/>
         </w:numPr>
       </w:pPr>
       <w:r>
-        <w:t xml:space="preserve">¿Por qué no son factibles las transferencias de suma fija? ¿Qué se hace en su lugar?</w:t>
+        <w:t xml:space="preserve">En el equilibrio general competitivo, ¿qué agente cumple cada condición de</w:t>
+      </w:r>
+      <w:r>
+        <w:t xml:space="preserve"> </w:t>
+      </w:r>
+      <w:r>
+        <w:rPr>
+          <w:smallCaps/>
+        </w:rPr>
+        <w:t xml:space="preserve">Pareto</w:t>
+      </w:r>
+      <w:r>
+        <w:t xml:space="preserve"> </w:t>
+      </w:r>
+      <w:r>
+        <w:t xml:space="preserve">y al resolver qué problema? ¿Para qué hace falta el vaciado de los mercados?</w:t>
       </w:r>
     </w:p>
     <w:p>
       <w:pPr>
         <w:numPr>
           <w:ilvl w:val="0"/>
-          <w:numId w:val="1111"/>
+          <w:numId w:val="1112"/>
         </w:numPr>
       </w:pPr>
       <w:r>
-        <w:t xml:space="preserve">¿Puede un impuesto aumentar el bienestar? Póngase un ejemplo de segundo óptimo.</w:t>
+        <w:t xml:space="preserve">¿Necesita el primer teorema la convexidad? ¿Y el segundo? ¿Por qué?</w:t>
       </w:r>
     </w:p>
     <w:p>
       <w:pPr>
         <w:numPr>
           <w:ilvl w:val="0"/>
-          <w:numId w:val="1111"/>
+          <w:numId w:val="1112"/>
         </w:numPr>
       </w:pPr>
       <w:r>
-        <w:t xml:space="preserve">¿En qué se diferencian el segundo óptimo de</w:t>
-      </w:r>
-      <w:r>
-        <w:t xml:space="preserve"> </w:t>
-      </w:r>
-      <w:r>
-        <w:rPr>
-          <w:smallCaps/>
-        </w:rPr>
-        <w:t xml:space="preserve">Lipsey</w:t>
-      </w:r>
-      <w:r>
-        <w:t xml:space="preserve"> </w:t>
-      </w:r>
-      <w:r>
-        <w:t xml:space="preserve">y</w:t>
-      </w:r>
-      <w:r>
-        <w:t xml:space="preserve"> </w:t>
-      </w:r>
-      <w:r>
-        <w:rPr>
-          <w:smallCaps/>
-        </w:rPr>
-        <w:t xml:space="preserve">Lancaster</w:t>
-      </w:r>
-      <w:r>
-        <w:t xml:space="preserve"> </w:t>
-      </w:r>
-      <w:r>
-        <w:t xml:space="preserve">y el óptimo restringido de la economía de la información?</w:t>
+        <w:t xml:space="preserve">¿Qué es un cuasiequilibrio y por qué hace falta la condición de renta en el 2TFEB?</w:t>
       </w:r>
     </w:p>
     <w:p>
       <w:pPr>
         <w:numPr>
           <w:ilvl w:val="0"/>
-          <w:numId w:val="1111"/>
+          <w:numId w:val="1112"/>
+        </w:numPr>
+      </w:pPr>
+      <w:r>
+        <w:t xml:space="preserve">¿Por qué no son factibles las transferencias de suma fija? ¿Qué se hace en su lugar?</w:t>
+      </w:r>
+    </w:p>
+    <w:p>
+      <w:pPr>
+        <w:numPr>
+          <w:ilvl w:val="0"/>
+          <w:numId w:val="1112"/>
+        </w:numPr>
+      </w:pPr>
+      <w:r>
+        <w:t xml:space="preserve">¿Puede un impuesto aumentar el bienestar? Póngase un ejemplo de segundo óptimo.</w:t>
+      </w:r>
+    </w:p>
+    <w:p>
+      <w:pPr>
+        <w:numPr>
+          <w:ilvl w:val="0"/>
+          <w:numId w:val="1112"/>
+        </w:numPr>
+      </w:pPr>
+      <w:r>
+        <w:t xml:space="preserve">¿En qué se diferencian el segundo óptimo de</w:t>
+      </w:r>
+      <w:r>
+        <w:t xml:space="preserve"> </w:t>
+      </w:r>
+      <w:r>
+        <w:rPr>
+          <w:smallCaps/>
+        </w:rPr>
+        <w:t xml:space="preserve">Lipsey</w:t>
+      </w:r>
+      <w:r>
+        <w:t xml:space="preserve"> </w:t>
+      </w:r>
+      <w:r>
+        <w:t xml:space="preserve">y</w:t>
+      </w:r>
+      <w:r>
+        <w:t xml:space="preserve"> </w:t>
+      </w:r>
+      <w:r>
+        <w:rPr>
+          <w:smallCaps/>
+        </w:rPr>
+        <w:t xml:space="preserve">Lancaster</w:t>
+      </w:r>
+      <w:r>
+        <w:t xml:space="preserve"> </w:t>
+      </w:r>
+      <w:r>
+        <w:t xml:space="preserve">y el óptimo restringido de la economía de la información?</w:t>
+      </w:r>
+    </w:p>
+    <w:p>
+      <w:pPr>
+        <w:numPr>
+          <w:ilvl w:val="0"/>
+          <w:numId w:val="1112"/>
         </w:numPr>
       </w:pPr>
       <w:r>
@@ -53944,34 +53992,7 @@
     <w:abstractNumId w:val="991"/>
   </w:num>
   <w:num w:numId="1035">
-    <w:abstractNumId w:val="99411"/>
-    <w:lvlOverride w:ilvl="0">
-      <w:startOverride w:val="1"/>
-    </w:lvlOverride>
-    <w:lvlOverride w:ilvl="1">
-      <w:startOverride w:val="1"/>
-    </w:lvlOverride>
-    <w:lvlOverride w:ilvl="2">
-      <w:startOverride w:val="1"/>
-    </w:lvlOverride>
-    <w:lvlOverride w:ilvl="3">
-      <w:startOverride w:val="1"/>
-    </w:lvlOverride>
-    <w:lvlOverride w:ilvl="4">
-      <w:startOverride w:val="1"/>
-    </w:lvlOverride>
-    <w:lvlOverride w:ilvl="5">
-      <w:startOverride w:val="1"/>
-    </w:lvlOverride>
-    <w:lvlOverride w:ilvl="6">
-      <w:startOverride w:val="1"/>
-    </w:lvlOverride>
-    <w:lvlOverride w:ilvl="7">
-      <w:startOverride w:val="1"/>
-    </w:lvlOverride>
-    <w:lvlOverride w:ilvl="8">
-      <w:startOverride w:val="1"/>
-    </w:lvlOverride>
+    <w:abstractNumId w:val="991"/>
   </w:num>
   <w:num w:numId="1036">
     <w:abstractNumId w:val="99411"/>
@@ -54004,15 +54025,6 @@
     </w:lvlOverride>
   </w:num>
   <w:num w:numId="1037">
-    <w:abstractNumId w:val="991"/>
-  </w:num>
-  <w:num w:numId="1038">
-    <w:abstractNumId w:val="991"/>
-  </w:num>
-  <w:num w:numId="1039">
-    <w:abstractNumId w:val="991"/>
-  </w:num>
-  <w:num w:numId="1040">
     <w:abstractNumId w:val="99411"/>
     <w:lvlOverride w:ilvl="0">
       <w:startOverride w:val="1"/>
@@ -54042,8 +54054,44 @@
       <w:startOverride w:val="1"/>
     </w:lvlOverride>
   </w:num>
+  <w:num w:numId="1038">
+    <w:abstractNumId w:val="991"/>
+  </w:num>
+  <w:num w:numId="1039">
+    <w:abstractNumId w:val="991"/>
+  </w:num>
+  <w:num w:numId="1040">
+    <w:abstractNumId w:val="991"/>
+  </w:num>
   <w:num w:numId="1041">
-    <w:abstractNumId w:val="991"/>
+    <w:abstractNumId w:val="99411"/>
+    <w:lvlOverride w:ilvl="0">
+      <w:startOverride w:val="1"/>
+    </w:lvlOverride>
+    <w:lvlOverride w:ilvl="1">
+      <w:startOverride w:val="1"/>
+    </w:lvlOverride>
+    <w:lvlOverride w:ilvl="2">
+      <w:startOverride w:val="1"/>
+    </w:lvlOverride>
+    <w:lvlOverride w:ilvl="3">
+      <w:startOverride w:val="1"/>
+    </w:lvlOverride>
+    <w:lvlOverride w:ilvl="4">
+      <w:startOverride w:val="1"/>
+    </w:lvlOverride>
+    <w:lvlOverride w:ilvl="5">
+      <w:startOverride w:val="1"/>
+    </w:lvlOverride>
+    <w:lvlOverride w:ilvl="6">
+      <w:startOverride w:val="1"/>
+    </w:lvlOverride>
+    <w:lvlOverride w:ilvl="7">
+      <w:startOverride w:val="1"/>
+    </w:lvlOverride>
+    <w:lvlOverride w:ilvl="8">
+      <w:startOverride w:val="1"/>
+    </w:lvlOverride>
   </w:num>
   <w:num w:numId="1042">
     <w:abstractNumId w:val="991"/>
@@ -54085,6 +54133,9 @@
     <w:abstractNumId w:val="991"/>
   </w:num>
   <w:num w:numId="1055">
+    <w:abstractNumId w:val="991"/>
+  </w:num>
+  <w:num w:numId="1056">
     <w:abstractNumId w:val="99411"/>
     <w:lvlOverride w:ilvl="0">
       <w:startOverride w:val="1"/>
@@ -54114,9 +54165,6 @@
       <w:startOverride w:val="1"/>
     </w:lvlOverride>
   </w:num>
-  <w:num w:numId="1056">
-    <w:abstractNumId w:val="991"/>
-  </w:num>
   <w:num w:numId="1057">
     <w:abstractNumId w:val="991"/>
   </w:num>
@@ -54130,6 +54178,9 @@
     <w:abstractNumId w:val="991"/>
   </w:num>
   <w:num w:numId="1061">
+    <w:abstractNumId w:val="991"/>
+  </w:num>
+  <w:num w:numId="1062">
     <w:abstractNumId w:val="99411"/>
     <w:lvlOverride w:ilvl="0">
       <w:startOverride w:val="1"/>
@@ -54159,9 +54210,6 @@
       <w:startOverride w:val="1"/>
     </w:lvlOverride>
   </w:num>
-  <w:num w:numId="1062">
-    <w:abstractNumId w:val="991"/>
-  </w:num>
   <w:num w:numId="1063">
     <w:abstractNumId w:val="991"/>
   </w:num>
@@ -54169,6 +54217,9 @@
     <w:abstractNumId w:val="991"/>
   </w:num>
   <w:num w:numId="1065">
+    <w:abstractNumId w:val="991"/>
+  </w:num>
+  <w:num w:numId="1066">
     <w:abstractNumId w:val="99411"/>
     <w:lvlOverride w:ilvl="0">
       <w:startOverride w:val="1"/>
@@ -54198,13 +54249,13 @@
       <w:startOverride w:val="1"/>
     </w:lvlOverride>
   </w:num>
-  <w:num w:numId="1066">
-    <w:abstractNumId w:val="991"/>
-  </w:num>
   <w:num w:numId="1067">
     <w:abstractNumId w:val="991"/>
   </w:num>
   <w:num w:numId="1068">
+    <w:abstractNumId w:val="991"/>
+  </w:num>
+  <w:num w:numId="1069">
     <w:abstractNumId w:val="99411"/>
     <w:lvlOverride w:ilvl="0">
       <w:startOverride w:val="1"/>
@@ -54234,9 +54285,6 @@
       <w:startOverride w:val="1"/>
     </w:lvlOverride>
   </w:num>
-  <w:num w:numId="1069">
-    <w:abstractNumId w:val="991"/>
-  </w:num>
   <w:num w:numId="1070">
     <w:abstractNumId w:val="991"/>
   </w:num>
@@ -54262,6 +54310,9 @@
     <w:abstractNumId w:val="991"/>
   </w:num>
   <w:num w:numId="1078">
+    <w:abstractNumId w:val="991"/>
+  </w:num>
+  <w:num w:numId="1079">
     <w:abstractNumId w:val="99411"/>
     <w:lvlOverride w:ilvl="0">
       <w:startOverride w:val="1"/>
@@ -54290,9 +54341,6 @@
     <w:lvlOverride w:ilvl="8">
       <w:startOverride w:val="1"/>
     </w:lvlOverride>
-  </w:num>
-  <w:num w:numId="1079">
-    <w:abstractNumId w:val="991"/>
   </w:num>
   <w:num w:numId="1080">
     <w:abstractNumId w:val="991"/>
@@ -54340,6 +54388,9 @@
     <w:abstractNumId w:val="991"/>
   </w:num>
   <w:num w:numId="1095">
+    <w:abstractNumId w:val="991"/>
+  </w:num>
+  <w:num w:numId="1096">
     <w:abstractNumId w:val="99411"/>
     <w:lvlOverride w:ilvl="0">
       <w:startOverride w:val="1"/>
@@ -54369,9 +54420,6 @@
       <w:startOverride w:val="1"/>
     </w:lvlOverride>
   </w:num>
-  <w:num w:numId="1096">
-    <w:abstractNumId w:val="991"/>
-  </w:num>
   <w:num w:numId="1097">
     <w:abstractNumId w:val="991"/>
   </w:num>
@@ -54379,6 +54427,9 @@
     <w:abstractNumId w:val="991"/>
   </w:num>
   <w:num w:numId="1099">
+    <w:abstractNumId w:val="991"/>
+  </w:num>
+  <w:num w:numId="1100">
     <w:abstractNumId w:val="99411"/>
     <w:lvlOverride w:ilvl="0">
       <w:startOverride w:val="1"/>
@@ -54408,9 +54459,6 @@
       <w:startOverride w:val="1"/>
     </w:lvlOverride>
   </w:num>
-  <w:num w:numId="1100">
-    <w:abstractNumId w:val="991"/>
-  </w:num>
   <w:num w:numId="1101">
     <w:abstractNumId w:val="991"/>
   </w:num>
@@ -54424,6 +54472,9 @@
     <w:abstractNumId w:val="991"/>
   </w:num>
   <w:num w:numId="1105">
+    <w:abstractNumId w:val="991"/>
+  </w:num>
+  <w:num w:numId="1106">
     <w:abstractNumId w:val="99411"/>
     <w:lvlOverride w:ilvl="0">
       <w:startOverride w:val="1"/>
@@ -54453,10 +54504,10 @@
       <w:startOverride w:val="1"/>
     </w:lvlOverride>
   </w:num>
-  <w:num w:numId="1106">
+  <w:num w:numId="1107">
     <w:abstractNumId w:val="991"/>
   </w:num>
-  <w:num w:numId="1107">
+  <w:num w:numId="1108">
     <w:abstractNumId w:val="99411"/>
     <w:lvlOverride w:ilvl="0">
       <w:startOverride w:val="1"/>
@@ -54486,9 +54537,6 @@
       <w:startOverride w:val="1"/>
     </w:lvlOverride>
   </w:num>
-  <w:num w:numId="1108">
-    <w:abstractNumId w:val="991"/>
-  </w:num>
   <w:num w:numId="1109">
     <w:abstractNumId w:val="991"/>
   </w:num>
@@ -54496,6 +54544,9 @@
     <w:abstractNumId w:val="991"/>
   </w:num>
   <w:num w:numId="1111">
+    <w:abstractNumId w:val="991"/>
+  </w:num>
+  <w:num w:numId="1112">
     <w:abstractNumId w:val="991"/>
   </w:num>
 </w:numbering>

</xml_diff>

<commit_message>
3.A.22: 1'30" más al bloque I y menos al III (tema y ficha)
Co-Authored-By: Claude Opus 5.5 <noreply@anthropic.com>
Claude-Session: https://claude.ai/code/session_01PWJgAjs4PN1Rvp3aLA4tqT
</commit_message>
<xml_diff>
--- a/oposicion/temario/tercer-ejercicio/3A22.docx
+++ b/oposicion/temario/tercer-ejercicio/3A22.docx
@@ -1956,7 +1956,7 @@
         <w:t xml:space="preserve">Nota al opositor. </w:t>
       </w:r>
       <w:r>
-        <w:t xml:space="preserve">Reparto del cante: introducción, 2′30″; I, 8′ (I.1, 1′; I.2, 5′30″; I.3, 1′30″); II, 10′ (II.1, 5′30″; II.2, 4′30″); III, 8′30″ (III.1, 3′30″; III.2, 2′; III.3, 2′; III.4, 1′), y conclusión, 1′. Los gráficos imprescindibles son la gran frontera de posibilidades de utilidad (gráfico </w:t>
+        <w:t xml:space="preserve">Reparto del cante: introducción, 2′30″; I, 9′30″ (I.1, 1′; I.2, 6′30″; I.3, 2′); II, 10′ (II.1, 5′30″; II.2, 4′30″); III, 7′ (III.1, 3′; III.2, 1′30″; III.3, 1′30″; III.4, 1′), y conclusión, 1′. Los gráficos imprescindibles son la gran frontera de posibilidades de utilidad (gráfico </w:t>
       </w:r>
       <w:hyperlink w:anchor="fig_gfpu">
         <w:r>
@@ -2100,7 +2100,7 @@
         <w:rPr>
           <w:rStyle w:val="Minutos"/>
         </w:rPr>
-        <w:t xml:space="preserve">8′</w:t>
+        <w:t xml:space="preserve">9′30″</w:t>
       </w:r>
     </w:p>
     <w:p>
@@ -23973,7 +23973,7 @@
         <w:rPr>
           <w:rStyle w:val="Minutos"/>
         </w:rPr>
-        <w:t xml:space="preserve">8′30″</w:t>
+        <w:t xml:space="preserve">7′</w:t>
       </w:r>
     </w:p>
     <w:p>

</xml_diff>

<commit_message>
3.A.22: refrán «No hay mal que por bien no venga» y sin la frase de Joan Robinson (respuestas RF-3A22 y A22-02)
Co-Authored-By: Claude Opus 5.5 <noreply@anthropic.com>
Claude-Session: https://claude.ai/code/session_01PWJgAjs4PN1Rvp3aLA4tqT
</commit_message>
<xml_diff>
--- a/oposicion/temario/tercer-ejercicio/3A22.docx
+++ b/oposicion/temario/tercer-ejercicio/3A22.docx
@@ -40,7 +40,7 @@
         <w:t xml:space="preserve">Tema: 28 págs. · Anexos: 12 · Bibliografía: 5 (PDF)</w:t>
       </w:r>
     </w:p>
-    <w:bookmarkStart w:id="27" w:name="introducci__n"/>
+    <w:bookmarkStart w:id="26" w:name="introducci__n"/>
     <w:p>
       <w:pPr>
         <w:pStyle w:val="Heading1"/>
@@ -87,19 +87,7 @@
         </w:numPr>
       </w:pPr>
       <w:r>
-        <w:t xml:space="preserve">«Lo mejor es enemigo de lo bueno», dice el refrán.</w:t>
-      </w:r>
-      <w:r>
-        <w:rPr>
-          <w:rStyle w:val="FootnoteReference"/>
-        </w:rPr>
-        <w:footnoteReference w:id="20"/>
-      </w:r>
-      <w:r>
-        <w:t xml:space="preserve"> </w:t>
-      </w:r>
-      <w:r>
-        <w:t xml:space="preserve">La economía del bienestar lo convierte en un teorema.</w:t>
+        <w:t xml:space="preserve">«No hay mal que por bien no venga», dice el refrán. La economía del bienestar lo convierte en un teorema: cuando una distorsión no se puede quitar, añadir otra puede mejorar el bienestar.</w:t>
       </w:r>
     </w:p>
     <w:p>
@@ -146,7 +134,7 @@
         <w:t xml:space="preserve">2</w:t>
       </w:r>
       <w:r>
-        <w:t xml:space="preserve">, un precio igual al daño marginal que causa, con un impuesto o con un mercado mundial de derechos de emisión; como no existe, la Unión grava en la frontera el carbono que contienen las importaciones: es una solución de segundo óptimo.</w:t>
+        <w:t xml:space="preserve">, un precio igual al daño marginal que causa, con un impuesto o con un mercado mundial de derechos de emisión; como no existe, la Unión grava en la frontera el carbono que contienen las importaciones: un gravamen al comercio, que en un mundo sin distorsiones restaría eficiencia, compensa en parte que el carbono no tenga precio fuera de la Unión. Es una solución de segundo óptimo.</w:t>
       </w:r>
     </w:p>
     <w:p>
@@ -247,7 +235,7 @@
         <w:rPr>
           <w:rStyle w:val="FootnoteReference"/>
         </w:rPr>
-        <w:footnoteReference w:id="21"/>
+        <w:footnoteReference w:id="20"/>
       </w:r>
     </w:p>
     <w:p>
@@ -664,7 +652,7 @@
         <w:rPr>
           <w:rStyle w:val="FootnoteReference"/>
         </w:rPr>
-        <w:footnoteReference w:id="22"/>
+        <w:footnoteReference w:id="21"/>
       </w:r>
       <w:r>
         <w:t xml:space="preserve"> </w:t>
@@ -745,7 +733,7 @@
         <w:rPr>
           <w:rStyle w:val="FootnoteReference"/>
         </w:rPr>
-        <w:footnoteReference w:id="24"/>
+        <w:footnoteReference w:id="23"/>
       </w:r>
       <w:r>
         <w:t xml:space="preserve"> </w:t>
@@ -1040,7 +1028,7 @@
         <w:rPr>
           <w:rStyle w:val="FootnoteReference"/>
         </w:rPr>
-        <w:footnoteReference w:id="25"/>
+        <w:footnoteReference w:id="24"/>
       </w:r>
     </w:p>
     <w:p>
@@ -1184,7 +1172,7 @@
       <w:r>
         <w:t xml:space="preserve"> </w:t>
       </w:r>
-      <w:hyperlink r:id="rId26">
+      <w:hyperlink r:id="rId25">
         <w:r>
           <w:rPr>
             <w:rStyle w:val="Referenciaatema"/>
@@ -1513,7 +1501,7 @@
         </w:numPr>
       </w:pPr>
       <w:r>
-        <w:t xml:space="preserve">Es el hilo del refrán: el bloque </w:t>
+        <w:t xml:space="preserve">En síntesis: el bloque </w:t>
       </w:r>
       <w:hyperlink w:anchor="sec_optimo_pareto">
         <w:r>
@@ -1527,7 +1515,7 @@
         <w:t xml:space="preserve"> </w:t>
       </w:r>
       <w:r>
-        <w:t xml:space="preserve">define lo mejor; el </w:t>
+        <w:t xml:space="preserve">define el óptimo; el </w:t>
       </w:r>
       <w:hyperlink w:anchor="sec_teoremas">
         <w:r>
@@ -1552,7 +1540,7 @@
         </w:r>
       </w:hyperlink>
       <w:r>
-        <w:t xml:space="preserve">, qué es lo bueno cuando lo mejor no está al alcance.</w:t>
+        <w:t xml:space="preserve">, qué conviene hacer cuando no está al alcance.</w:t>
       </w:r>
     </w:p>
     <w:p>
@@ -1578,7 +1566,7 @@
         <w:br/>
       </w:r>
       <w:r>
-        <w:t xml:space="preserve">Introducción: lo mejor y lo bueno</w:t>
+        <w:t xml:space="preserve">Introducción: el CBAM, un segundo óptimo</w:t>
       </w:r>
       <w:r>
         <w:br/>
@@ -2069,8 +2057,8 @@
         <w:t xml:space="preserve">bienes y las demostraciones completas van en los anexos y no se cantan.</w:t>
       </w:r>
     </w:p>
-    <w:bookmarkEnd w:id="27"/>
-    <w:bookmarkStart w:id="79" w:name="sec_optimo_pareto"/>
+    <w:bookmarkEnd w:id="26"/>
+    <w:bookmarkStart w:id="78" w:name="sec_optimo_pareto"/>
     <w:p>
       <w:pPr>
         <w:pStyle w:val="Heading1"/>
@@ -2162,7 +2150,7 @@
         <w:t xml:space="preserve">Hay infinitos óptimos, de modo que la eficiencia no basta para elegir.</w:t>
       </w:r>
     </w:p>
-    <w:bookmarkStart w:id="32" w:name="sec_definicion_juicios"/>
+    <w:bookmarkStart w:id="31" w:name="sec_definicion_juicios"/>
     <w:p>
       <w:pPr>
         <w:pStyle w:val="Heading2"/>
@@ -2710,7 +2698,7 @@
         <w:rPr>
           <w:rStyle w:val="FootnoteReference"/>
         </w:rPr>
-        <w:footnoteReference w:id="28"/>
+        <w:footnoteReference w:id="27"/>
       </w:r>
     </w:p>
     <w:p>
@@ -2759,7 +2747,7 @@
       <w:r>
         <w:t xml:space="preserve"> </w:t>
       </w:r>
-      <w:hyperlink r:id="rId29">
+      <w:hyperlink r:id="rId28">
         <w:r>
           <w:rPr>
             <w:rStyle w:val="Referenciaatema"/>
@@ -2866,7 +2854,7 @@
         <w:rPr>
           <w:rStyle w:val="FootnoteReference"/>
         </w:rPr>
-        <w:footnoteReference w:id="30"/>
+        <w:footnoteReference w:id="29"/>
       </w:r>
     </w:p>
     <w:p>
@@ -2890,7 +2878,7 @@
         <w:rPr>
           <w:rStyle w:val="FootnoteReference"/>
         </w:rPr>
-        <w:footnoteReference w:id="31"/>
+        <w:footnoteReference w:id="30"/>
       </w:r>
     </w:p>
     <w:p>
@@ -2929,8 +2917,8 @@
         <w:t xml:space="preserve">: no importa cómo se llega a una asignación (mercado, plan o imposición), solo la asignación.</w:t>
       </w:r>
     </w:p>
-    <w:bookmarkEnd w:id="32"/>
-    <w:bookmarkStart w:id="72" w:name="sec_condiciones_optimalidad"/>
+    <w:bookmarkEnd w:id="31"/>
+    <w:bookmarkStart w:id="71" w:name="sec_condiciones_optimalidad"/>
     <w:p>
       <w:pPr>
         <w:pStyle w:val="Heading2"/>
@@ -3001,7 +2989,7 @@
         <w:t xml:space="preserve">Las 2 primeras son necesarias, pero no suficientes.</w:t>
       </w:r>
     </w:p>
-    <w:bookmarkStart w:id="36" w:name="supuestos_del_modelo_2222"/>
+    <w:bookmarkStart w:id="35" w:name="supuestos_del_modelo_2222"/>
     <w:p>
       <w:pPr>
         <w:pStyle w:val="Heading4"/>
@@ -3053,7 +3041,7 @@
       <w:r>
         <w:t xml:space="preserve"> </w:t>
       </w:r>
-      <w:hyperlink r:id="rId26">
+      <w:hyperlink r:id="rId25">
         <w:r>
           <w:rPr>
             <w:rStyle w:val="Referenciaatema"/>
@@ -3082,7 +3070,7 @@
         <w:rPr>
           <w:rStyle w:val="FootnoteReference"/>
         </w:rPr>
-        <w:footnoteReference w:id="33"/>
+        <w:footnoteReference w:id="32"/>
       </w:r>
     </w:p>
     <w:p>
@@ -3506,7 +3494,7 @@
       <w:r>
         <w:t xml:space="preserve"> </w:t>
       </w:r>
-      <w:hyperlink r:id="rId29">
+      <w:hyperlink r:id="rId28">
         <w:r>
           <w:rPr>
             <w:rStyle w:val="Referenciaatema"/>
@@ -3682,7 +3670,7 @@
       <w:r>
         <w:t xml:space="preserve"> </w:t>
       </w:r>
-      <w:hyperlink r:id="rId34">
+      <w:hyperlink r:id="rId33">
         <w:r>
           <w:rPr>
             <w:rStyle w:val="Referenciaatema"/>
@@ -3697,7 +3685,7 @@
         <w:rPr>
           <w:rStyle w:val="FootnoteReference"/>
         </w:rPr>
-        <w:footnoteReference w:id="35"/>
+        <w:footnoteReference w:id="34"/>
       </w:r>
     </w:p>
     <w:p>
@@ -3814,8 +3802,8 @@
         <w:t xml:space="preserve">Basta con la convexidad: hace que las condiciones de primer orden sean suficientes y que la FPP sea cóncava.</w:t>
       </w:r>
     </w:p>
-    <w:bookmarkEnd w:id="36"/>
-    <w:bookmarkStart w:id="47" w:name="eficiencia_en_la_producci__n"/>
+    <w:bookmarkEnd w:id="35"/>
+    <w:bookmarkStart w:id="46" w:name="eficiencia_en_la_producci__n"/>
     <w:p>
       <w:pPr>
         <w:pStyle w:val="Heading4"/>
@@ -5079,7 +5067,7 @@
         <w:rPr>
           <w:rStyle w:val="FootnoteReference"/>
         </w:rPr>
-        <w:footnoteReference w:id="37"/>
+        <w:footnoteReference w:id="36"/>
       </w:r>
       <w:r>
         <w:t xml:space="preserve"> </w:t>
@@ -5177,7 +5165,7 @@
         <w:rPr>
           <w:rStyle w:val="FootnoteReference"/>
         </w:rPr>
-        <w:footnoteReference w:id="38"/>
+        <w:footnoteReference w:id="37"/>
       </w:r>
       <w:r>
         <w:t xml:space="preserve"> </w:t>
@@ -5188,7 +5176,7 @@
       <w:r>
         <w:t xml:space="preserve"> </w:t>
       </w:r>
-      <w:hyperlink r:id="rId34">
+      <w:hyperlink r:id="rId33">
         <w:r>
           <w:rPr>
             <w:rStyle w:val="Referenciaatema"/>
@@ -5202,7 +5190,7 @@
       <w:r>
         <w:t xml:space="preserve"> </w:t>
       </w:r>
-      <w:hyperlink r:id="rId26">
+      <w:hyperlink r:id="rId25">
         <w:r>
           <w:rPr>
             <w:rStyle w:val="Referenciaatema"/>
@@ -5214,7 +5202,7 @@
         <w:t xml:space="preserve">.</w:t>
       </w:r>
     </w:p>
-    <w:bookmarkStart w:id="42" w:name="fig_caja_edgeworth_fpp"/>
+    <w:bookmarkStart w:id="41" w:name="fig_caja_edgeworth_fpp"/>
     <w:p>
       <w:pPr>
         <w:pStyle w:val="ImageCaption"/>
@@ -5292,18 +5280,18 @@
           <wp:inline>
             <wp:extent cx="5422177" cy="2223307"/>
             <wp:effectExtent b="0" l="0" r="0" t="0"/>
-            <wp:docPr descr="Gráfico 1.– Caja de Edgeworth de la producción y frontera de posibilidades de producción: el punto A es ineficiente; B y C, en la curva de contrato, se trasladan a la FPP" title="" id="40" name="Picture"/>
+            <wp:docPr descr="Gráfico 1.– Caja de Edgeworth de la producción y frontera de posibilidades de producción: el punto A es ineficiente; B y C, en la curva de contrato, se trasladan a la FPP" title="" id="39" name="Picture"/>
             <a:graphic>
               <a:graphicData uri="http://schemas.openxmlformats.org/drawingml/2006/picture">
                 <pic:pic>
                   <pic:nvPicPr>
-                    <pic:cNvPr descr="C:\Users\vgutierrez\Documents\src\victorgutierrezmarcos.github.io-revision\oposicion\temario\fuentes\3A22\graficos/caja-edgeworth-fpp.png" id="41" name="Picture"/>
+                    <pic:cNvPr descr="C:\Users\vgutierrez\Documents\src\victorgutierrezmarcos.github.io-revision\oposicion\temario\fuentes\3A22\graficos/caja-edgeworth-fpp.png" id="40" name="Picture"/>
                     <pic:cNvPicPr>
                       <a:picLocks noChangeArrowheads="1" noChangeAspect="1"/>
                     </pic:cNvPicPr>
                   </pic:nvPicPr>
                   <pic:blipFill>
-                    <a:blip r:embed="rId39"/>
+                    <a:blip r:embed="rId38"/>
                     <a:stretch>
                       <a:fillRect/>
                     </a:stretch>
@@ -5330,7 +5318,7 @@
         </w:drawing>
       </w:r>
     </w:p>
-    <w:bookmarkEnd w:id="42"/>
+    <w:bookmarkEnd w:id="41"/>
     <w:p>
       <w:pPr>
         <w:pStyle w:val="Piedeimagen"/>
@@ -5390,7 +5378,7 @@
         <w:rPr>
           <w:rStyle w:val="FootnoteReference"/>
         </w:rPr>
-        <w:footnoteReference w:id="43"/>
+        <w:footnoteReference w:id="42"/>
       </w:r>
     </w:p>
     <w:p>
@@ -5791,7 +5779,7 @@
         <w:rPr>
           <w:rStyle w:val="FootnoteReference"/>
         </w:rPr>
-        <w:footnoteReference w:id="44"/>
+        <w:footnoteReference w:id="43"/>
       </w:r>
     </w:p>
     <w:p>
@@ -5815,7 +5803,7 @@
         <w:rPr>
           <w:rStyle w:val="FootnoteReference"/>
         </w:rPr>
-        <w:footnoteReference w:id="46"/>
+        <w:footnoteReference w:id="45"/>
       </w:r>
     </w:p>
     <w:p>
@@ -5836,8 +5824,8 @@
         <w:t xml:space="preserve">: los de dentro son factibles pero ineficientes, y los de fuera, inalcanzables con los recursos y la tecnología dados.</w:t>
       </w:r>
     </w:p>
-    <w:bookmarkEnd w:id="47"/>
-    <w:bookmarkStart w:id="56" w:name="eficiencia_en_el_consumo"/>
+    <w:bookmarkEnd w:id="46"/>
+    <w:bookmarkStart w:id="55" w:name="eficiencia_en_el_consumo"/>
     <w:p>
       <w:pPr>
         <w:pStyle w:val="Heading4"/>
@@ -7125,7 +7113,7 @@
         <w:rPr>
           <w:rStyle w:val="FootnoteReference"/>
         </w:rPr>
-        <w:footnoteReference w:id="48"/>
+        <w:footnoteReference w:id="47"/>
       </w:r>
       <w:r>
         <w:t xml:space="preserve"> </w:t>
@@ -7176,7 +7164,7 @@
       <w:r>
         <w:t xml:space="preserve"> </w:t>
       </w:r>
-      <w:hyperlink r:id="rId26">
+      <w:hyperlink r:id="rId25">
         <w:r>
           <w:rPr>
             <w:rStyle w:val="Referenciaatema"/>
@@ -7266,10 +7254,10 @@
         <w:rPr>
           <w:rStyle w:val="FootnoteReference"/>
         </w:rPr>
-        <w:footnoteReference w:id="49"/>
-      </w:r>
-    </w:p>
-    <w:bookmarkStart w:id="53" w:name="fig_caja_consumo_fpu"/>
+        <w:footnoteReference w:id="48"/>
+      </w:r>
+    </w:p>
+    <w:bookmarkStart w:id="52" w:name="fig_caja_consumo_fpu"/>
     <w:p>
       <w:pPr>
         <w:pStyle w:val="ImageCaption"/>
@@ -7293,18 +7281,18 @@
           <wp:inline>
             <wp:extent cx="5670550" cy="2486426"/>
             <wp:effectExtent b="0" l="0" r="0" t="0"/>
-            <wp:docPr descr="Gráfico 2.– De la curva de contrato del consumo a la frontera de posibilidades de utilidad" title="" id="51" name="Picture"/>
+            <wp:docPr descr="Gráfico 2.– De la curva de contrato del consumo a la frontera de posibilidades de utilidad" title="" id="50" name="Picture"/>
             <a:graphic>
               <a:graphicData uri="http://schemas.openxmlformats.org/drawingml/2006/picture">
                 <pic:pic>
                   <pic:nvPicPr>
-                    <pic:cNvPr descr="C:\Users\vgutierrez\Documents\src\victorgutierrezmarcos.github.io-revision\oposicion\temario\fuentes\3A22\graficos/caja-consumo-fpu.png" id="52" name="Picture"/>
+                    <pic:cNvPr descr="C:\Users\vgutierrez\Documents\src\victorgutierrezmarcos.github.io-revision\oposicion\temario\fuentes\3A22\graficos/caja-consumo-fpu.png" id="51" name="Picture"/>
                     <pic:cNvPicPr>
                       <a:picLocks noChangeArrowheads="1" noChangeAspect="1"/>
                     </pic:cNvPicPr>
                   </pic:nvPicPr>
                   <pic:blipFill>
-                    <a:blip r:embed="rId50"/>
+                    <a:blip r:embed="rId49"/>
                     <a:stretch>
                       <a:fillRect/>
                     </a:stretch>
@@ -7331,7 +7319,7 @@
         </w:drawing>
       </w:r>
     </w:p>
-    <w:bookmarkEnd w:id="53"/>
+    <w:bookmarkEnd w:id="52"/>
     <w:p>
       <w:pPr>
         <w:pStyle w:val="Piedeimagen"/>
@@ -7500,7 +7488,7 @@
         <w:rPr>
           <w:rStyle w:val="FootnoteReference"/>
         </w:rPr>
-        <w:footnoteReference w:id="54"/>
+        <w:footnoteReference w:id="53"/>
       </w:r>
     </w:p>
     <w:p>
@@ -7583,11 +7571,11 @@
         <w:rPr>
           <w:rStyle w:val="FootnoteReference"/>
         </w:rPr>
-        <w:footnoteReference w:id="55"/>
-      </w:r>
-    </w:p>
-    <w:bookmarkEnd w:id="56"/>
-    <w:bookmarkStart w:id="65" w:name="eficiencia_global"/>
+        <w:footnoteReference w:id="54"/>
+      </w:r>
+    </w:p>
+    <w:bookmarkEnd w:id="55"/>
+    <w:bookmarkStart w:id="64" w:name="eficiencia_global"/>
     <w:p>
       <w:pPr>
         <w:pStyle w:val="Heading4"/>
@@ -7659,8 +7647,8 @@
       <w:r>
         <w:t xml:space="preserve"> </w:t>
       </w:r>
-      <w:bookmarkStart w:id="57" w:name="eq_planificador"/>
-      <w:bookmarkEnd w:id="57"/>
+      <w:bookmarkStart w:id="56" w:name="eq_planificador"/>
+      <w:bookmarkEnd w:id="56"/>
     </w:p>
     <w:p>
       <w:pPr>
@@ -8956,8 +8944,8 @@
         <w:t xml:space="preserve">:</w:t>
       </w:r>
     </w:p>
-    <w:bookmarkStart w:id="58" w:name="eq_condiciones_pareto"/>
-    <w:bookmarkEnd w:id="58"/>
+    <w:bookmarkStart w:id="57" w:name="eq_condiciones_pareto"/>
+    <w:bookmarkEnd w:id="57"/>
     <w:p>
       <w:pPr>
         <w:pStyle w:val="Funcionclave"/>
@@ -10409,10 +10397,10 @@
         <w:rPr>
           <w:rStyle w:val="FootnoteReference"/>
         </w:rPr>
-        <w:footnoteReference w:id="59"/>
-      </w:r>
-    </w:p>
-    <w:bookmarkStart w:id="63" w:name="fig_gfpu"/>
+        <w:footnoteReference w:id="58"/>
+      </w:r>
+    </w:p>
+    <w:bookmarkStart w:id="62" w:name="fig_gfpu"/>
     <w:p>
       <w:pPr>
         <w:pStyle w:val="ImageCaption"/>
@@ -10489,18 +10477,18 @@
           <wp:inline>
             <wp:extent cx="5670550" cy="2526978"/>
             <wp:effectExtent b="0" l="0" r="0" t="0"/>
-            <wp:docPr descr="Gráfico 3.– Construcción de la gran frontera de posibilidades de utilidad: la caja del consumo dentro de la FPP, con \mathrm{RMS}=\mathrm{RMT} (izquierda), y las FPU de cada punto de la FPP con su envolvente, la GFPU (derecha)" title="" id="61" name="Picture"/>
+            <wp:docPr descr="Gráfico 3.– Construcción de la gran frontera de posibilidades de utilidad: la caja del consumo dentro de la FPP, con \mathrm{RMS}=\mathrm{RMT} (izquierda), y las FPU de cada punto de la FPP con su envolvente, la GFPU (derecha)" title="" id="60" name="Picture"/>
             <a:graphic>
               <a:graphicData uri="http://schemas.openxmlformats.org/drawingml/2006/picture">
                 <pic:pic>
                   <pic:nvPicPr>
-                    <pic:cNvPr descr="C:\Users\vgutierrez\Documents\src\victorgutierrezmarcos.github.io-revision\oposicion\temario\fuentes\3A22\graficos/gfpu.png" id="62" name="Picture"/>
+                    <pic:cNvPr descr="C:\Users\vgutierrez\Documents\src\victorgutierrezmarcos.github.io-revision\oposicion\temario\fuentes\3A22\graficos/gfpu.png" id="61" name="Picture"/>
                     <pic:cNvPicPr>
                       <a:picLocks noChangeArrowheads="1" noChangeAspect="1"/>
                     </pic:cNvPicPr>
                   </pic:nvPicPr>
                   <pic:blipFill>
-                    <a:blip r:embed="rId60"/>
+                    <a:blip r:embed="rId59"/>
                     <a:stretch>
                       <a:fillRect/>
                     </a:stretch>
@@ -10527,7 +10515,7 @@
         </w:drawing>
       </w:r>
     </w:p>
-    <w:bookmarkEnd w:id="63"/>
+    <w:bookmarkEnd w:id="62"/>
     <w:p>
       <w:pPr>
         <w:pStyle w:val="Piedeimagen"/>
@@ -10651,7 +10639,7 @@
         <w:rPr>
           <w:rStyle w:val="FootnoteReference"/>
         </w:rPr>
-        <w:footnoteReference w:id="64"/>
+        <w:footnoteReference w:id="63"/>
       </w:r>
       <w:r>
         <w:t xml:space="preserve"> </w:t>
@@ -10691,8 +10679,8 @@
         <w:t xml:space="preserve">para maximizar el bienestar social.</w:t>
       </w:r>
     </w:p>
-    <w:bookmarkEnd w:id="65"/>
-    <w:bookmarkStart w:id="71" w:name="elegir_entre___ptimos_la_funci__n__90752"/>
+    <w:bookmarkEnd w:id="64"/>
+    <w:bookmarkStart w:id="70" w:name="elegir_entre___ptimos_la_funci__n__90752"/>
     <w:p>
       <w:pPr>
         <w:pStyle w:val="Heading4"/>
@@ -11139,7 +11127,7 @@
       <w:r>
         <w:t xml:space="preserve"> </w:t>
       </w:r>
-      <w:hyperlink r:id="rId66">
+      <w:hyperlink r:id="rId65">
         <w:r>
           <w:rPr>
             <w:rStyle w:val="Referenciaatema"/>
@@ -11151,7 +11139,7 @@
         <w:t xml:space="preserve">.</w:t>
       </w:r>
     </w:p>
-    <w:bookmarkStart w:id="70" w:name="fig_fbs_gfpu"/>
+    <w:bookmarkStart w:id="69" w:name="fig_fbs_gfpu"/>
     <w:p>
       <w:pPr>
         <w:pStyle w:val="ImageCaption"/>
@@ -11183,18 +11171,18 @@
           <wp:inline>
             <wp:extent cx="3483282" cy="2746258"/>
             <wp:effectExtent b="0" l="0" r="0" t="0"/>
-            <wp:docPr descr="Gráfico 4.– Función de bienestar social y gran frontera de posibilidades de utilidad: el punto de felicidad c" title="" id="68" name="Picture"/>
+            <wp:docPr descr="Gráfico 4.– Función de bienestar social y gran frontera de posibilidades de utilidad: el punto de felicidad c" title="" id="67" name="Picture"/>
             <a:graphic>
               <a:graphicData uri="http://schemas.openxmlformats.org/drawingml/2006/picture">
                 <pic:pic>
                   <pic:nvPicPr>
-                    <pic:cNvPr descr="C:\Users\vgutierrez\Documents\src\victorgutierrezmarcos.github.io-revision\oposicion\temario\fuentes\3A22\graficos/fbs-gfpu.png" id="69" name="Picture"/>
+                    <pic:cNvPr descr="C:\Users\vgutierrez\Documents\src\victorgutierrezmarcos.github.io-revision\oposicion\temario\fuentes\3A22\graficos/fbs-gfpu.png" id="68" name="Picture"/>
                     <pic:cNvPicPr>
                       <a:picLocks noChangeArrowheads="1" noChangeAspect="1"/>
                     </pic:cNvPicPr>
                   </pic:nvPicPr>
                   <pic:blipFill>
-                    <a:blip r:embed="rId67"/>
+                    <a:blip r:embed="rId66"/>
                     <a:stretch>
                       <a:fillRect/>
                     </a:stretch>
@@ -11221,7 +11209,7 @@
         </w:drawing>
       </w:r>
     </w:p>
-    <w:bookmarkEnd w:id="70"/>
+    <w:bookmarkEnd w:id="69"/>
     <w:p>
       <w:pPr>
         <w:pStyle w:val="Piedeimagen"/>
@@ -11259,9 +11247,9 @@
         <w:t xml:space="preserve">.</w:t>
       </w:r>
     </w:p>
+    <w:bookmarkEnd w:id="70"/>
     <w:bookmarkEnd w:id="71"/>
-    <w:bookmarkEnd w:id="72"/>
-    <w:bookmarkStart w:id="78" w:name="sec_valoracion_pareto"/>
+    <w:bookmarkStart w:id="77" w:name="sec_valoracion_pareto"/>
     <w:p>
       <w:pPr>
         <w:pStyle w:val="Heading2"/>
@@ -11549,7 +11537,7 @@
         <w:rPr>
           <w:rStyle w:val="FootnoteReference"/>
         </w:rPr>
-        <w:footnoteReference w:id="73"/>
+        <w:footnoteReference w:id="72"/>
       </w:r>
       <w:r>
         <w:t xml:space="preserve"> </w:t>
@@ -11605,7 +11593,7 @@
         <w:rPr>
           <w:rStyle w:val="FootnoteReference"/>
         </w:rPr>
-        <w:footnoteReference w:id="74"/>
+        <w:footnoteReference w:id="73"/>
       </w:r>
     </w:p>
     <w:p>
@@ -11629,7 +11617,7 @@
         <w:rPr>
           <w:rStyle w:val="FootnoteReference"/>
         </w:rPr>
-        <w:footnoteReference w:id="77"/>
+        <w:footnoteReference w:id="76"/>
       </w:r>
     </w:p>
     <w:p>
@@ -11798,7 +11786,7 @@
       <w:r>
         <w:t xml:space="preserve"> </w:t>
       </w:r>
-      <w:hyperlink r:id="rId23">
+      <w:hyperlink r:id="rId22">
         <w:r>
           <w:rPr>
             <w:rStyle w:val="Referenciaatema"/>
@@ -11869,7 +11857,7 @@
       <w:r>
         <w:t xml:space="preserve"> </w:t>
       </w:r>
-      <w:hyperlink r:id="rId66">
+      <w:hyperlink r:id="rId65">
         <w:r>
           <w:rPr>
             <w:rStyle w:val="Referenciaatema"/>
@@ -11910,9 +11898,9 @@
         <w:t xml:space="preserve">), y lo puede calcular un planificador que lo sepa todo. Pasamos ahora a la pregunta central del tema: ¿lo alcanza el mercado sin planificador?</w:t>
       </w:r>
     </w:p>
+    <w:bookmarkEnd w:id="77"/>
     <w:bookmarkEnd w:id="78"/>
-    <w:bookmarkEnd w:id="79"/>
-    <w:bookmarkStart w:id="126" w:name="sec_teoremas"/>
+    <w:bookmarkStart w:id="125" w:name="sec_teoremas"/>
     <w:p>
       <w:pPr>
         <w:pStyle w:val="Heading1"/>
@@ -12068,7 +12056,7 @@
       <w:r>
         <w:t xml:space="preserve"> </w:t>
       </w:r>
-      <w:hyperlink r:id="rId26">
+      <w:hyperlink r:id="rId25">
         <w:r>
           <w:rPr>
             <w:rStyle w:val="Referenciaatema"/>
@@ -13064,7 +13052,7 @@
         <w:t xml:space="preserve">, por separado.</w:t>
       </w:r>
     </w:p>
-    <w:bookmarkStart w:id="108" w:name="sec_primer_teorema"/>
+    <w:bookmarkStart w:id="107" w:name="sec_primer_teorema"/>
     <w:p>
       <w:pPr>
         <w:pStyle w:val="Heading2"/>
@@ -13079,7 +13067,7 @@
         <w:t xml:space="preserve">Primer teorema fundamental de la economía del bienestar (1TFEB)</w:t>
       </w:r>
     </w:p>
-    <w:bookmarkStart w:id="81" w:name="a_idea"/>
+    <w:bookmarkStart w:id="80" w:name="a_idea"/>
     <w:p>
       <w:pPr>
         <w:pStyle w:val="Heading4"/>
@@ -13247,7 +13235,7 @@
         <w:rPr>
           <w:rStyle w:val="FootnoteReference"/>
         </w:rPr>
-        <w:footnoteReference w:id="80"/>
+        <w:footnoteReference w:id="79"/>
       </w:r>
     </w:p>
     <w:p>
@@ -13339,8 +13327,8 @@
         <w:t xml:space="preserve">que le toca.</w:t>
       </w:r>
     </w:p>
-    <w:bookmarkEnd w:id="81"/>
-    <w:bookmarkStart w:id="103" w:name="b_modelo_el_equilibrio_general_com_25678"/>
+    <w:bookmarkEnd w:id="80"/>
+    <w:bookmarkStart w:id="102" w:name="b_modelo_el_equilibrio_general_com_25678"/>
     <w:p>
       <w:pPr>
         <w:pStyle w:val="Heading4"/>
@@ -13349,7 +13337,7 @@
         <w:t xml:space="preserve">b) Modelo: el equilibrio general competitivo 2×2×2×2</w:t>
       </w:r>
     </w:p>
-    <w:bookmarkStart w:id="90" w:name="i_supuestos"/>
+    <w:bookmarkStart w:id="89" w:name="i_supuestos"/>
     <w:p>
       <w:pPr>
         <w:pStyle w:val="Heading5"/>
@@ -13753,7 +13741,7 @@
         <w:t xml:space="preserve">ordena junto con el fallo de mercado que aparece cuando se levanta cada uno.</w:t>
       </w:r>
     </w:p>
-    <w:bookmarkStart w:id="89" w:name="tab_supuestos_1tfeb"/>
+    <w:bookmarkStart w:id="88" w:name="tab_supuestos_1tfeb"/>
     <w:p>
       <w:pPr>
         <w:pStyle w:val="TableCaption"/>
@@ -14006,7 +13994,7 @@
             <w:r>
               <w:t xml:space="preserve"> </w:t>
             </w:r>
-            <w:hyperlink r:id="rId82">
+            <w:hyperlink r:id="rId81">
               <w:r>
                 <w:rPr>
                   <w:rStyle w:val="Referenciaatema"/>
@@ -14073,7 +14061,7 @@
             <w:r>
               <w:t xml:space="preserve"> </w:t>
             </w:r>
-            <w:hyperlink r:id="rId83">
+            <w:hyperlink r:id="rId82">
               <w:r>
                 <w:rPr>
                   <w:rStyle w:val="Referenciaatema"/>
@@ -14104,7 +14092,7 @@
             <w:r>
               <w:t xml:space="preserve"> </w:t>
             </w:r>
-            <w:hyperlink r:id="rId84">
+            <w:hyperlink r:id="rId83">
               <w:r>
                 <w:rPr>
                   <w:rStyle w:val="Referenciaatema"/>
@@ -14115,7 +14103,7 @@
             <w:r>
               <w:t xml:space="preserve"> </w:t>
             </w:r>
-            <w:hyperlink r:id="rId85">
+            <w:hyperlink r:id="rId84">
               <w:r>
                 <w:rPr>
                   <w:rStyle w:val="Referenciaatema"/>
@@ -14126,7 +14114,7 @@
             <w:r>
               <w:t xml:space="preserve"> </w:t>
             </w:r>
-            <w:hyperlink r:id="rId86">
+            <w:hyperlink r:id="rId85">
               <w:r>
                 <w:rPr>
                   <w:rStyle w:val="Referenciaatema"/>
@@ -14210,7 +14198,7 @@
             <w:r>
               <w:t xml:space="preserve"> </w:t>
             </w:r>
-            <w:hyperlink r:id="rId87">
+            <w:hyperlink r:id="rId86">
               <w:r>
                 <w:rPr>
                   <w:rStyle w:val="Referenciaatema"/>
@@ -14294,7 +14282,7 @@
             <w:r>
               <w:t xml:space="preserve"> </w:t>
             </w:r>
-            <w:hyperlink r:id="rId88">
+            <w:hyperlink r:id="rId87">
               <w:r>
                 <w:rPr>
                   <w:rStyle w:val="Referenciaatema"/>
@@ -14306,7 +14294,7 @@
         </w:tc>
       </w:tr>
     </w:tbl>
-    <w:bookmarkEnd w:id="89"/>
+    <w:bookmarkEnd w:id="88"/>
     <w:p>
       <w:pPr>
         <w:pStyle w:val="BodyText"/>
@@ -14454,7 +14442,7 @@
       <w:r>
         <w:t xml:space="preserve"> </w:t>
       </w:r>
-      <w:hyperlink r:id="rId26">
+      <w:hyperlink r:id="rId25">
         <w:r>
           <w:rPr>
             <w:rStyle w:val="Referenciaatema"/>
@@ -14497,8 +14485,8 @@
         <w:t xml:space="preserve">: el desarrollo que sigue usa derivadas y supone soluciones interiores, como el problema del planificador; la prueba general de las extensiones no necesita ninguna de las 2 cosas.</w:t>
       </w:r>
     </w:p>
-    <w:bookmarkEnd w:id="90"/>
-    <w:bookmarkStart w:id="100" w:name="ii_desarrollo"/>
+    <w:bookmarkEnd w:id="89"/>
+    <w:bookmarkStart w:id="99" w:name="ii_desarrollo"/>
     <w:p>
       <w:pPr>
         <w:pStyle w:val="Heading5"/>
@@ -14971,8 +14959,8 @@
       <w:r>
         <w:t xml:space="preserve"> </w:t>
       </w:r>
-      <w:bookmarkStart w:id="91" w:name="eq_egc_consumidores"/>
-      <w:bookmarkEnd w:id="91"/>
+      <w:bookmarkStart w:id="90" w:name="eq_egc_consumidores"/>
+      <w:bookmarkEnd w:id="90"/>
     </w:p>
     <w:p>
       <w:pPr>
@@ -15636,8 +15624,8 @@
       <w:r>
         <w:t xml:space="preserve"> </w:t>
       </w:r>
-      <w:bookmarkStart w:id="92" w:name="eq_egc_empresas"/>
-      <w:bookmarkEnd w:id="92"/>
+      <w:bookmarkStart w:id="91" w:name="eq_egc_empresas"/>
+      <w:bookmarkEnd w:id="91"/>
     </w:p>
     <w:p>
       <w:pPr>
@@ -15973,7 +15961,7 @@
       <w:r>
         <w:t xml:space="preserve"> </w:t>
       </w:r>
-      <w:hyperlink r:id="rId83">
+      <w:hyperlink r:id="rId82">
         <w:r>
           <w:rPr>
             <w:rStyle w:val="Referenciaatema"/>
@@ -15987,8 +15975,8 @@
       <w:r>
         <w:t xml:space="preserve"> </w:t>
       </w:r>
-      <w:bookmarkStart w:id="93" w:name="eq_egc_global"/>
-      <w:bookmarkEnd w:id="93"/>
+      <w:bookmarkStart w:id="92" w:name="eq_egc_global"/>
+      <w:bookmarkEnd w:id="92"/>
     </w:p>
     <w:p>
       <w:pPr>
@@ -16437,7 +16425,7 @@
       <w:r>
         <w:t xml:space="preserve"> </w:t>
       </w:r>
-      <w:hyperlink r:id="rId26">
+      <w:hyperlink r:id="rId25">
         <w:r>
           <w:rPr>
             <w:rStyle w:val="Referenciaatema"/>
@@ -16921,8 +16909,8 @@
       <w:r>
         <w:t xml:space="preserve"> </w:t>
       </w:r>
-      <w:bookmarkStart w:id="94" w:name="eq_egc_condiciones"/>
-      <w:bookmarkEnd w:id="94"/>
+      <w:bookmarkStart w:id="93" w:name="eq_egc_condiciones"/>
+      <w:bookmarkEnd w:id="93"/>
     </w:p>
     <w:p>
       <w:pPr>
@@ -17467,7 +17455,7 @@
         <w:t xml:space="preserve">. Es el 1TFEB en el modelo 2×2×2×2. ∎</w:t>
       </w:r>
     </w:p>
-    <w:bookmarkStart w:id="95" w:name="tab_planificador_mercado"/>
+    <w:bookmarkStart w:id="94" w:name="tab_planificador_mercado"/>
     <w:p>
       <w:pPr>
         <w:pStyle w:val="TableCaption"/>
@@ -18521,7 +18509,7 @@
         </w:tc>
       </w:tr>
     </w:tbl>
-    <w:bookmarkEnd w:id="95"/>
+    <w:bookmarkEnd w:id="94"/>
     <w:p>
       <w:pPr>
         <w:pStyle w:val="BodyText"/>
@@ -18800,7 +18788,7 @@
         <w:t xml:space="preserve">.</w:t>
       </w:r>
     </w:p>
-    <w:bookmarkStart w:id="99" w:name="fig_caja_intercambio_teoremas"/>
+    <w:bookmarkStart w:id="98" w:name="fig_caja_intercambio_teoremas"/>
     <w:p>
       <w:pPr>
         <w:pStyle w:val="ImageCaption"/>
@@ -18918,18 +18906,18 @@
           <wp:inline>
             <wp:extent cx="4476750" cy="3187759"/>
             <wp:effectExtent b="0" l="0" r="0" t="0"/>
-            <wp:docPr descr="Gráfico 5.– Los teoremas del bienestar en la caja de Edgeworth: el equilibrio E en la curva de contrato (1TFEB) y el paso de \vec{\omega} a \vec{\omega}' para alcanzar E' (2TFEB)" title="" id="97" name="Picture"/>
+            <wp:docPr descr="Gráfico 5.– Los teoremas del bienestar en la caja de Edgeworth: el equilibrio E en la curva de contrato (1TFEB) y el paso de \vec{\omega} a \vec{\omega}' para alcanzar E' (2TFEB)" title="" id="96" name="Picture"/>
             <a:graphic>
               <a:graphicData uri="http://schemas.openxmlformats.org/drawingml/2006/picture">
                 <pic:pic>
                   <pic:nvPicPr>
-                    <pic:cNvPr descr="C:\Users\vgutierrez\Documents\src\victorgutierrezmarcos.github.io-revision\oposicion\temario\fuentes\3A22\graficos/caja-intercambio-teoremas.png" id="98" name="Picture"/>
+                    <pic:cNvPr descr="C:\Users\vgutierrez\Documents\src\victorgutierrezmarcos.github.io-revision\oposicion\temario\fuentes\3A22\graficos/caja-intercambio-teoremas.png" id="97" name="Picture"/>
                     <pic:cNvPicPr>
                       <a:picLocks noChangeArrowheads="1" noChangeAspect="1"/>
                     </pic:cNvPicPr>
                   </pic:nvPicPr>
                   <pic:blipFill>
-                    <a:blip r:embed="rId96"/>
+                    <a:blip r:embed="rId95"/>
                     <a:stretch>
                       <a:fillRect/>
                     </a:stretch>
@@ -18956,7 +18944,7 @@
         </w:drawing>
       </w:r>
     </w:p>
-    <w:bookmarkEnd w:id="99"/>
+    <w:bookmarkEnd w:id="98"/>
     <w:p>
       <w:pPr>
         <w:pStyle w:val="Piedeimagen"/>
@@ -19053,8 +19041,8 @@
         <w:t xml:space="preserve">.</w:t>
       </w:r>
     </w:p>
-    <w:bookmarkEnd w:id="100"/>
-    <w:bookmarkStart w:id="102" w:name="iii_implicaciones"/>
+    <w:bookmarkEnd w:id="99"/>
+    <w:bookmarkStart w:id="101" w:name="iii_implicaciones"/>
     <w:p>
       <w:pPr>
         <w:pStyle w:val="Heading5"/>
@@ -19147,12 +19135,12 @@
         <w:rPr>
           <w:rStyle w:val="FootnoteReference"/>
         </w:rPr>
-        <w:footnoteReference w:id="101"/>
-      </w:r>
-    </w:p>
+        <w:footnoteReference w:id="100"/>
+      </w:r>
+    </w:p>
+    <w:bookmarkEnd w:id="101"/>
     <w:bookmarkEnd w:id="102"/>
-    <w:bookmarkEnd w:id="103"/>
-    <w:bookmarkStart w:id="104" w:name="c_extensiones"/>
+    <w:bookmarkStart w:id="103" w:name="c_extensiones"/>
     <w:p>
       <w:pPr>
         <w:pStyle w:val="Heading4"/>
@@ -20466,8 +20454,8 @@
         <w:t xml:space="preserve">).</w:t>
       </w:r>
     </w:p>
-    <w:bookmarkEnd w:id="104"/>
-    <w:bookmarkStart w:id="106" w:name="d_evidencia_emp__rica"/>
+    <w:bookmarkEnd w:id="103"/>
+    <w:bookmarkStart w:id="105" w:name="d_evidencia_emp__rica"/>
     <w:p>
       <w:pPr>
         <w:pStyle w:val="Heading4"/>
@@ -20544,7 +20532,7 @@
         <w:rPr>
           <w:rStyle w:val="FootnoteReference"/>
         </w:rPr>
-        <w:footnoteReference w:id="105"/>
+        <w:footnoteReference w:id="104"/>
       </w:r>
     </w:p>
     <w:p>
@@ -20631,8 +20619,8 @@
         <w:t xml:space="preserve">, que abren la valoración.</w:t>
       </w:r>
     </w:p>
-    <w:bookmarkEnd w:id="106"/>
-    <w:bookmarkStart w:id="107" w:name="e_valoraci__n"/>
+    <w:bookmarkEnd w:id="105"/>
+    <w:bookmarkStart w:id="106" w:name="e_valoraci__n"/>
     <w:p>
       <w:pPr>
         <w:pStyle w:val="Heading4"/>
@@ -20718,7 +20706,7 @@
       <w:r>
         <w:t xml:space="preserve"> </w:t>
       </w:r>
-      <w:hyperlink r:id="rId82">
+      <w:hyperlink r:id="rId81">
         <w:r>
           <w:rPr>
             <w:rStyle w:val="Referenciaatema"/>
@@ -20743,7 +20731,7 @@
       <w:r>
         <w:t xml:space="preserve"> </w:t>
       </w:r>
-      <w:hyperlink r:id="rId84">
+      <w:hyperlink r:id="rId83">
         <w:r>
           <w:rPr>
             <w:rStyle w:val="Referenciaatema"/>
@@ -20754,7 +20742,7 @@
       <w:r>
         <w:t xml:space="preserve"> </w:t>
       </w:r>
-      <w:hyperlink r:id="rId85">
+      <w:hyperlink r:id="rId84">
         <w:r>
           <w:rPr>
             <w:rStyle w:val="Referenciaatema"/>
@@ -20765,7 +20753,7 @@
       <w:r>
         <w:t xml:space="preserve"> </w:t>
       </w:r>
-      <w:hyperlink r:id="rId86">
+      <w:hyperlink r:id="rId85">
         <w:r>
           <w:rPr>
             <w:rStyle w:val="Referenciaatema"/>
@@ -20790,7 +20778,7 @@
       <w:r>
         <w:t xml:space="preserve"> </w:t>
       </w:r>
-      <w:hyperlink r:id="rId87">
+      <w:hyperlink r:id="rId86">
         <w:r>
           <w:rPr>
             <w:rStyle w:val="Referenciaatema"/>
@@ -20815,7 +20803,7 @@
       <w:r>
         <w:t xml:space="preserve"> </w:t>
       </w:r>
-      <w:hyperlink r:id="rId88">
+      <w:hyperlink r:id="rId87">
         <w:r>
           <w:rPr>
             <w:rStyle w:val="Referenciaatema"/>
@@ -20913,7 +20901,7 @@
       <w:r>
         <w:t xml:space="preserve"> </w:t>
       </w:r>
-      <w:hyperlink r:id="rId26">
+      <w:hyperlink r:id="rId25">
         <w:r>
           <w:rPr>
             <w:rStyle w:val="Referenciaatema"/>
@@ -20990,9 +20978,9 @@
         <w:t xml:space="preserve">, en particular al que la sociedad prefiera.</w:t>
       </w:r>
     </w:p>
+    <w:bookmarkEnd w:id="106"/>
     <w:bookmarkEnd w:id="107"/>
-    <w:bookmarkEnd w:id="108"/>
-    <w:bookmarkStart w:id="125" w:name="sec_segundo_teorema"/>
+    <w:bookmarkStart w:id="124" w:name="sec_segundo_teorema"/>
     <w:p>
       <w:pPr>
         <w:pStyle w:val="Heading2"/>
@@ -21007,7 +20995,7 @@
         <w:t xml:space="preserve">Segundo teorema fundamental de la economía del bienestar (2TFEB)</w:t>
       </w:r>
     </w:p>
-    <w:bookmarkStart w:id="109" w:name="a_idea_1"/>
+    <w:bookmarkStart w:id="108" w:name="a_idea_1"/>
     <w:p>
       <w:pPr>
         <w:pStyle w:val="Heading4"/>
@@ -21161,8 +21149,8 @@
         <w:t xml:space="preserve">: es el recíproco del primero. Si la sociedad prefiere otro óptimo, por ejemplo el punto de felicidad, no hace falta sustituir el mercado: basta con redistribuir antes y dejar que el mercado haga el resto.</w:t>
       </w:r>
     </w:p>
-    <w:bookmarkEnd w:id="109"/>
-    <w:bookmarkStart w:id="121" w:name="b_modelo"/>
+    <w:bookmarkEnd w:id="108"/>
+    <w:bookmarkStart w:id="120" w:name="b_modelo"/>
     <w:p>
       <w:pPr>
         <w:pStyle w:val="Heading4"/>
@@ -21171,7 +21159,7 @@
         <w:t xml:space="preserve">b) Modelo</w:t>
       </w:r>
     </w:p>
-    <w:bookmarkStart w:id="110" w:name="i_supuestos_1"/>
+    <w:bookmarkStart w:id="109" w:name="i_supuestos_1"/>
     <w:p>
       <w:pPr>
         <w:pStyle w:val="Heading5"/>
@@ -21282,8 +21270,8 @@
         <w:t xml:space="preserve">: que cada consumidor, con su renta tras la transferencia, pueda comprar algo más barato que su cesta óptima (por ejemplo, que esta tenga todos sus componentes positivos).</w:t>
       </w:r>
     </w:p>
-    <w:bookmarkEnd w:id="110"/>
-    <w:bookmarkStart w:id="119" w:name="ii_desarrollo_1"/>
+    <w:bookmarkEnd w:id="109"/>
+    <w:bookmarkStart w:id="118" w:name="ii_desarrollo_1"/>
     <w:p>
       <w:pPr>
         <w:pStyle w:val="Heading5"/>
@@ -21745,7 +21733,7 @@
         <w:t xml:space="preserve">.</w:t>
       </w:r>
     </w:p>
-    <w:bookmarkStart w:id="114" w:name="fig_segundo_teorema_gfpu"/>
+    <w:bookmarkStart w:id="113" w:name="fig_segundo_teorema_gfpu"/>
     <w:p>
       <w:pPr>
         <w:pStyle w:val="ImageCaption"/>
@@ -21803,18 +21791,18 @@
           <wp:inline>
             <wp:extent cx="3489399" cy="2746258"/>
             <wp:effectExtent b="0" l="0" r="0" t="0"/>
-            <wp:docPr descr="Gráfico 6.– El 2TFEB en el espacio de las utilidades: la redistribución de suma fija lleva del equilibrio E al punto de felicidad E' a lo largo de la GFPU" title="" id="112" name="Picture"/>
+            <wp:docPr descr="Gráfico 6.– El 2TFEB en el espacio de las utilidades: la redistribución de suma fija lleva del equilibrio E al punto de felicidad E' a lo largo de la GFPU" title="" id="111" name="Picture"/>
             <a:graphic>
               <a:graphicData uri="http://schemas.openxmlformats.org/drawingml/2006/picture">
                 <pic:pic>
                   <pic:nvPicPr>
-                    <pic:cNvPr descr="C:\Users\vgutierrez\Documents\src\victorgutierrezmarcos.github.io-revision\oposicion\temario\fuentes\3A22\graficos/segundo-teorema-gfpu.png" id="113" name="Picture"/>
+                    <pic:cNvPr descr="C:\Users\vgutierrez\Documents\src\victorgutierrezmarcos.github.io-revision\oposicion\temario\fuentes\3A22\graficos/segundo-teorema-gfpu.png" id="112" name="Picture"/>
                     <pic:cNvPicPr>
                       <a:picLocks noChangeArrowheads="1" noChangeAspect="1"/>
                     </pic:cNvPicPr>
                   </pic:nvPicPr>
                   <pic:blipFill>
-                    <a:blip r:embed="rId111"/>
+                    <a:blip r:embed="rId110"/>
                     <a:stretch>
                       <a:fillRect/>
                     </a:stretch>
@@ -21841,7 +21829,7 @@
         </w:drawing>
       </w:r>
     </w:p>
-    <w:bookmarkEnd w:id="114"/>
+    <w:bookmarkEnd w:id="113"/>
     <w:p>
       <w:pPr>
         <w:pStyle w:val="Piedeimagen"/>
@@ -23040,7 +23028,7 @@
       <w:r>
         <w:t xml:space="preserve"> </w:t>
       </w:r>
-      <w:hyperlink r:id="rId84">
+      <w:hyperlink r:id="rId83">
         <w:r>
           <w:rPr>
             <w:rStyle w:val="Referenciaatema"/>
@@ -23052,7 +23040,7 @@
         <w:t xml:space="preserve">.</w:t>
       </w:r>
     </w:p>
-    <w:bookmarkStart w:id="118" w:name="fig_segundo_teorema_no_convexo"/>
+    <w:bookmarkStart w:id="117" w:name="fig_segundo_teorema_no_convexo"/>
     <w:p>
       <w:pPr>
         <w:pStyle w:val="ImageCaption"/>
@@ -23131,18 +23119,18 @@
           <wp:inline>
             <wp:extent cx="3581400" cy="2522179"/>
             <wp:effectExtent b="0" l="0" r="0" t="0"/>
-            <wp:docPr descr="Gráfico 7.– Sin convexidad falla el 2TFEB: en el óptimo E', la única recta tangente a las 2 curvas no lo sostiene como equilibrio, porque a esos precios A prefiere la cesta \vec{x}_A" title="" id="116" name="Picture"/>
+            <wp:docPr descr="Gráfico 7.– Sin convexidad falla el 2TFEB: en el óptimo E', la única recta tangente a las 2 curvas no lo sostiene como equilibrio, porque a esos precios A prefiere la cesta \vec{x}_A" title="" id="115" name="Picture"/>
             <a:graphic>
               <a:graphicData uri="http://schemas.openxmlformats.org/drawingml/2006/picture">
                 <pic:pic>
                   <pic:nvPicPr>
-                    <pic:cNvPr descr="C:\Users\vgutierrez\Documents\src\victorgutierrezmarcos.github.io-revision\oposicion\temario\fuentes\3A22\graficos/segundo-teorema-no-convexo.png" id="117" name="Picture"/>
+                    <pic:cNvPr descr="C:\Users\vgutierrez\Documents\src\victorgutierrezmarcos.github.io-revision\oposicion\temario\fuentes\3A22\graficos/segundo-teorema-no-convexo.png" id="116" name="Picture"/>
                     <pic:cNvPicPr>
                       <a:picLocks noChangeArrowheads="1" noChangeAspect="1"/>
                     </pic:cNvPicPr>
                   </pic:nvPicPr>
                   <pic:blipFill>
-                    <a:blip r:embed="rId115"/>
+                    <a:blip r:embed="rId114"/>
                     <a:stretch>
                       <a:fillRect/>
                     </a:stretch>
@@ -23169,7 +23157,7 @@
         </w:drawing>
       </w:r>
     </w:p>
-    <w:bookmarkEnd w:id="118"/>
+    <w:bookmarkEnd w:id="117"/>
     <w:p>
       <w:pPr>
         <w:pStyle w:val="Piedeimagen"/>
@@ -23234,8 +23222,8 @@
         <w:t xml:space="preserve">.</w:t>
       </w:r>
     </w:p>
-    <w:bookmarkEnd w:id="119"/>
-    <w:bookmarkStart w:id="120" w:name="iii_implicaciones_1"/>
+    <w:bookmarkEnd w:id="118"/>
+    <w:bookmarkStart w:id="119" w:name="iii_implicaciones_1"/>
     <w:p>
       <w:pPr>
         <w:pStyle w:val="Heading5"/>
@@ -23298,7 +23286,7 @@
       <w:r>
         <w:t xml:space="preserve"> </w:t>
       </w:r>
-      <w:hyperlink r:id="rId66">
+      <w:hyperlink r:id="rId65">
         <w:r>
           <w:rPr>
             <w:rStyle w:val="Referenciaatema"/>
@@ -23389,9 +23377,9 @@
         <w:t xml:space="preserve">.</w:t>
       </w:r>
     </w:p>
+    <w:bookmarkEnd w:id="119"/>
     <w:bookmarkEnd w:id="120"/>
-    <w:bookmarkEnd w:id="121"/>
-    <w:bookmarkStart w:id="124" w:name="c_valoraci__n_l__mites_y_soluciones"/>
+    <w:bookmarkStart w:id="123" w:name="c_valoraci__n_l__mites_y_soluciones"/>
     <w:p>
       <w:pPr>
         <w:pStyle w:val="Heading4"/>
@@ -23484,7 +23472,7 @@
       <w:r>
         <w:t xml:space="preserve"> </w:t>
       </w:r>
-      <w:hyperlink r:id="rId84">
+      <w:hyperlink r:id="rId83">
         <w:r>
           <w:rPr>
             <w:rStyle w:val="Referenciaatema"/>
@@ -23602,7 +23590,7 @@
       <w:r>
         <w:t xml:space="preserve"> </w:t>
       </w:r>
-      <w:hyperlink r:id="rId26">
+      <w:hyperlink r:id="rId25">
         <w:r>
           <w:rPr>
             <w:rStyle w:val="Referenciaatema"/>
@@ -23703,7 +23691,7 @@
       <w:r>
         <w:t xml:space="preserve"> </w:t>
       </w:r>
-      <w:hyperlink r:id="rId122">
+      <w:hyperlink r:id="rId121">
         <w:r>
           <w:rPr>
             <w:rStyle w:val="Referenciaatema"/>
@@ -23896,7 +23884,7 @@
       <w:r>
         <w:t xml:space="preserve"> </w:t>
       </w:r>
-      <w:hyperlink r:id="rId123">
+      <w:hyperlink r:id="rId122">
         <w:r>
           <w:rPr>
             <w:rStyle w:val="Referenciaatema"/>
@@ -23939,10 +23927,10 @@
         <w:t xml:space="preserve">, que estudia el bloque siguiente.</w:t>
       </w:r>
     </w:p>
+    <w:bookmarkEnd w:id="123"/>
     <w:bookmarkEnd w:id="124"/>
     <w:bookmarkEnd w:id="125"/>
-    <w:bookmarkEnd w:id="126"/>
-    <w:bookmarkStart w:id="154" w:name="sec_second_best"/>
+    <w:bookmarkStart w:id="153" w:name="sec_second_best"/>
     <w:p>
       <w:pPr>
         <w:pStyle w:val="Heading1"/>
@@ -24160,7 +24148,7 @@
         <w:t xml:space="preserve">, el mejor resultado con una restricción adicional que impide alguna. Nunca «de primer o de segundo orden», que son las condiciones de un problema de optimización.</w:t>
       </w:r>
     </w:p>
-    <w:bookmarkStart w:id="142" w:name="sec_second_best_idea"/>
+    <w:bookmarkStart w:id="141" w:name="sec_second_best_idea"/>
     <w:p>
       <w:pPr>
         <w:pStyle w:val="Heading2"/>
@@ -24175,7 +24163,7 @@
         <w:t xml:space="preserve">Idea y resultado general</w:t>
       </w:r>
     </w:p>
-    <w:bookmarkStart w:id="127" w:name="a_idea_2"/>
+    <w:bookmarkStart w:id="126" w:name="a_idea_2"/>
     <w:p>
       <w:pPr>
         <w:pStyle w:val="Heading4"/>
@@ -24361,8 +24349,8 @@
         <w:t xml:space="preserve">lo demuestran en general: no necesariamente.</w:t>
       </w:r>
     </w:p>
-    <w:bookmarkEnd w:id="127"/>
-    <w:bookmarkStart w:id="140" w:name="b_modelo_1"/>
+    <w:bookmarkEnd w:id="126"/>
+    <w:bookmarkStart w:id="139" w:name="b_modelo_1"/>
     <w:p>
       <w:pPr>
         <w:pStyle w:val="Heading4"/>
@@ -24371,7 +24359,7 @@
         <w:t xml:space="preserve">b) Modelo</w:t>
       </w:r>
     </w:p>
-    <w:bookmarkStart w:id="128" w:name="i_supuestos_2"/>
+    <w:bookmarkStart w:id="127" w:name="i_supuestos_2"/>
     <w:p>
       <w:pPr>
         <w:pStyle w:val="Heading5"/>
@@ -24958,8 +24946,8 @@
         <w:t xml:space="preserve">).</w:t>
       </w:r>
     </w:p>
-    <w:bookmarkEnd w:id="128"/>
-    <w:bookmarkStart w:id="137" w:name="ii_desarrollo_2"/>
+    <w:bookmarkEnd w:id="127"/>
+    <w:bookmarkStart w:id="136" w:name="ii_desarrollo_2"/>
     <w:p>
       <w:pPr>
         <w:pStyle w:val="Heading5"/>
@@ -25755,7 +25743,7 @@
         </w:numPr>
       </w:pPr>
       <w:r>
-        <w:t xml:space="preserve">lo bueno (</w:t>
+        <w:t xml:space="preserve">el segundo óptimo (</w:t>
       </w:r>
       <m:oMath>
         <m:r>
@@ -25763,7 +25751,22 @@
         </m:r>
       </m:oMath>
       <w:r>
-        <w:t xml:space="preserve">) no es lo que más se parece a lo mejor (</w:t>
+        <w:t xml:space="preserve">) no es el punto que más se parece al óptimo de</w:t>
+      </w:r>
+      <w:r>
+        <w:t xml:space="preserve"> </w:t>
+      </w:r>
+      <w:r>
+        <w:rPr>
+          <w:smallCaps/>
+        </w:rPr>
+        <w:t xml:space="preserve">Pareto</w:t>
+      </w:r>
+      <w:r>
+        <w:t xml:space="preserve"> </w:t>
+      </w:r>
+      <w:r>
+        <w:t xml:space="preserve">(</w:t>
       </w:r>
       <m:oMath>
         <m:r>
@@ -25774,7 +25777,7 @@
         <w:t xml:space="preserve">).</w:t>
       </w:r>
     </w:p>
-    <w:bookmarkStart w:id="132" w:name="fig_second_best_gfpu"/>
+    <w:bookmarkStart w:id="131" w:name="fig_second_best_gfpu"/>
     <w:p>
       <w:pPr>
         <w:pStyle w:val="ImageCaption"/>
@@ -25849,18 +25852,18 @@
           <wp:inline>
             <wp:extent cx="2954215" cy="3097950"/>
             <wp:effectExtent b="0" l="0" r="0" t="0"/>
-            <wp:docPr descr="Gráfico 8.– El segundo óptimo en el espacio de las utilidades: con la restricción, la zona sombreada, por encima de la restricción, no es alcanzable; el punto de felicidad F queda en ella, y el punto ineficiente Q da más bienestar que el óptimo de Pareto accesible P" title="" id="130" name="Picture"/>
+            <wp:docPr descr="Gráfico 8.– El segundo óptimo en el espacio de las utilidades: con la restricción, la zona sombreada, por encima de la restricción, no es alcanzable; el punto de felicidad F queda en ella, y el punto ineficiente Q da más bienestar que el óptimo de Pareto accesible P" title="" id="129" name="Picture"/>
             <a:graphic>
               <a:graphicData uri="http://schemas.openxmlformats.org/drawingml/2006/picture">
                 <pic:pic>
                   <pic:nvPicPr>
-                    <pic:cNvPr descr="C:\Users\vgutierrez\Documents\src\victorgutierrezmarcos.github.io-revision\oposicion\temario\fuentes\3A22\graficos/second-best-gfpu.png" id="131" name="Picture"/>
+                    <pic:cNvPr descr="C:\Users\vgutierrez\Documents\src\victorgutierrezmarcos.github.io-revision\oposicion\temario\fuentes\3A22\graficos/second-best-gfpu.png" id="130" name="Picture"/>
                     <pic:cNvPicPr>
                       <a:picLocks noChangeArrowheads="1" noChangeAspect="1"/>
                     </pic:cNvPicPr>
                   </pic:nvPicPr>
                   <pic:blipFill>
-                    <a:blip r:embed="rId129"/>
+                    <a:blip r:embed="rId128"/>
                     <a:stretch>
                       <a:fillRect/>
                     </a:stretch>
@@ -25887,7 +25890,7 @@
         </w:drawing>
       </w:r>
     </w:p>
-    <w:bookmarkEnd w:id="132"/>
+    <w:bookmarkEnd w:id="131"/>
     <w:p>
       <w:pPr>
         <w:pStyle w:val="Piedeimagen"/>
@@ -26027,7 +26030,7 @@
         <w:t xml:space="preserve">). En una cordillera no se llega a lo más alto andando siempre cuesta arriba.</w:t>
       </w:r>
     </w:p>
-    <w:bookmarkStart w:id="136" w:name="fig_montana_second_best"/>
+    <w:bookmarkStart w:id="135" w:name="fig_montana_second_best"/>
     <w:p>
       <w:pPr>
         <w:pStyle w:val="ImageCaption"/>
@@ -26081,18 +26084,18 @@
           <wp:inline>
             <wp:extent cx="4076572" cy="2079571"/>
             <wp:effectExtent b="0" l="0" r="0" t="0"/>
-            <wp:docPr descr="Gráfico 9.– La analogía de la montaña: con el obstáculo D, el segundo punto más alto, A, es mejor que seguir hacia la cumbre V" title="" id="134" name="Picture"/>
+            <wp:docPr descr="Gráfico 9.– La analogía de la montaña: con el obstáculo D, el segundo punto más alto, A, es mejor que seguir hacia la cumbre V" title="" id="133" name="Picture"/>
             <a:graphic>
               <a:graphicData uri="http://schemas.openxmlformats.org/drawingml/2006/picture">
                 <pic:pic>
                   <pic:nvPicPr>
-                    <pic:cNvPr descr="C:\Users\vgutierrez\Documents\src\victorgutierrezmarcos.github.io-revision\oposicion\temario\fuentes\3A22\graficos/montana-second-best.png" id="135" name="Picture"/>
+                    <pic:cNvPr descr="C:\Users\vgutierrez\Documents\src\victorgutierrezmarcos.github.io-revision\oposicion\temario\fuentes\3A22\graficos/montana-second-best.png" id="134" name="Picture"/>
                     <pic:cNvPicPr>
                       <a:picLocks noChangeArrowheads="1" noChangeAspect="1"/>
                     </pic:cNvPicPr>
                   </pic:nvPicPr>
                   <pic:blipFill>
-                    <a:blip r:embed="rId133"/>
+                    <a:blip r:embed="rId132"/>
                     <a:stretch>
                       <a:fillRect/>
                     </a:stretch>
@@ -26119,7 +26122,7 @@
         </w:drawing>
       </w:r>
     </w:p>
-    <w:bookmarkEnd w:id="136"/>
+    <w:bookmarkEnd w:id="135"/>
     <w:p>
       <w:pPr>
         <w:pStyle w:val="Piedeimagen"/>
@@ -26157,8 +26160,8 @@
         <w:t xml:space="preserve">.</w:t>
       </w:r>
     </w:p>
-    <w:bookmarkEnd w:id="137"/>
-    <w:bookmarkStart w:id="139" w:name="iii_implicaciones_2"/>
+    <w:bookmarkEnd w:id="136"/>
+    <w:bookmarkStart w:id="138" w:name="iii_implicaciones_2"/>
     <w:p>
       <w:pPr>
         <w:pStyle w:val="Heading5"/>
@@ -26245,7 +26248,7 @@
         <w:rPr>
           <w:rStyle w:val="FootnoteReference"/>
         </w:rPr>
-        <w:footnoteReference w:id="138"/>
+        <w:footnoteReference w:id="137"/>
       </w:r>
     </w:p>
     <w:p>
@@ -26266,9 +26269,9 @@
         <w:t xml:space="preserve">: hace falta analizar cada caso.</w:t>
       </w:r>
     </w:p>
+    <w:bookmarkEnd w:id="138"/>
     <w:bookmarkEnd w:id="139"/>
-    <w:bookmarkEnd w:id="140"/>
-    <w:bookmarkStart w:id="141" w:name="c_extensiones_1"/>
+    <w:bookmarkStart w:id="140" w:name="c_extensiones_1"/>
     <w:p>
       <w:pPr>
         <w:pStyle w:val="Heading4"/>
@@ -26559,12 +26562,12 @@
         <w:t xml:space="preserve">Recapitulando</w:t>
       </w:r>
       <w:r>
-        <w:t xml:space="preserve">: cuando no se puede tener lo mejor, acercarse a ello por partes no es necesariamente lo bueno. Pasamos a ver dónde se aplica esta idea.</w:t>
-      </w:r>
-    </w:p>
+        <w:t xml:space="preserve">: cuando no se puede alcanzar el óptimo, acercarse a él por partes no garantiza mejorar. Pasamos a ver dónde se aplica esta idea.</w:t>
+      </w:r>
+    </w:p>
+    <w:bookmarkEnd w:id="140"/>
     <w:bookmarkEnd w:id="141"/>
-    <w:bookmarkEnd w:id="142"/>
-    <w:bookmarkStart w:id="150" w:name="sec_second_best_aplicaciones"/>
+    <w:bookmarkStart w:id="149" w:name="sec_second_best_aplicaciones"/>
     <w:p>
       <w:pPr>
         <w:pStyle w:val="Heading2"/>
@@ -26597,7 +26600,7 @@
       <w:r>
         <w:t xml:space="preserve"> </w:t>
       </w:r>
-      <w:hyperlink r:id="rId143">
+      <w:hyperlink r:id="rId142">
         <w:r>
           <w:rPr>
             <w:rStyle w:val="Referenciaatema"/>
@@ -26709,7 +26712,7 @@
         <w:rPr>
           <w:rStyle w:val="FootnoteReference"/>
         </w:rPr>
-        <w:footnoteReference w:id="144"/>
+        <w:footnoteReference w:id="143"/>
       </w:r>
     </w:p>
     <w:p>
@@ -26730,7 +26733,7 @@
       <w:r>
         <w:t xml:space="preserve"> </w:t>
       </w:r>
-      <w:hyperlink r:id="rId84">
+      <w:hyperlink r:id="rId83">
         <w:r>
           <w:rPr>
             <w:rStyle w:val="Referenciaatema"/>
@@ -26741,7 +26744,7 @@
       <w:r>
         <w:t xml:space="preserve"> </w:t>
       </w:r>
-      <w:hyperlink r:id="rId82">
+      <w:hyperlink r:id="rId81">
         <w:r>
           <w:rPr>
             <w:rStyle w:val="Referenciaatema"/>
@@ -27261,7 +27264,7 @@
       <w:r>
         <w:t xml:space="preserve"> </w:t>
       </w:r>
-      <w:hyperlink r:id="rId145">
+      <w:hyperlink r:id="rId144">
         <w:r>
           <w:rPr>
             <w:rStyle w:val="Referenciaatema"/>
@@ -27290,7 +27293,7 @@
       <w:r>
         <w:t xml:space="preserve"> </w:t>
       </w:r>
-      <w:hyperlink r:id="rId146">
+      <w:hyperlink r:id="rId145">
         <w:r>
           <w:rPr>
             <w:rStyle w:val="Referenciaatema"/>
@@ -27372,7 +27375,7 @@
       <w:r>
         <w:t xml:space="preserve"> </w:t>
       </w:r>
-      <w:hyperlink r:id="rId147">
+      <w:hyperlink r:id="rId146">
         <w:r>
           <w:rPr>
             <w:rStyle w:val="Referenciaatema"/>
@@ -27494,7 +27497,7 @@
       <w:r>
         <w:t xml:space="preserve"> </w:t>
       </w:r>
-      <w:hyperlink r:id="rId148">
+      <w:hyperlink r:id="rId147">
         <w:r>
           <w:rPr>
             <w:rStyle w:val="Referenciaatema"/>
@@ -27587,7 +27590,7 @@
       <w:r>
         <w:t xml:space="preserve"> </w:t>
       </w:r>
-      <w:hyperlink r:id="rId122">
+      <w:hyperlink r:id="rId121">
         <w:r>
           <w:rPr>
             <w:rStyle w:val="Referenciaatema"/>
@@ -27636,7 +27639,7 @@
       <w:r>
         <w:t xml:space="preserve"> </w:t>
       </w:r>
-      <w:hyperlink r:id="rId84">
+      <w:hyperlink r:id="rId83">
         <w:r>
           <w:rPr>
             <w:rStyle w:val="Referenciaatema"/>
@@ -27647,7 +27650,7 @@
       <w:r>
         <w:t xml:space="preserve"> </w:t>
       </w:r>
-      <w:hyperlink r:id="rId149">
+      <w:hyperlink r:id="rId148">
         <w:r>
           <w:rPr>
             <w:rStyle w:val="Referenciaatema"/>
@@ -27672,7 +27675,7 @@
       <w:r>
         <w:t xml:space="preserve"> </w:t>
       </w:r>
-      <w:hyperlink r:id="rId85">
+      <w:hyperlink r:id="rId84">
         <w:r>
           <w:rPr>
             <w:rStyle w:val="Referenciaatema"/>
@@ -27684,8 +27687,8 @@
         <w:t xml:space="preserve">.</w:t>
       </w:r>
     </w:p>
-    <w:bookmarkEnd w:id="150"/>
-    <w:bookmarkStart w:id="152" w:name="sec_second_best_informacion"/>
+    <w:bookmarkEnd w:id="149"/>
+    <w:bookmarkStart w:id="151" w:name="sec_second_best_informacion"/>
     <w:p>
       <w:pPr>
         <w:pStyle w:val="Heading2"/>
@@ -27796,7 +27799,7 @@
       <w:r>
         <w:t xml:space="preserve"> </w:t>
       </w:r>
-      <w:hyperlink r:id="rId88">
+      <w:hyperlink r:id="rId87">
         <w:r>
           <w:rPr>
             <w:rStyle w:val="Referenciaatema"/>
@@ -28088,7 +28091,7 @@
       <w:r>
         <w:t xml:space="preserve"> </w:t>
       </w:r>
-      <w:hyperlink r:id="rId75">
+      <w:hyperlink r:id="rId74">
         <w:r>
           <w:rPr>
             <w:rStyle w:val="Referenciaatema"/>
@@ -28219,7 +28222,7 @@
       <w:r>
         <w:t xml:space="preserve"> </w:t>
       </w:r>
-      <w:hyperlink r:id="rId82">
+      <w:hyperlink r:id="rId81">
         <w:r>
           <w:rPr>
             <w:rStyle w:val="Referenciaatema"/>
@@ -28354,7 +28357,7 @@
       <w:r>
         <w:t xml:space="preserve"> </w:t>
       </w:r>
-      <w:hyperlink r:id="rId66">
+      <w:hyperlink r:id="rId65">
         <w:r>
           <w:rPr>
             <w:rStyle w:val="Referenciaatema"/>
@@ -28523,7 +28526,7 @@
         <w:t xml:space="preserve">).</w:t>
       </w:r>
     </w:p>
-    <w:bookmarkStart w:id="151" w:name="tab_mecanismos"/>
+    <w:bookmarkStart w:id="150" w:name="tab_mecanismos"/>
     <w:p>
       <w:pPr>
         <w:pStyle w:val="TableCaption"/>
@@ -29052,7 +29055,7 @@
         </w:tc>
       </w:tr>
     </w:tbl>
-    <w:bookmarkEnd w:id="151"/>
+    <w:bookmarkEnd w:id="150"/>
     <w:p>
       <w:pPr>
         <w:pStyle w:val="BodyText"/>
@@ -29214,7 +29217,7 @@
       <w:r>
         <w:t xml:space="preserve"> </w:t>
       </w:r>
-      <w:hyperlink r:id="rId122">
+      <w:hyperlink r:id="rId121">
         <w:r>
           <w:rPr>
             <w:rStyle w:val="Referenciaatema"/>
@@ -29244,8 +29247,8 @@
         <w:t xml:space="preserve">: el segundo óptimo no es una anomalía, sino el caso general de la política económica: casi siempre hay alguna restricción que no se puede quitar, y la tarea es encontrar lo mejor dentro de ella.</w:t>
       </w:r>
     </w:p>
-    <w:bookmarkEnd w:id="152"/>
-    <w:bookmarkStart w:id="153" w:name="sec_second_best_valoracion"/>
+    <w:bookmarkEnd w:id="151"/>
+    <w:bookmarkStart w:id="152" w:name="sec_second_best_valoracion"/>
     <w:p>
       <w:pPr>
         <w:pStyle w:val="Heading2"/>
@@ -29347,52 +29350,7 @@
         <w:t xml:space="preserve">Exigencia de información</w:t>
       </w:r>
       <w:r>
-        <w:t xml:space="preserve">: el segundo óptimo depende de todas las relaciones de sustitución y de complementariedad de la economía, que el decisor rara vez conoce.</w:t>
-      </w:r>
-    </w:p>
-    <w:p>
-      <w:pPr>
-        <w:numPr>
-          <w:ilvl w:val="0"/>
-          <w:numId w:val="1091"/>
-        </w:numPr>
-      </w:pPr>
-      <w:r>
-        <w:rPr>
-          <w:i/>
-          <w:iCs/>
-        </w:rPr>
-        <w:t xml:space="preserve">El mapa imposible</w:t>
-      </w:r>
-      <w:r>
-        <w:t xml:space="preserve">: aplicar el teorema al pie de la letra exigiría un modelo con todas las interdependencias de la economía, y «un modelo que tomara en cuenta toda la diversidad de la realidad sería tan poco útil como un mapa a escala de uno a uno»</w:t>
-      </w:r>
-      <w:r>
-        <w:t xml:space="preserve"> </w:t>
-      </w:r>
-      <w:r>
-        <w:t xml:space="preserve">(</w:t>
-      </w:r>
-      <w:hyperlink w:anchor="ref_Robinson1962Essays">
-        <w:r>
-          <w:rPr>
-            <w:rStyle w:val="Hyperlink"/>
-            <w:smallCaps/>
-          </w:rPr>
-          <w:t xml:space="preserve">Robinson</w:t>
-        </w:r>
-        <w:r>
-          <w:rPr>
-            <w:rStyle w:val="Hyperlink"/>
-          </w:rPr>
-          <w:t xml:space="preserve">, 1962, 33</w:t>
-        </w:r>
-      </w:hyperlink>
-      <w:r>
-        <w:t xml:space="preserve">)</w:t>
-      </w:r>
-      <w:r>
-        <w:t xml:space="preserve">.</w:t>
+        <w:t xml:space="preserve">: el segundo óptimo depende de todas las relaciones de sustitución y de complementariedad de la economía, que el decisor rara vez conoce; aplicar el teorema al pie de la letra exigiría un modelo con todas las interdependencias, que sería inmanejable.</w:t>
       </w:r>
     </w:p>
     <w:p>
@@ -29463,7 +29421,7 @@
         <w:t xml:space="preserve"> </w:t>
       </w:r>
       <w:r>
-        <w:t xml:space="preserve">y el principio de corregir en el origen son formas de trabajar con mapas a escala;</w:t>
+        <w:t xml:space="preserve">y el principio de corregir en el origen son formas de simplificar el problema sin perder las interdependencias que importan;</w:t>
       </w:r>
     </w:p>
     <w:p>
@@ -29549,9 +29507,9 @@
         <w:t xml:space="preserve">siguen siendo la referencia, pero se persiguen todas a la vez o con conocimiento de cómo interactúan.</w:t>
       </w:r>
     </w:p>
+    <w:bookmarkEnd w:id="152"/>
     <w:bookmarkEnd w:id="153"/>
-    <w:bookmarkEnd w:id="154"/>
-    <w:bookmarkStart w:id="155" w:name="conclusi__n"/>
+    <w:bookmarkStart w:id="154" w:name="conclusi__n"/>
     <w:p>
       <w:pPr>
         <w:pStyle w:val="Heading1"/>
@@ -29709,7 +29667,7 @@
       <w:r>
         <w:t xml:space="preserve"> </w:t>
       </w:r>
-      <w:hyperlink r:id="rId82">
+      <w:hyperlink r:id="rId81">
         <w:r>
           <w:rPr>
             <w:rStyle w:val="Referenciaatema"/>
@@ -29749,7 +29707,7 @@
       <w:r>
         <w:t xml:space="preserve"> </w:t>
       </w:r>
-      <w:hyperlink r:id="rId66">
+      <w:hyperlink r:id="rId65">
         <w:r>
           <w:rPr>
             <w:rStyle w:val="Referenciaatema"/>
@@ -29763,7 +29721,7 @@
       <w:r>
         <w:t xml:space="preserve"> </w:t>
       </w:r>
-      <w:hyperlink r:id="rId122">
+      <w:hyperlink r:id="rId121">
         <w:r>
           <w:rPr>
             <w:rStyle w:val="Referenciaatema"/>
@@ -29777,7 +29735,7 @@
       <w:r>
         <w:t xml:space="preserve"> </w:t>
       </w:r>
-      <w:hyperlink r:id="rId75">
+      <w:hyperlink r:id="rId74">
         <w:r>
           <w:rPr>
             <w:rStyle w:val="Referenciaatema"/>
@@ -29899,7 +29857,7 @@
         <w:t xml:space="preserve">)</w:t>
       </w:r>
       <w:r>
-        <w:t xml:space="preserve">. Entre los 2 está la respuesta a la pregunta del principio: el mercado competitivo asigna bien cuando se cumplen todas las condiciones, y cuando no, lo mejor es enemigo de lo bueno si se persigue a ciegas; pero sin saber cuál es lo mejor tampoco se puede encontrar lo bueno.</w:t>
+        <w:t xml:space="preserve">. Entre los 2 está la respuesta a la pregunta del principio: el mercado competitivo asigna bien cuando se cumplen todas las condiciones, y cuando no, no hay mal que por bien no venga: una distorsión bien elegida puede compensar otra que no se puede quitar, pero solo quien sabe cuál es el óptimo sabe qué mal trae un bien.</w:t>
       </w:r>
     </w:p>
     <w:p>
@@ -29917,8 +29875,8 @@
         </w:sectPr>
       </w:pPr>
     </w:p>
-    <w:bookmarkEnd w:id="155"/>
-    <w:bookmarkStart w:id="183" w:name="anexo_compensacion"/>
+    <w:bookmarkEnd w:id="154"/>
+    <w:bookmarkStart w:id="182" w:name="anexo_compensacion"/>
     <w:p>
       <w:pPr>
         <w:pStyle w:val="Heading1"/>
@@ -29961,7 +29919,7 @@
         <w:t xml:space="preserve">). Han salido del título del tema en la convocatoria de 2023, pero se recogen aquí por si el tribunal pregunta y porque el análisis coste-beneficio los aplica.</w:t>
       </w:r>
     </w:p>
-    <w:bookmarkStart w:id="156" w:name="idea"/>
+    <w:bookmarkStart w:id="155" w:name="idea"/>
     <w:p>
       <w:pPr>
         <w:pStyle w:val="Heading4"/>
@@ -30119,8 +30077,8 @@
         <w:t xml:space="preserve">Se trabaja en el espacio de las utilidades: cada situación, que corresponde a una producción eficiente distinta, tiene su FPU.</w:t>
       </w:r>
     </w:p>
-    <w:bookmarkEnd w:id="156"/>
-    <w:bookmarkStart w:id="180" w:name="los_criterios"/>
+    <w:bookmarkEnd w:id="155"/>
+    <w:bookmarkStart w:id="179" w:name="los_criterios"/>
     <w:p>
       <w:pPr>
         <w:pStyle w:val="Heading4"/>
@@ -30610,7 +30568,7 @@
         <w:rPr>
           <w:rStyle w:val="FootnoteReference"/>
         </w:rPr>
-        <w:footnoteReference w:id="157"/>
+        <w:footnoteReference w:id="156"/>
       </w:r>
     </w:p>
     <w:p>
@@ -30975,7 +30933,7 @@
         <w:t xml:space="preserve">lo evita.</w:t>
       </w:r>
     </w:p>
-    <w:bookmarkStart w:id="161" w:name="fig_compensacion_kaldor"/>
+    <w:bookmarkStart w:id="160" w:name="fig_compensacion_kaldor"/>
     <w:p>
       <w:pPr>
         <w:pStyle w:val="ImageCaption"/>
@@ -31011,18 +30969,18 @@
           <wp:inline>
             <wp:extent cx="2550533" cy="2461846"/>
             <wp:effectExtent b="0" l="0" r="0" t="0"/>
-            <wp:docPr descr="Gráfico 10.– Criterio de compensación de Kaldor: desde el estado final, una redistribución por la FPU del estado final deja a todos mejor que en el inicial" title="" id="159" name="Picture"/>
+            <wp:docPr descr="Gráfico 10.– Criterio de compensación de Kaldor: desde el estado final, una redistribución por la FPU del estado final deja a todos mejor que en el inicial" title="" id="158" name="Picture"/>
             <a:graphic>
               <a:graphicData uri="http://schemas.openxmlformats.org/drawingml/2006/picture">
                 <pic:pic>
                   <pic:nvPicPr>
-                    <pic:cNvPr descr="C:\Users\vgutierrez\Documents\src\victorgutierrezmarcos.github.io-revision\oposicion\temario\fuentes\3A22\graficos/compensacion-kaldor.png" id="160" name="Picture"/>
+                    <pic:cNvPr descr="C:\Users\vgutierrez\Documents\src\victorgutierrezmarcos.github.io-revision\oposicion\temario\fuentes\3A22\graficos/compensacion-kaldor.png" id="159" name="Picture"/>
                     <pic:cNvPicPr>
                       <a:picLocks noChangeArrowheads="1" noChangeAspect="1"/>
                     </pic:cNvPicPr>
                   </pic:nvPicPr>
                   <pic:blipFill>
-                    <a:blip r:embed="rId158"/>
+                    <a:blip r:embed="rId157"/>
                     <a:stretch>
                       <a:fillRect/>
                     </a:stretch>
@@ -31049,7 +31007,7 @@
         </w:drawing>
       </w:r>
     </w:p>
-    <w:bookmarkEnd w:id="161"/>
+    <w:bookmarkEnd w:id="160"/>
     <w:p>
       <w:pPr>
         <w:pStyle w:val="Piedeimagen"/>
@@ -31087,7 +31045,7 @@
         <w:t xml:space="preserve">.</w:t>
       </w:r>
     </w:p>
-    <w:bookmarkStart w:id="165" w:name="fig_compensacion_hicks"/>
+    <w:bookmarkStart w:id="164" w:name="fig_compensacion_hicks"/>
     <w:p>
       <w:pPr>
         <w:pStyle w:val="ImageCaption"/>
@@ -31123,18 +31081,18 @@
           <wp:inline>
             <wp:extent cx="2550533" cy="2461846"/>
             <wp:effectExtent b="0" l="0" r="0" t="0"/>
-            <wp:docPr descr="Gráfico 11.– Criterio de compensación de Hicks: desde el estado inicial, los perdedores no pueden sobornar a los ganadores" title="" id="163" name="Picture"/>
+            <wp:docPr descr="Gráfico 11.– Criterio de compensación de Hicks: desde el estado inicial, los perdedores no pueden sobornar a los ganadores" title="" id="162" name="Picture"/>
             <a:graphic>
               <a:graphicData uri="http://schemas.openxmlformats.org/drawingml/2006/picture">
                 <pic:pic>
                   <pic:nvPicPr>
-                    <pic:cNvPr descr="C:\Users\vgutierrez\Documents\src\victorgutierrezmarcos.github.io-revision\oposicion\temario\fuentes\3A22\graficos/compensacion-hicks.png" id="164" name="Picture"/>
+                    <pic:cNvPr descr="C:\Users\vgutierrez\Documents\src\victorgutierrezmarcos.github.io-revision\oposicion\temario\fuentes\3A22\graficos/compensacion-hicks.png" id="163" name="Picture"/>
                     <pic:cNvPicPr>
                       <a:picLocks noChangeArrowheads="1" noChangeAspect="1"/>
                     </pic:cNvPicPr>
                   </pic:nvPicPr>
                   <pic:blipFill>
-                    <a:blip r:embed="rId162"/>
+                    <a:blip r:embed="rId161"/>
                     <a:stretch>
                       <a:fillRect/>
                     </a:stretch>
@@ -31161,7 +31119,7 @@
         </w:drawing>
       </w:r>
     </w:p>
-    <w:bookmarkEnd w:id="165"/>
+    <w:bookmarkEnd w:id="164"/>
     <w:p>
       <w:pPr>
         <w:pStyle w:val="Piedeimagen"/>
@@ -31199,7 +31157,7 @@
         <w:t xml:space="preserve">.</w:t>
       </w:r>
     </w:p>
-    <w:bookmarkStart w:id="169" w:name="fig_compensacion_scitovsky"/>
+    <w:bookmarkStart w:id="168" w:name="fig_compensacion_scitovsky"/>
     <w:p>
       <w:pPr>
         <w:pStyle w:val="ImageCaption"/>
@@ -31265,18 +31223,18 @@
           <wp:inline>
             <wp:extent cx="2550533" cy="2461846"/>
             <wp:effectExtent b="0" l="0" r="0" t="0"/>
-            <wp:docPr descr="Gráfico 12.– La paradoja de Scitovsky: con FPU que se cortan, los criterios de Kaldor y de Hicks pueden contradecirse" title="" id="167" name="Picture"/>
+            <wp:docPr descr="Gráfico 12.– La paradoja de Scitovsky: con FPU que se cortan, los criterios de Kaldor y de Hicks pueden contradecirse" title="" id="166" name="Picture"/>
             <a:graphic>
               <a:graphicData uri="http://schemas.openxmlformats.org/drawingml/2006/picture">
                 <pic:pic>
                   <pic:nvPicPr>
-                    <pic:cNvPr descr="C:\Users\vgutierrez\Documents\src\victorgutierrezmarcos.github.io-revision\oposicion\temario\fuentes\3A22\graficos/compensacion-scitovsky.png" id="168" name="Picture"/>
+                    <pic:cNvPr descr="C:\Users\vgutierrez\Documents\src\victorgutierrezmarcos.github.io-revision\oposicion\temario\fuentes\3A22\graficos/compensacion-scitovsky.png" id="167" name="Picture"/>
                     <pic:cNvPicPr>
                       <a:picLocks noChangeArrowheads="1" noChangeAspect="1"/>
                     </pic:cNvPicPr>
                   </pic:nvPicPr>
                   <pic:blipFill>
-                    <a:blip r:embed="rId166"/>
+                    <a:blip r:embed="rId165"/>
                     <a:stretch>
                       <a:fillRect/>
                     </a:stretch>
@@ -31303,7 +31261,7 @@
         </w:drawing>
       </w:r>
     </w:p>
-    <w:bookmarkEnd w:id="169"/>
+    <w:bookmarkEnd w:id="168"/>
     <w:p>
       <w:pPr>
         <w:pStyle w:val="Piedeimagen"/>
@@ -31341,7 +31299,7 @@
         <w:t xml:space="preserve">.</w:t>
       </w:r>
     </w:p>
-    <w:bookmarkStart w:id="170" w:name="tab_compensacion_scitovsky"/>
+    <w:bookmarkStart w:id="169" w:name="tab_compensacion_scitovsky"/>
     <w:p>
       <w:pPr>
         <w:pStyle w:val="TableCaption"/>
@@ -32479,7 +32437,7 @@
         </w:tc>
       </w:tr>
     </w:tbl>
-    <w:bookmarkEnd w:id="170"/>
+    <w:bookmarkEnd w:id="169"/>
     <w:p>
       <w:pPr>
         <w:pStyle w:val="BodyText"/>
@@ -32492,7 +32450,7 @@
         <w:t xml:space="preserve">Fuente: elaboración propia.</w:t>
       </w:r>
     </w:p>
-    <w:bookmarkStart w:id="174" w:name="fig_compensacion_little"/>
+    <w:bookmarkStart w:id="173" w:name="fig_compensacion_little"/>
     <w:p>
       <w:pPr>
         <w:pStyle w:val="ImageCaption"/>
@@ -32528,18 +32486,18 @@
           <wp:inline>
             <wp:extent cx="4178300" cy="2579373"/>
             <wp:effectExtent b="0" l="0" r="0" t="0"/>
-            <wp:docPr descr="Gráfico 13.– Criterio dual de Little: además del doble criterio, la distribución no debe empeorar" title="" id="172" name="Picture"/>
+            <wp:docPr descr="Gráfico 13.– Criterio dual de Little: además del doble criterio, la distribución no debe empeorar" title="" id="171" name="Picture"/>
             <a:graphic>
               <a:graphicData uri="http://schemas.openxmlformats.org/drawingml/2006/picture">
                 <pic:pic>
                   <pic:nvPicPr>
-                    <pic:cNvPr descr="C:\Users\vgutierrez\Documents\src\victorgutierrezmarcos.github.io-revision\oposicion\temario\fuentes\3A22\graficos/compensacion-little.png" id="173" name="Picture"/>
+                    <pic:cNvPr descr="C:\Users\vgutierrez\Documents\src\victorgutierrezmarcos.github.io-revision\oposicion\temario\fuentes\3A22\graficos/compensacion-little.png" id="172" name="Picture"/>
                     <pic:cNvPicPr>
                       <a:picLocks noChangeArrowheads="1" noChangeAspect="1"/>
                     </pic:cNvPicPr>
                   </pic:nvPicPr>
                   <pic:blipFill>
-                    <a:blip r:embed="rId171"/>
+                    <a:blip r:embed="rId170"/>
                     <a:stretch>
                       <a:fillRect/>
                     </a:stretch>
@@ -32566,7 +32524,7 @@
         </w:drawing>
       </w:r>
     </w:p>
-    <w:bookmarkEnd w:id="174"/>
+    <w:bookmarkEnd w:id="173"/>
     <w:p>
       <w:pPr>
         <w:pStyle w:val="Piedeimagen"/>
@@ -32604,7 +32562,7 @@
         <w:t xml:space="preserve">.</w:t>
       </w:r>
     </w:p>
-    <w:bookmarkStart w:id="175" w:name="tab_compensacion_little"/>
+    <w:bookmarkStart w:id="174" w:name="tab_compensacion_little"/>
     <w:p>
       <w:pPr>
         <w:pStyle w:val="TableCaption"/>
@@ -33541,7 +33499,7 @@
         </w:tc>
       </w:tr>
     </w:tbl>
-    <w:bookmarkEnd w:id="175"/>
+    <w:bookmarkEnd w:id="174"/>
     <w:p>
       <w:pPr>
         <w:pStyle w:val="BodyText"/>
@@ -33576,7 +33534,7 @@
         <w:t xml:space="preserve">: nadie empeora y al menos uno mejora.</w:t>
       </w:r>
     </w:p>
-    <w:bookmarkStart w:id="179" w:name="fig_compensacion_samuelson"/>
+    <w:bookmarkStart w:id="178" w:name="fig_compensacion_samuelson"/>
     <w:p>
       <w:pPr>
         <w:pStyle w:val="ImageCaption"/>
@@ -33646,18 +33604,18 @@
           <wp:inline>
             <wp:extent cx="2550533" cy="2461846"/>
             <wp:effectExtent b="0" l="0" r="0" t="0"/>
-            <wp:docPr descr="Gráfico 14.– Criterio de Samuelson: la FPU_2 está entera por fuera de la FPU_1" title="" id="177" name="Picture"/>
+            <wp:docPr descr="Gráfico 14.– Criterio de Samuelson: la FPU_2 está entera por fuera de la FPU_1" title="" id="176" name="Picture"/>
             <a:graphic>
               <a:graphicData uri="http://schemas.openxmlformats.org/drawingml/2006/picture">
                 <pic:pic>
                   <pic:nvPicPr>
-                    <pic:cNvPr descr="C:\Users\vgutierrez\Documents\src\victorgutierrezmarcos.github.io-revision\oposicion\temario\fuentes\3A22\graficos/compensacion-samuelson.png" id="178" name="Picture"/>
+                    <pic:cNvPr descr="C:\Users\vgutierrez\Documents\src\victorgutierrezmarcos.github.io-revision\oposicion\temario\fuentes\3A22\graficos/compensacion-samuelson.png" id="177" name="Picture"/>
                     <pic:cNvPicPr>
                       <a:picLocks noChangeArrowheads="1" noChangeAspect="1"/>
                     </pic:cNvPicPr>
                   </pic:nvPicPr>
                   <pic:blipFill>
-                    <a:blip r:embed="rId176"/>
+                    <a:blip r:embed="rId175"/>
                     <a:stretch>
                       <a:fillRect/>
                     </a:stretch>
@@ -33684,7 +33642,7 @@
         </w:drawing>
       </w:r>
     </w:p>
-    <w:bookmarkEnd w:id="179"/>
+    <w:bookmarkEnd w:id="178"/>
     <w:p>
       <w:pPr>
         <w:pStyle w:val="Piedeimagen"/>
@@ -33722,8 +33680,8 @@
         <w:t xml:space="preserve">.</w:t>
       </w:r>
     </w:p>
-    <w:bookmarkEnd w:id="180"/>
-    <w:bookmarkStart w:id="182" w:name="valoraci__n"/>
+    <w:bookmarkEnd w:id="179"/>
+    <w:bookmarkStart w:id="181" w:name="valoraci__n"/>
     <w:p>
       <w:pPr>
         <w:pStyle w:val="Heading4"/>
@@ -33776,7 +33734,7 @@
       <w:r>
         <w:t xml:space="preserve"> </w:t>
       </w:r>
-      <w:hyperlink r:id="rId29">
+      <w:hyperlink r:id="rId28">
         <w:r>
           <w:rPr>
             <w:rStyle w:val="Referenciaatema"/>
@@ -33892,7 +33850,7 @@
       <w:r>
         <w:t xml:space="preserve"> </w:t>
       </w:r>
-      <w:hyperlink r:id="rId23">
+      <w:hyperlink r:id="rId22">
         <w:r>
           <w:rPr>
             <w:rStyle w:val="Referenciaatema"/>
@@ -33906,7 +33864,7 @@
       <w:r>
         <w:t xml:space="preserve"> </w:t>
       </w:r>
-      <w:hyperlink r:id="rId66">
+      <w:hyperlink r:id="rId65">
         <w:r>
           <w:rPr>
             <w:rStyle w:val="Referenciaatema"/>
@@ -33964,7 +33922,7 @@
       <w:r>
         <w:t xml:space="preserve"> </w:t>
       </w:r>
-      <w:hyperlink r:id="rId181">
+      <w:hyperlink r:id="rId180">
         <w:r>
           <w:rPr>
             <w:rStyle w:val="Hyperlink"/>
@@ -34003,9 +33961,9 @@
         <w:t xml:space="preserve">.</w:t>
       </w:r>
     </w:p>
+    <w:bookmarkEnd w:id="181"/>
     <w:bookmarkEnd w:id="182"/>
-    <w:bookmarkEnd w:id="183"/>
-    <w:bookmarkStart w:id="188" w:name="anexo_curvas_contrato"/>
+    <w:bookmarkStart w:id="187" w:name="anexo_curvas_contrato"/>
     <w:p>
       <w:pPr>
         <w:pStyle w:val="Heading1"/>
@@ -34887,7 +34845,7 @@
         <w:t xml:space="preserve">.</w:t>
       </w:r>
     </w:p>
-    <w:bookmarkStart w:id="187" w:name="fig_curvas_contrato_especiales"/>
+    <w:bookmarkStart w:id="186" w:name="fig_curvas_contrato_especiales"/>
     <w:p>
       <w:pPr>
         <w:pStyle w:val="ImageCaption"/>
@@ -34911,18 +34869,18 @@
           <wp:inline>
             <wp:extent cx="4813597" cy="4241715"/>
             <wp:effectExtent b="0" l="0" r="0" t="0"/>
-            <wp:docPr descr="Gráfico 15.– Curvas de contrato especiales: sustitutivos perfectos, complementarios perfectos, casos mixtos y bienes distintos" title="" id="185" name="Picture"/>
+            <wp:docPr descr="Gráfico 15.– Curvas de contrato especiales: sustitutivos perfectos, complementarios perfectos, casos mixtos y bienes distintos" title="" id="184" name="Picture"/>
             <a:graphic>
               <a:graphicData uri="http://schemas.openxmlformats.org/drawingml/2006/picture">
                 <pic:pic>
                   <pic:nvPicPr>
-                    <pic:cNvPr descr="C:\Users\vgutierrez\Documents\src\victorgutierrezmarcos.github.io-revision\oposicion\temario\fuentes\3A22\graficos/curvas-contrato-especiales.png" id="186" name="Picture"/>
+                    <pic:cNvPr descr="C:\Users\vgutierrez\Documents\src\victorgutierrezmarcos.github.io-revision\oposicion\temario\fuentes\3A22\graficos/curvas-contrato-especiales.png" id="185" name="Picture"/>
                     <pic:cNvPicPr>
                       <a:picLocks noChangeArrowheads="1" noChangeAspect="1"/>
                     </pic:cNvPicPr>
                   </pic:nvPicPr>
                   <pic:blipFill>
-                    <a:blip r:embed="rId184"/>
+                    <a:blip r:embed="rId183"/>
                     <a:stretch>
                       <a:fillRect/>
                     </a:stretch>
@@ -34949,7 +34907,7 @@
         </w:drawing>
       </w:r>
     </w:p>
-    <w:bookmarkEnd w:id="187"/>
+    <w:bookmarkEnd w:id="186"/>
     <w:p>
       <w:pPr>
         <w:pStyle w:val="Piedeimagen"/>
@@ -34987,8 +34945,8 @@
         <w:t xml:space="preserve">.</w:t>
       </w:r>
     </w:p>
-    <w:bookmarkEnd w:id="188"/>
-    <w:bookmarkStart w:id="192" w:name="anexo_planificador_general"/>
+    <w:bookmarkEnd w:id="187"/>
+    <w:bookmarkStart w:id="191" w:name="anexo_planificador_general"/>
     <w:p>
       <w:pPr>
         <w:pStyle w:val="Heading1"/>
@@ -35039,7 +34997,7 @@
         <w:t xml:space="preserve">bienes</w:t>
       </w:r>
     </w:p>
-    <w:bookmarkStart w:id="189" w:name="anexo_planificador_pasos"/>
+    <w:bookmarkStart w:id="188" w:name="anexo_planificador_pasos"/>
     <w:p>
       <w:pPr>
         <w:pStyle w:val="Heading2"/>
@@ -37346,8 +37304,8 @@
         <w:t xml:space="preserve">).</w:t>
       </w:r>
     </w:p>
-    <w:bookmarkEnd w:id="189"/>
-    <w:bookmarkStart w:id="191" w:name="anexo_planificador_version_general"/>
+    <w:bookmarkEnd w:id="188"/>
+    <w:bookmarkStart w:id="190" w:name="anexo_planificador_version_general"/>
     <w:p>
       <w:pPr>
         <w:pStyle w:val="Heading2"/>
@@ -37672,7 +37630,7 @@
       <w:r>
         <w:t xml:space="preserve"> </w:t>
       </w:r>
-      <w:hyperlink r:id="rId34">
+      <w:hyperlink r:id="rId33">
         <w:r>
           <w:rPr>
             <w:rStyle w:val="Referenciaatema"/>
@@ -37700,7 +37658,7 @@
       <w:r>
         <w:t xml:space="preserve"> </w:t>
       </w:r>
-      <w:hyperlink r:id="rId26">
+      <w:hyperlink r:id="rId25">
         <w:r>
           <w:rPr>
             <w:rStyle w:val="Referenciaatema"/>
@@ -37732,8 +37690,8 @@
       <w:r>
         <w:t xml:space="preserve"> </w:t>
       </w:r>
-      <w:bookmarkStart w:id="190" w:name="eq_planificador_general"/>
-      <w:bookmarkEnd w:id="190"/>
+      <w:bookmarkStart w:id="189" w:name="eq_planificador_general"/>
+      <w:bookmarkEnd w:id="189"/>
     </w:p>
     <w:p>
       <w:pPr>
@@ -39182,9 +39140,9 @@
         <w:t xml:space="preserve">), con los consumidores dueños solo de los factores.</w:t>
       </w:r>
     </w:p>
+    <w:bookmarkEnd w:id="190"/>
     <w:bookmarkEnd w:id="191"/>
-    <w:bookmarkEnd w:id="192"/>
-    <w:bookmarkStart w:id="195" w:name="anexo_demostraciones"/>
+    <w:bookmarkStart w:id="194" w:name="anexo_demostraciones"/>
     <w:p>
       <w:pPr>
         <w:pStyle w:val="Heading1"/>
@@ -39449,7 +39407,7 @@
         <w:t xml:space="preserve">.</w:t>
       </w:r>
     </w:p>
-    <w:bookmarkStart w:id="193" w:name="anexo_demostracion_primero"/>
+    <w:bookmarkStart w:id="192" w:name="anexo_demostracion_primero"/>
     <w:p>
       <w:pPr>
         <w:pStyle w:val="Heading2"/>
@@ -41637,8 +41595,8 @@
         <w:t xml:space="preserve">: ni convexidad ni diferenciabilidad. Sí que todos los bienes tienen precio y que los precios son comunes: si un bien no tuviera precio, como una externalidad, el paso 5 no recogería su coste.</w:t>
       </w:r>
     </w:p>
-    <w:bookmarkEnd w:id="193"/>
-    <w:bookmarkStart w:id="194" w:name="anexo_demostracion_segundo"/>
+    <w:bookmarkEnd w:id="192"/>
+    <w:bookmarkStart w:id="193" w:name="anexo_demostracion_segundo"/>
     <w:p>
       <w:pPr>
         <w:pStyle w:val="Heading2"/>
@@ -44378,9 +44336,9 @@
         <w:t xml:space="preserve">. Sin esa condición, un consumidor sin renta en el lado de la caja puede no estar maximizando su utilidad, aunque nadie le venda nada más barato.</w:t>
       </w:r>
     </w:p>
+    <w:bookmarkEnd w:id="193"/>
     <w:bookmarkEnd w:id="194"/>
-    <w:bookmarkEnd w:id="195"/>
-    <w:bookmarkStart w:id="196" w:name="anexo_second_best_analitico"/>
+    <w:bookmarkStart w:id="195" w:name="anexo_second_best_analitico"/>
     <w:p>
       <w:pPr>
         <w:pStyle w:val="Heading1"/>
@@ -46493,8 +46451,8 @@
         <w:t xml:space="preserve">. ∎</w:t>
       </w:r>
     </w:p>
-    <w:bookmarkEnd w:id="196"/>
-    <w:bookmarkStart w:id="197" w:name="anexo_bloque"/>
+    <w:bookmarkEnd w:id="195"/>
+    <w:bookmarkStart w:id="196" w:name="anexo_bloque"/>
     <w:p>
       <w:pPr>
         <w:pStyle w:val="Heading1"/>
@@ -46520,7 +46478,7 @@
       <w:r>
         <w:t xml:space="preserve"> </w:t>
       </w:r>
-      <w:hyperlink r:id="rId83">
+      <w:hyperlink r:id="rId82">
         <w:r>
           <w:rPr>
             <w:rStyle w:val="Referenciaatema"/>
@@ -46549,7 +46507,7 @@
       <w:r>
         <w:t xml:space="preserve"> </w:t>
       </w:r>
-      <w:hyperlink r:id="rId26">
+      <w:hyperlink r:id="rId25">
         <w:r>
           <w:rPr>
             <w:rStyle w:val="Referenciaatema"/>
@@ -46647,7 +46605,7 @@
       <w:r>
         <w:t xml:space="preserve"> </w:t>
       </w:r>
-      <w:hyperlink r:id="rId82">
+      <w:hyperlink r:id="rId81">
         <w:r>
           <w:rPr>
             <w:rStyle w:val="Referenciaatema"/>
@@ -46676,7 +46634,7 @@
       <w:r>
         <w:t xml:space="preserve"> </w:t>
       </w:r>
-      <w:hyperlink r:id="rId66">
+      <w:hyperlink r:id="rId65">
         <w:r>
           <w:rPr>
             <w:rStyle w:val="Referenciaatema"/>
@@ -46708,7 +46666,7 @@
       <w:r>
         <w:t xml:space="preserve"> </w:t>
       </w:r>
-      <w:hyperlink r:id="rId84">
+      <w:hyperlink r:id="rId83">
         <w:r>
           <w:rPr>
             <w:rStyle w:val="Referenciaatema"/>
@@ -46719,7 +46677,7 @@
       <w:r>
         <w:t xml:space="preserve"> </w:t>
       </w:r>
-      <w:hyperlink r:id="rId145">
+      <w:hyperlink r:id="rId144">
         <w:r>
           <w:rPr>
             <w:rStyle w:val="Referenciaatema"/>
@@ -46733,7 +46691,7 @@
       <w:r>
         <w:t xml:space="preserve"> </w:t>
       </w:r>
-      <w:hyperlink r:id="rId88">
+      <w:hyperlink r:id="rId87">
         <w:r>
           <w:rPr>
             <w:rStyle w:val="Referenciaatema"/>
@@ -46747,7 +46705,7 @@
       <w:r>
         <w:t xml:space="preserve"> </w:t>
       </w:r>
-      <w:hyperlink r:id="rId75">
+      <w:hyperlink r:id="rId74">
         <w:r>
           <w:rPr>
             <w:rStyle w:val="Referenciaatema"/>
@@ -46759,8 +46717,8 @@
         <w:t xml:space="preserve">.</w:t>
       </w:r>
     </w:p>
-    <w:bookmarkEnd w:id="197"/>
-    <w:bookmarkStart w:id="200" w:name="anexo_test"/>
+    <w:bookmarkEnd w:id="196"/>
+    <w:bookmarkStart w:id="199" w:name="anexo_test"/>
     <w:p>
       <w:pPr>
         <w:pStyle w:val="Heading1"/>
@@ -46780,7 +46738,7 @@
       <w:r>
         <w:t xml:space="preserve"> </w:t>
       </w:r>
-      <w:hyperlink r:id="rId198">
+      <w:hyperlink r:id="rId197">
         <w:r>
           <w:rPr>
             <w:rStyle w:val="Hyperlink"/>
@@ -47506,7 +47464,7 @@
         <w:t xml:space="preserve">: con una condición imposible, las demás dejan en general de ser deseables; no es lo mismo que el óptimo restringido de la información asimétrica.</w:t>
       </w:r>
     </w:p>
-    <w:bookmarkStart w:id="199" w:name="preguntas_probables_del_tribunal"/>
+    <w:bookmarkStart w:id="198" w:name="preguntas_probables_del_tribunal"/>
     <w:p>
       <w:pPr>
         <w:pStyle w:val="Heading4"/>
@@ -47685,9 +47643,9 @@
         </w:sectPr>
       </w:pPr>
     </w:p>
+    <w:bookmarkEnd w:id="198"/>
     <w:bookmarkEnd w:id="199"/>
-    <w:bookmarkEnd w:id="200"/>
-    <w:bookmarkStart w:id="337" w:name="bibliografia"/>
+    <w:bookmarkStart w:id="335" w:name="bibliografia"/>
     <w:p>
       <w:pPr>
         <w:pStyle w:val="Heading1"/>
@@ -47696,8 +47654,8 @@
         <w:t xml:space="preserve">Bibliografía</w:t>
       </w:r>
     </w:p>
-    <w:bookmarkStart w:id="336" w:name="refs"/>
-    <w:bookmarkStart w:id="201" w:name="ref_Akerlof1978Economics"/>
+    <w:bookmarkStart w:id="334" w:name="refs"/>
+    <w:bookmarkStart w:id="200" w:name="ref_Akerlof1978Economics"/>
     <w:p>
       <w:pPr>
         <w:pStyle w:val="Bibliography"/>
@@ -47731,8 +47689,8 @@
         <w:t xml:space="preserve">68 (1): 8-19.</w:t>
       </w:r>
     </w:p>
-    <w:bookmarkEnd w:id="201"/>
-    <w:bookmarkStart w:id="202" w:name="ref_Allais1943Recherche"/>
+    <w:bookmarkEnd w:id="200"/>
+    <w:bookmarkStart w:id="201" w:name="ref_Allais1943Recherche"/>
     <w:p>
       <w:pPr>
         <w:pStyle w:val="Bibliography"/>
@@ -47754,8 +47712,8 @@
         <w:t xml:space="preserve">. París.</w:t>
       </w:r>
     </w:p>
-    <w:bookmarkEnd w:id="202"/>
-    <w:bookmarkStart w:id="203" w:name="ref_Arrow1951Extension"/>
+    <w:bookmarkEnd w:id="201"/>
+    <w:bookmarkStart w:id="202" w:name="ref_Arrow1951Extension"/>
     <w:p>
       <w:pPr>
         <w:pStyle w:val="Bibliography"/>
@@ -47786,8 +47744,8 @@
         <w:t xml:space="preserve">, editado por Jerzy Neyman, 507-32. Berkeley: University of California Press.</w:t>
       </w:r>
     </w:p>
-    <w:bookmarkEnd w:id="203"/>
-    <w:bookmarkStart w:id="204" w:name="ref_Arrow1951Social"/>
+    <w:bookmarkEnd w:id="202"/>
+    <w:bookmarkStart w:id="203" w:name="ref_Arrow1951Social"/>
     <w:p>
       <w:pPr>
         <w:pStyle w:val="Bibliography"/>
@@ -47809,8 +47767,8 @@
         <w:t xml:space="preserve">. Cowles Commission Monograph 12. Nueva York: Wiley.</w:t>
       </w:r>
     </w:p>
-    <w:bookmarkEnd w:id="204"/>
-    <w:bookmarkStart w:id="205" w:name="ref_Arrow1979Property"/>
+    <w:bookmarkEnd w:id="203"/>
+    <w:bookmarkStart w:id="204" w:name="ref_Arrow1979Property"/>
     <w:p>
       <w:pPr>
         <w:pStyle w:val="Bibliography"/>
@@ -47841,8 +47799,8 @@
         <w:t xml:space="preserve">, editado por Michael J. Boskin, 23-39. Nueva York: Academic Press.</w:t>
       </w:r>
     </w:p>
-    <w:bookmarkEnd w:id="205"/>
-    <w:bookmarkStart w:id="207" w:name="ref_Atkinson2001Strange"/>
+    <w:bookmarkEnd w:id="204"/>
+    <w:bookmarkStart w:id="206" w:name="ref_Atkinson2001Strange"/>
     <w:p>
       <w:pPr>
         <w:pStyle w:val="Bibliography"/>
@@ -47878,7 +47836,7 @@
       <w:r>
         <w:t xml:space="preserve"> </w:t>
       </w:r>
-      <w:hyperlink r:id="rId206">
+      <w:hyperlink r:id="rId205">
         <w:r>
           <w:rPr>
             <w:rStyle w:val="Hyperlink"/>
@@ -47890,8 +47848,8 @@
         <w:t xml:space="preserve">.</w:t>
       </w:r>
     </w:p>
-    <w:bookmarkEnd w:id="207"/>
-    <w:bookmarkStart w:id="209" w:name="ref_Atkinson2011Restoration"/>
+    <w:bookmarkEnd w:id="206"/>
+    <w:bookmarkStart w:id="208" w:name="ref_Atkinson2011Restoration"/>
     <w:p>
       <w:pPr>
         <w:pStyle w:val="Bibliography"/>
@@ -47927,7 +47885,7 @@
       <w:r>
         <w:t xml:space="preserve"> </w:t>
       </w:r>
-      <w:hyperlink r:id="rId208">
+      <w:hyperlink r:id="rId207">
         <w:r>
           <w:rPr>
             <w:rStyle w:val="Hyperlink"/>
@@ -47939,8 +47897,8 @@
         <w:t xml:space="preserve">.</w:t>
       </w:r>
     </w:p>
-    <w:bookmarkEnd w:id="209"/>
-    <w:bookmarkStart w:id="210" w:name="ref_AtkinsonStiglitz1976Design"/>
+    <w:bookmarkEnd w:id="208"/>
+    <w:bookmarkStart w:id="209" w:name="ref_AtkinsonStiglitz1976Design"/>
     <w:p>
       <w:pPr>
         <w:pStyle w:val="Bibliography"/>
@@ -47974,8 +47932,8 @@
         <w:t xml:space="preserve">6 (1-2): 55-75.</w:t>
       </w:r>
     </w:p>
-    <w:bookmarkEnd w:id="210"/>
-    <w:bookmarkStart w:id="212" w:name="ref_BoT2026TomYumKung"/>
+    <w:bookmarkEnd w:id="209"/>
+    <w:bookmarkStart w:id="211" w:name="ref_BoT2026TomYumKung"/>
     <w:p>
       <w:pPr>
         <w:pStyle w:val="Bibliography"/>
@@ -47995,7 +47953,7 @@
       <w:r>
         <w:t xml:space="preserve"> </w:t>
       </w:r>
-      <w:hyperlink r:id="rId211">
+      <w:hyperlink r:id="rId210">
         <w:r>
           <w:rPr>
             <w:rStyle w:val="Hyperlink"/>
@@ -48007,8 +47965,8 @@
         <w:t xml:space="preserve">.</w:t>
       </w:r>
     </w:p>
-    <w:bookmarkEnd w:id="212"/>
-    <w:bookmarkStart w:id="213" w:name="ref_Barnett1980Pigouvian"/>
+    <w:bookmarkEnd w:id="211"/>
+    <w:bookmarkStart w:id="212" w:name="ref_Barnett1980Pigouvian"/>
     <w:p>
       <w:pPr>
         <w:pStyle w:val="Bibliography"/>
@@ -48042,8 +48000,8 @@
         <w:t xml:space="preserve">70 (5): 1037-41.</w:t>
       </w:r>
     </w:p>
-    <w:bookmarkEnd w:id="213"/>
-    <w:bookmarkStart w:id="214" w:name="ref_Bator1957Simple"/>
+    <w:bookmarkEnd w:id="212"/>
+    <w:bookmarkStart w:id="213" w:name="ref_Bator1957Simple"/>
     <w:p>
       <w:pPr>
         <w:pStyle w:val="Bibliography"/>
@@ -48077,8 +48035,8 @@
         <w:t xml:space="preserve">47 (1): 22-59.</w:t>
       </w:r>
     </w:p>
-    <w:bookmarkEnd w:id="214"/>
-    <w:bookmarkStart w:id="215" w:name="ref_Bentham1789Introduction"/>
+    <w:bookmarkEnd w:id="213"/>
+    <w:bookmarkStart w:id="214" w:name="ref_Bentham1789Introduction"/>
     <w:p>
       <w:pPr>
         <w:pStyle w:val="Bibliography"/>
@@ -48100,8 +48058,8 @@
         <w:t xml:space="preserve">. Londres: T. Payne; Son.</w:t>
       </w:r>
     </w:p>
-    <w:bookmarkEnd w:id="215"/>
-    <w:bookmarkStart w:id="217" w:name="ref_Bergson1938Reformulation"/>
+    <w:bookmarkEnd w:id="214"/>
+    <w:bookmarkStart w:id="216" w:name="ref_Bergson1938Reformulation"/>
     <w:p>
       <w:pPr>
         <w:pStyle w:val="Bibliography"/>
@@ -48137,7 +48095,7 @@
       <w:r>
         <w:t xml:space="preserve"> </w:t>
       </w:r>
-      <w:hyperlink r:id="rId216">
+      <w:hyperlink r:id="rId215">
         <w:r>
           <w:rPr>
             <w:rStyle w:val="Hyperlink"/>
@@ -48149,8 +48107,8 @@
         <w:t xml:space="preserve">.</w:t>
       </w:r>
     </w:p>
-    <w:bookmarkEnd w:id="217"/>
-    <w:bookmarkStart w:id="218" w:name="ref_BhagwatiRamaswami1963Domestic"/>
+    <w:bookmarkEnd w:id="216"/>
+    <w:bookmarkStart w:id="217" w:name="ref_BhagwatiRamaswami1963Domestic"/>
     <w:p>
       <w:pPr>
         <w:pStyle w:val="Bibliography"/>
@@ -48184,8 +48142,8 @@
         <w:t xml:space="preserve">71 (1): 44-50.</w:t>
       </w:r>
     </w:p>
-    <w:bookmarkEnd w:id="218"/>
-    <w:bookmarkStart w:id="219" w:name="ref_Buchanan1969External"/>
+    <w:bookmarkEnd w:id="217"/>
+    <w:bookmarkStart w:id="218" w:name="ref_Buchanan1969External"/>
     <w:p>
       <w:pPr>
         <w:pStyle w:val="Bibliography"/>
@@ -48219,8 +48177,8 @@
         <w:t xml:space="preserve">59 (1): 174-77.</w:t>
       </w:r>
     </w:p>
-    <w:bookmarkEnd w:id="219"/>
-    <w:bookmarkStart w:id="221" w:name="ref_Clarke1971Multipart"/>
+    <w:bookmarkEnd w:id="218"/>
+    <w:bookmarkStart w:id="220" w:name="ref_Clarke1971Multipart"/>
     <w:p>
       <w:pPr>
         <w:pStyle w:val="Bibliography"/>
@@ -48256,7 +48214,7 @@
       <w:r>
         <w:t xml:space="preserve"> </w:t>
       </w:r>
-      <w:hyperlink r:id="rId220">
+      <w:hyperlink r:id="rId219">
         <w:r>
           <w:rPr>
             <w:rStyle w:val="Hyperlink"/>
@@ -48268,8 +48226,8 @@
         <w:t xml:space="preserve">.</w:t>
       </w:r>
     </w:p>
-    <w:bookmarkEnd w:id="221"/>
-    <w:bookmarkStart w:id="222" w:name="ref_CorlettHague1953Complementarity"/>
+    <w:bookmarkEnd w:id="220"/>
+    <w:bookmarkStart w:id="221" w:name="ref_CorlettHague1953Complementarity"/>
     <w:p>
       <w:pPr>
         <w:pStyle w:val="Bibliography"/>
@@ -48303,8 +48261,8 @@
         <w:t xml:space="preserve">21 (1): 21-30.</w:t>
       </w:r>
     </w:p>
-    <w:bookmarkEnd w:id="222"/>
-    <w:bookmarkStart w:id="223" w:name="ref_dAspremontGerardVaret1979Incentives"/>
+    <w:bookmarkEnd w:id="221"/>
+    <w:bookmarkStart w:id="222" w:name="ref_dAspremontGerardVaret1979Incentives"/>
     <w:p>
       <w:pPr>
         <w:pStyle w:val="Bibliography"/>
@@ -48338,8 +48296,8 @@
         <w:t xml:space="preserve">11 (1): 25-45.</w:t>
       </w:r>
     </w:p>
-    <w:bookmarkEnd w:id="223"/>
-    <w:bookmarkStart w:id="225" w:name="ref_DavisWhinston1965Welfare"/>
+    <w:bookmarkEnd w:id="222"/>
+    <w:bookmarkStart w:id="224" w:name="ref_DavisWhinston1965Welfare"/>
     <w:p>
       <w:pPr>
         <w:pStyle w:val="Bibliography"/>
@@ -48375,7 +48333,7 @@
       <w:r>
         <w:t xml:space="preserve"> </w:t>
       </w:r>
-      <w:hyperlink r:id="rId224">
+      <w:hyperlink r:id="rId223">
         <w:r>
           <w:rPr>
             <w:rStyle w:val="Hyperlink"/>
@@ -48387,8 +48345,8 @@
         <w:t xml:space="preserve">.</w:t>
       </w:r>
     </w:p>
-    <w:bookmarkEnd w:id="225"/>
-    <w:bookmarkStart w:id="227" w:name="ref_Debreu1951Coefficient"/>
+    <w:bookmarkEnd w:id="224"/>
+    <w:bookmarkStart w:id="226" w:name="ref_Debreu1951Coefficient"/>
     <w:p>
       <w:pPr>
         <w:pStyle w:val="Bibliography"/>
@@ -48424,7 +48382,7 @@
       <w:r>
         <w:t xml:space="preserve"> </w:t>
       </w:r>
-      <w:hyperlink r:id="rId226">
+      <w:hyperlink r:id="rId225">
         <w:r>
           <w:rPr>
             <w:rStyle w:val="Hyperlink"/>
@@ -48436,8 +48394,8 @@
         <w:t xml:space="preserve">.</w:t>
       </w:r>
     </w:p>
-    <w:bookmarkEnd w:id="227"/>
-    <w:bookmarkStart w:id="229" w:name="ref_Debreu1954Valuation"/>
+    <w:bookmarkEnd w:id="226"/>
+    <w:bookmarkStart w:id="228" w:name="ref_Debreu1954Valuation"/>
     <w:p>
       <w:pPr>
         <w:pStyle w:val="Bibliography"/>
@@ -48473,7 +48431,7 @@
       <w:r>
         <w:t xml:space="preserve"> </w:t>
       </w:r>
-      <w:hyperlink r:id="rId228">
+      <w:hyperlink r:id="rId227">
         <w:r>
           <w:rPr>
             <w:rStyle w:val="Hyperlink"/>
@@ -48485,8 +48443,8 @@
         <w:t xml:space="preserve">.</w:t>
       </w:r>
     </w:p>
-    <w:bookmarkEnd w:id="229"/>
-    <w:bookmarkStart w:id="231" w:name="ref_Debreu1959Theory"/>
+    <w:bookmarkEnd w:id="228"/>
+    <w:bookmarkStart w:id="230" w:name="ref_Debreu1959Theory"/>
     <w:p>
       <w:pPr>
         <w:pStyle w:val="Bibliography"/>
@@ -48510,7 +48468,7 @@
       <w:r>
         <w:t xml:space="preserve"> </w:t>
       </w:r>
-      <w:hyperlink r:id="rId230">
+      <w:hyperlink r:id="rId229">
         <w:r>
           <w:rPr>
             <w:rStyle w:val="Hyperlink"/>
@@ -48522,8 +48480,8 @@
         <w:t xml:space="preserve">.</w:t>
       </w:r>
     </w:p>
-    <w:bookmarkEnd w:id="231"/>
-    <w:bookmarkStart w:id="232" w:name="ref_DiamondMirrlees1971Optimal"/>
+    <w:bookmarkEnd w:id="230"/>
+    <w:bookmarkStart w:id="231" w:name="ref_DiamondMirrlees1971Optimal"/>
     <w:p>
       <w:pPr>
         <w:pStyle w:val="Bibliography"/>
@@ -48557,8 +48515,8 @@
         <w:t xml:space="preserve">61 (1): 8-27.</w:t>
       </w:r>
     </w:p>
-    <w:bookmarkEnd w:id="232"/>
-    <w:bookmarkStart w:id="233" w:name="ref_Dupuit1844Mesure"/>
+    <w:bookmarkEnd w:id="231"/>
+    <w:bookmarkStart w:id="232" w:name="ref_Dupuit1844Mesure"/>
     <w:p>
       <w:pPr>
         <w:pStyle w:val="Bibliography"/>
@@ -48589,8 +48547,8 @@
         <w:t xml:space="preserve">, 2.ª época, 8: 332-75.</w:t>
       </w:r>
     </w:p>
-    <w:bookmarkEnd w:id="233"/>
-    <w:bookmarkStart w:id="234" w:name="ref_Edgeworth1881Mathematical"/>
+    <w:bookmarkEnd w:id="232"/>
+    <w:bookmarkStart w:id="233" w:name="ref_Edgeworth1881Mathematical"/>
     <w:p>
       <w:pPr>
         <w:pStyle w:val="Bibliography"/>
@@ -48612,8 +48570,8 @@
         <w:t xml:space="preserve">. Londres: C. Kegan Paul.</w:t>
       </w:r>
     </w:p>
-    <w:bookmarkEnd w:id="234"/>
-    <w:bookmarkStart w:id="235" w:name="ref_Feldman1987Welfare"/>
+    <w:bookmarkEnd w:id="233"/>
+    <w:bookmarkStart w:id="234" w:name="ref_Feldman1987Welfare"/>
     <w:p>
       <w:pPr>
         <w:pStyle w:val="Bibliography"/>
@@ -48644,8 +48602,8 @@
         <w:t xml:space="preserve">, editado por John Eatwell, Murray Milgate y Peter Newman. Vol. 4. Londres: Macmillan.</w:t>
       </w:r>
     </w:p>
-    <w:bookmarkEnd w:id="235"/>
-    <w:bookmarkStart w:id="236" w:name="ref_Foley1967Resource"/>
+    <w:bookmarkEnd w:id="234"/>
+    <w:bookmarkStart w:id="235" w:name="ref_Foley1967Resource"/>
     <w:p>
       <w:pPr>
         <w:pStyle w:val="Bibliography"/>
@@ -48679,8 +48637,8 @@
         <w:t xml:space="preserve">7 (1): 45-98.</w:t>
       </w:r>
     </w:p>
-    <w:bookmarkEnd w:id="236"/>
-    <w:bookmarkStart w:id="238" w:name="ref_FMI1997HongKong"/>
+    <w:bookmarkEnd w:id="235"/>
+    <w:bookmarkStart w:id="237" w:name="ref_FMI1997HongKong"/>
     <w:p>
       <w:pPr>
         <w:pStyle w:val="Bibliography"/>
@@ -48700,7 +48658,7 @@
       <w:r>
         <w:t xml:space="preserve"> </w:t>
       </w:r>
-      <w:hyperlink r:id="rId237">
+      <w:hyperlink r:id="rId236">
         <w:r>
           <w:rPr>
             <w:rStyle w:val="Hyperlink"/>
@@ -48712,8 +48670,8 @@
         <w:t xml:space="preserve">.</w:t>
       </w:r>
     </w:p>
-    <w:bookmarkEnd w:id="238"/>
-    <w:bookmarkStart w:id="239" w:name="ref_HETParetoSocial"/>
+    <w:bookmarkEnd w:id="237"/>
+    <w:bookmarkStart w:id="238" w:name="ref_HETParetoSocial"/>
     <w:p>
       <w:pPr>
         <w:pStyle w:val="Bibliography"/>
@@ -48733,7 +48691,7 @@
       <w:r>
         <w:t xml:space="preserve"> </w:t>
       </w:r>
-      <w:hyperlink r:id="rId181">
+      <w:hyperlink r:id="rId180">
         <w:r>
           <w:rPr>
             <w:rStyle w:val="Hyperlink"/>
@@ -48745,8 +48703,8 @@
         <w:t xml:space="preserve">.</w:t>
       </w:r>
     </w:p>
-    <w:bookmarkEnd w:id="239"/>
-    <w:bookmarkStart w:id="241" w:name="ref_Gandolfo2014International"/>
+    <w:bookmarkEnd w:id="238"/>
+    <w:bookmarkStart w:id="240" w:name="ref_Gandolfo2014International"/>
     <w:p>
       <w:pPr>
         <w:pStyle w:val="Bibliography"/>
@@ -48770,7 +48728,7 @@
       <w:r>
         <w:t xml:space="preserve"> </w:t>
       </w:r>
-      <w:hyperlink r:id="rId240">
+      <w:hyperlink r:id="rId239">
         <w:r>
           <w:rPr>
             <w:rStyle w:val="Hyperlink"/>
@@ -48782,8 +48740,8 @@
         <w:t xml:space="preserve">.</w:t>
       </w:r>
     </w:p>
-    <w:bookmarkEnd w:id="241"/>
-    <w:bookmarkStart w:id="243" w:name="ref_Gibbard1973Manipulation"/>
+    <w:bookmarkEnd w:id="240"/>
+    <w:bookmarkStart w:id="242" w:name="ref_Gibbard1973Manipulation"/>
     <w:p>
       <w:pPr>
         <w:pStyle w:val="Bibliography"/>
@@ -48819,7 +48777,7 @@
       <w:r>
         <w:t xml:space="preserve"> </w:t>
       </w:r>
-      <w:hyperlink r:id="rId242">
+      <w:hyperlink r:id="rId241">
         <w:r>
           <w:rPr>
             <w:rStyle w:val="Hyperlink"/>
@@ -48831,8 +48789,8 @@
         <w:t xml:space="preserve">.</w:t>
       </w:r>
     </w:p>
-    <w:bookmarkEnd w:id="243"/>
-    <w:bookmarkStart w:id="245" w:name="ref_GodeSunder1993Allocative"/>
+    <w:bookmarkEnd w:id="242"/>
+    <w:bookmarkStart w:id="244" w:name="ref_GodeSunder1993Allocative"/>
     <w:p>
       <w:pPr>
         <w:pStyle w:val="Bibliography"/>
@@ -48868,7 +48826,7 @@
       <w:r>
         <w:t xml:space="preserve"> </w:t>
       </w:r>
-      <w:hyperlink r:id="rId244">
+      <w:hyperlink r:id="rId243">
         <w:r>
           <w:rPr>
             <w:rStyle w:val="Hyperlink"/>
@@ -48880,8 +48838,8 @@
         <w:t xml:space="preserve">.</w:t>
       </w:r>
     </w:p>
-    <w:bookmarkEnd w:id="245"/>
-    <w:bookmarkStart w:id="247" w:name="ref_Gorman1955Intransitivity"/>
+    <w:bookmarkEnd w:id="244"/>
+    <w:bookmarkStart w:id="246" w:name="ref_Gorman1955Intransitivity"/>
     <w:p>
       <w:pPr>
         <w:pStyle w:val="Bibliography"/>
@@ -48917,7 +48875,7 @@
       <w:r>
         <w:t xml:space="preserve"> </w:t>
       </w:r>
-      <w:hyperlink r:id="rId246">
+      <w:hyperlink r:id="rId245">
         <w:r>
           <w:rPr>
             <w:rStyle w:val="Hyperlink"/>
@@ -48929,8 +48887,8 @@
         <w:t xml:space="preserve">.</w:t>
       </w:r>
     </w:p>
-    <w:bookmarkEnd w:id="247"/>
-    <w:bookmarkStart w:id="248" w:name="ref_GravelleRees2004Microeconomics"/>
+    <w:bookmarkEnd w:id="246"/>
+    <w:bookmarkStart w:id="247" w:name="ref_GravelleRees2004Microeconomics"/>
     <w:p>
       <w:pPr>
         <w:pStyle w:val="Bibliography"/>
@@ -48952,8 +48910,8 @@
         <w:t xml:space="preserve">. 3.ª ed. Harlow: Financial Times/Prentice Hall.</w:t>
       </w:r>
     </w:p>
-    <w:bookmarkEnd w:id="248"/>
-    <w:bookmarkStart w:id="250" w:name="ref_GreenLaffont1977Characterization"/>
+    <w:bookmarkEnd w:id="247"/>
+    <w:bookmarkStart w:id="249" w:name="ref_GreenLaffont1977Characterization"/>
     <w:p>
       <w:pPr>
         <w:pStyle w:val="Bibliography"/>
@@ -48989,7 +48947,7 @@
       <w:r>
         <w:t xml:space="preserve"> </w:t>
       </w:r>
-      <w:hyperlink r:id="rId249">
+      <w:hyperlink r:id="rId248">
         <w:r>
           <w:rPr>
             <w:rStyle w:val="Hyperlink"/>
@@ -49001,8 +48959,8 @@
         <w:t xml:space="preserve">.</w:t>
       </w:r>
     </w:p>
-    <w:bookmarkEnd w:id="250"/>
-    <w:bookmarkStart w:id="252" w:name="ref_GreenwaldStiglitz1986Externalities"/>
+    <w:bookmarkEnd w:id="249"/>
+    <w:bookmarkStart w:id="251" w:name="ref_GreenwaldStiglitz1986Externalities"/>
     <w:p>
       <w:pPr>
         <w:pStyle w:val="Bibliography"/>
@@ -49038,7 +48996,7 @@
       <w:r>
         <w:t xml:space="preserve"> </w:t>
       </w:r>
-      <w:hyperlink r:id="rId251">
+      <w:hyperlink r:id="rId250">
         <w:r>
           <w:rPr>
             <w:rStyle w:val="Hyperlink"/>
@@ -49050,8 +49008,8 @@
         <w:t xml:space="preserve">.</w:t>
       </w:r>
     </w:p>
-    <w:bookmarkEnd w:id="252"/>
-    <w:bookmarkStart w:id="254" w:name="ref_Groves1973Incentives"/>
+    <w:bookmarkEnd w:id="251"/>
+    <w:bookmarkStart w:id="253" w:name="ref_Groves1973Incentives"/>
     <w:p>
       <w:pPr>
         <w:pStyle w:val="Bibliography"/>
@@ -49087,7 +49045,7 @@
       <w:r>
         <w:t xml:space="preserve"> </w:t>
       </w:r>
-      <w:hyperlink r:id="rId253">
+      <w:hyperlink r:id="rId252">
         <w:r>
           <w:rPr>
             <w:rStyle w:val="Hyperlink"/>
@@ -49099,8 +49057,8 @@
         <w:t xml:space="preserve">.</w:t>
       </w:r>
     </w:p>
-    <w:bookmarkEnd w:id="254"/>
-    <w:bookmarkStart w:id="256" w:name="ref_GuthSchmittbergerSchwarze1982U_53756"/>
+    <w:bookmarkEnd w:id="253"/>
+    <w:bookmarkStart w:id="255" w:name="ref_GuthSchmittbergerSchwarze1982U_53756"/>
     <w:p>
       <w:pPr>
         <w:pStyle w:val="Bibliography"/>
@@ -49136,7 +49094,7 @@
       <w:r>
         <w:t xml:space="preserve"> </w:t>
       </w:r>
-      <w:hyperlink r:id="rId255">
+      <w:hyperlink r:id="rId254">
         <w:r>
           <w:rPr>
             <w:rStyle w:val="Hyperlink"/>
@@ -49148,8 +49106,8 @@
         <w:t xml:space="preserve">.</w:t>
       </w:r>
     </w:p>
-    <w:bookmarkEnd w:id="256"/>
-    <w:bookmarkStart w:id="257" w:name="ref_Hart1975Optimality"/>
+    <w:bookmarkEnd w:id="255"/>
+    <w:bookmarkStart w:id="256" w:name="ref_Hart1975Optimality"/>
     <w:p>
       <w:pPr>
         <w:pStyle w:val="Bibliography"/>
@@ -49183,8 +49141,8 @@
         <w:t xml:space="preserve">11 (3): 418-43.</w:t>
       </w:r>
     </w:p>
-    <w:bookmarkEnd w:id="257"/>
-    <w:bookmarkStart w:id="258" w:name="ref_Hayek1945Use"/>
+    <w:bookmarkEnd w:id="256"/>
+    <w:bookmarkStart w:id="257" w:name="ref_Hayek1945Use"/>
     <w:p>
       <w:pPr>
         <w:pStyle w:val="Bibliography"/>
@@ -49218,8 +49176,8 @@
         <w:t xml:space="preserve">35 (4): 519-30.</w:t>
       </w:r>
     </w:p>
-    <w:bookmarkEnd w:id="258"/>
-    <w:bookmarkStart w:id="260" w:name="ref_Hicks1939Foundations"/>
+    <w:bookmarkEnd w:id="257"/>
+    <w:bookmarkStart w:id="259" w:name="ref_Hicks1939Foundations"/>
     <w:p>
       <w:pPr>
         <w:pStyle w:val="Bibliography"/>
@@ -49255,7 +49213,7 @@
       <w:r>
         <w:t xml:space="preserve"> </w:t>
       </w:r>
-      <w:hyperlink r:id="rId259">
+      <w:hyperlink r:id="rId258">
         <w:r>
           <w:rPr>
             <w:rStyle w:val="Hyperlink"/>
@@ -49267,8 +49225,8 @@
         <w:t xml:space="preserve">.</w:t>
       </w:r>
     </w:p>
-    <w:bookmarkEnd w:id="260"/>
-    <w:bookmarkStart w:id="262" w:name="ref_Hotelling1938General"/>
+    <w:bookmarkEnd w:id="259"/>
+    <w:bookmarkStart w:id="261" w:name="ref_Hotelling1938General"/>
     <w:p>
       <w:pPr>
         <w:pStyle w:val="Bibliography"/>
@@ -49304,7 +49262,7 @@
       <w:r>
         <w:t xml:space="preserve"> </w:t>
       </w:r>
-      <w:hyperlink r:id="rId261">
+      <w:hyperlink r:id="rId260">
         <w:r>
           <w:rPr>
             <w:rStyle w:val="Hyperlink"/>
@@ -49316,8 +49274,8 @@
         <w:t xml:space="preserve">.</w:t>
       </w:r>
     </w:p>
-    <w:bookmarkEnd w:id="262"/>
-    <w:bookmarkStart w:id="264" w:name="ref_HuertaDeSoto2004Eficiencia"/>
+    <w:bookmarkEnd w:id="261"/>
+    <w:bookmarkStart w:id="263" w:name="ref_HuertaDeSoto2004Eficiencia"/>
     <w:p>
       <w:pPr>
         <w:pStyle w:val="Bibliography"/>
@@ -49353,7 +49311,7 @@
       <w:r>
         <w:t xml:space="preserve"> </w:t>
       </w:r>
-      <w:hyperlink r:id="rId263">
+      <w:hyperlink r:id="rId262">
         <w:r>
           <w:rPr>
             <w:rStyle w:val="Hyperlink"/>
@@ -49365,8 +49323,8 @@
         <w:t xml:space="preserve">.</w:t>
       </w:r>
     </w:p>
-    <w:bookmarkEnd w:id="264"/>
-    <w:bookmarkStart w:id="265" w:name="ref_Hurwicz1972Informationally"/>
+    <w:bookmarkEnd w:id="263"/>
+    <w:bookmarkStart w:id="264" w:name="ref_Hurwicz1972Informationally"/>
     <w:p>
       <w:pPr>
         <w:pStyle w:val="Bibliography"/>
@@ -49397,8 +49355,8 @@
         <w:t xml:space="preserve">, editado por C. B. McGuire y Roy Radner, 297-336. Ámsterdam: North-Holland.</w:t>
       </w:r>
     </w:p>
-    <w:bookmarkEnd w:id="265"/>
-    <w:bookmarkStart w:id="267" w:name="ref_Inman1987Markets"/>
+    <w:bookmarkEnd w:id="264"/>
+    <w:bookmarkStart w:id="266" w:name="ref_Inman1987Markets"/>
     <w:p>
       <w:pPr>
         <w:pStyle w:val="Bibliography"/>
@@ -49431,7 +49389,7 @@
       <w:r>
         <w:t xml:space="preserve"> </w:t>
       </w:r>
-      <w:hyperlink r:id="rId266">
+      <w:hyperlink r:id="rId265">
         <w:r>
           <w:rPr>
             <w:rStyle w:val="Hyperlink"/>
@@ -49443,8 +49401,8 @@
         <w:t xml:space="preserve">.</w:t>
       </w:r>
     </w:p>
-    <w:bookmarkEnd w:id="267"/>
-    <w:bookmarkStart w:id="269" w:name="ref_BOE2020IDSD"/>
+    <w:bookmarkEnd w:id="266"/>
+    <w:bookmarkStart w:id="268" w:name="ref_BOE2020IDSD"/>
     <w:p>
       <w:pPr>
         <w:pStyle w:val="Bibliography"/>
@@ -49464,7 +49422,7 @@
       <w:r>
         <w:t xml:space="preserve"> </w:t>
       </w:r>
-      <w:hyperlink r:id="rId268">
+      <w:hyperlink r:id="rId267">
         <w:r>
           <w:rPr>
             <w:rStyle w:val="Hyperlink"/>
@@ -49476,8 +49434,8 @@
         <w:t xml:space="preserve">.</w:t>
       </w:r>
     </w:p>
-    <w:bookmarkEnd w:id="269"/>
-    <w:bookmarkStart w:id="270" w:name="ref_Jevons1871Theory"/>
+    <w:bookmarkEnd w:id="268"/>
+    <w:bookmarkStart w:id="269" w:name="ref_Jevons1871Theory"/>
     <w:p>
       <w:pPr>
         <w:pStyle w:val="Bibliography"/>
@@ -49499,8 +49457,8 @@
         <w:t xml:space="preserve">. Londres: Macmillan.</w:t>
       </w:r>
     </w:p>
-    <w:bookmarkEnd w:id="270"/>
-    <w:bookmarkStart w:id="272" w:name="ref_Kaldor1939Welfare"/>
+    <w:bookmarkEnd w:id="269"/>
+    <w:bookmarkStart w:id="271" w:name="ref_Kaldor1939Welfare"/>
     <w:p>
       <w:pPr>
         <w:pStyle w:val="Bibliography"/>
@@ -49536,7 +49494,7 @@
       <w:r>
         <w:t xml:space="preserve"> </w:t>
       </w:r>
-      <w:hyperlink r:id="rId271">
+      <w:hyperlink r:id="rId270">
         <w:r>
           <w:rPr>
             <w:rStyle w:val="Hyperlink"/>
@@ -49548,8 +49506,8 @@
         <w:t xml:space="preserve">.</w:t>
       </w:r>
     </w:p>
-    <w:bookmarkEnd w:id="272"/>
-    <w:bookmarkStart w:id="273" w:name="ref_Koutsoyiannis1979Modern"/>
+    <w:bookmarkEnd w:id="271"/>
+    <w:bookmarkStart w:id="272" w:name="ref_Koutsoyiannis1979Modern"/>
     <w:p>
       <w:pPr>
         <w:pStyle w:val="Bibliography"/>
@@ -49571,8 +49529,8 @@
         <w:t xml:space="preserve">. 2.ª ed. Londres: Macmillan.</w:t>
       </w:r>
     </w:p>
-    <w:bookmarkEnd w:id="273"/>
-    <w:bookmarkStart w:id="274" w:name="ref_Lange1936Socialism"/>
+    <w:bookmarkEnd w:id="272"/>
+    <w:bookmarkStart w:id="273" w:name="ref_Lange1936Socialism"/>
     <w:p>
       <w:pPr>
         <w:pStyle w:val="Bibliography"/>
@@ -49606,8 +49564,8 @@
         <w:t xml:space="preserve">4 (1): 53-71.</w:t>
       </w:r>
     </w:p>
-    <w:bookmarkEnd w:id="274"/>
-    <w:bookmarkStart w:id="276" w:name="ref_Lange1942Foundations"/>
+    <w:bookmarkEnd w:id="273"/>
+    <w:bookmarkStart w:id="275" w:name="ref_Lange1942Foundations"/>
     <w:p>
       <w:pPr>
         <w:pStyle w:val="Bibliography"/>
@@ -49643,7 +49601,7 @@
       <w:r>
         <w:t xml:space="preserve"> </w:t>
       </w:r>
-      <w:hyperlink r:id="rId275">
+      <w:hyperlink r:id="rId274">
         <w:r>
           <w:rPr>
             <w:rStyle w:val="Hyperlink"/>
@@ -49655,8 +49613,8 @@
         <w:t xml:space="preserve">.</w:t>
       </w:r>
     </w:p>
-    <w:bookmarkEnd w:id="276"/>
-    <w:bookmarkStart w:id="278" w:name="ref_Lerner1934Economic"/>
+    <w:bookmarkEnd w:id="275"/>
+    <w:bookmarkStart w:id="277" w:name="ref_Lerner1934Economic"/>
     <w:p>
       <w:pPr>
         <w:pStyle w:val="Bibliography"/>
@@ -49692,7 +49650,7 @@
       <w:r>
         <w:t xml:space="preserve"> </w:t>
       </w:r>
-      <w:hyperlink r:id="rId277">
+      <w:hyperlink r:id="rId276">
         <w:r>
           <w:rPr>
             <w:rStyle w:val="Hyperlink"/>
@@ -49704,8 +49662,8 @@
         <w:t xml:space="preserve">.</w:t>
       </w:r>
     </w:p>
-    <w:bookmarkEnd w:id="278"/>
-    <w:bookmarkStart w:id="279" w:name="ref_Lerner1944Economics"/>
+    <w:bookmarkEnd w:id="277"/>
+    <w:bookmarkStart w:id="278" w:name="ref_Lerner1944Economics"/>
     <w:p>
       <w:pPr>
         <w:pStyle w:val="Bibliography"/>
@@ -49727,8 +49685,8 @@
         <w:t xml:space="preserve">. Nueva York: Macmillan.</w:t>
       </w:r>
     </w:p>
-    <w:bookmarkEnd w:id="279"/>
-    <w:bookmarkStart w:id="280" w:name="ref_Lipsey1957Theory"/>
+    <w:bookmarkEnd w:id="278"/>
+    <w:bookmarkStart w:id="279" w:name="ref_Lipsey1957Theory"/>
     <w:p>
       <w:pPr>
         <w:pStyle w:val="Bibliography"/>
@@ -49762,8 +49720,8 @@
         <w:t xml:space="preserve">24 (93): 40-46.</w:t>
       </w:r>
     </w:p>
-    <w:bookmarkEnd w:id="280"/>
-    <w:bookmarkStart w:id="282" w:name="ref_Lipsey2007Reflections"/>
+    <w:bookmarkEnd w:id="279"/>
+    <w:bookmarkStart w:id="281" w:name="ref_Lipsey2007Reflections"/>
     <w:p>
       <w:pPr>
         <w:pStyle w:val="Bibliography"/>
@@ -49799,7 +49757,7 @@
       <w:r>
         <w:t xml:space="preserve"> </w:t>
       </w:r>
-      <w:hyperlink r:id="rId281">
+      <w:hyperlink r:id="rId280">
         <w:r>
           <w:rPr>
             <w:rStyle w:val="Hyperlink"/>
@@ -49811,8 +49769,8 @@
         <w:t xml:space="preserve">.</w:t>
       </w:r>
     </w:p>
-    <w:bookmarkEnd w:id="282"/>
-    <w:bookmarkStart w:id="284" w:name="ref_LipseyLancaster1956General"/>
+    <w:bookmarkEnd w:id="281"/>
+    <w:bookmarkStart w:id="283" w:name="ref_LipseyLancaster1956General"/>
     <w:p>
       <w:pPr>
         <w:pStyle w:val="Bibliography"/>
@@ -49848,7 +49806,7 @@
       <w:r>
         <w:t xml:space="preserve"> </w:t>
       </w:r>
-      <w:hyperlink r:id="rId283">
+      <w:hyperlink r:id="rId282">
         <w:r>
           <w:rPr>
             <w:rStyle w:val="Hyperlink"/>
@@ -49860,8 +49818,8 @@
         <w:t xml:space="preserve">.</w:t>
       </w:r>
     </w:p>
-    <w:bookmarkEnd w:id="284"/>
-    <w:bookmarkStart w:id="286" w:name="ref_Little1949Foundations"/>
+    <w:bookmarkEnd w:id="283"/>
+    <w:bookmarkStart w:id="285" w:name="ref_Little1949Foundations"/>
     <w:p>
       <w:pPr>
         <w:pStyle w:val="Bibliography"/>
@@ -49897,7 +49855,7 @@
       <w:r>
         <w:t xml:space="preserve"> </w:t>
       </w:r>
-      <w:hyperlink r:id="rId285">
+      <w:hyperlink r:id="rId284">
         <w:r>
           <w:rPr>
             <w:rStyle w:val="Hyperlink"/>
@@ -49909,8 +49867,8 @@
         <w:t xml:space="preserve">.</w:t>
       </w:r>
     </w:p>
-    <w:bookmarkEnd w:id="286"/>
-    <w:bookmarkStart w:id="287" w:name="ref_Little1950Critique"/>
+    <w:bookmarkEnd w:id="285"/>
+    <w:bookmarkStart w:id="286" w:name="ref_Little1950Critique"/>
     <w:p>
       <w:pPr>
         <w:pStyle w:val="Bibliography"/>
@@ -49932,8 +49890,8 @@
         <w:t xml:space="preserve">. Oxford: Clarendon Press.</w:t>
       </w:r>
     </w:p>
-    <w:bookmarkEnd w:id="287"/>
-    <w:bookmarkStart w:id="289" w:name="ref_Marshall1890Principles"/>
+    <w:bookmarkEnd w:id="286"/>
+    <w:bookmarkStart w:id="288" w:name="ref_Marshall1890Principles"/>
     <w:p>
       <w:pPr>
         <w:pStyle w:val="Bibliography"/>
@@ -49957,7 +49915,7 @@
       <w:r>
         <w:t xml:space="preserve"> </w:t>
       </w:r>
-      <w:hyperlink r:id="rId288">
+      <w:hyperlink r:id="rId287">
         <w:r>
           <w:rPr>
             <w:rStyle w:val="Hyperlink"/>
@@ -49969,8 +49927,8 @@
         <w:t xml:space="preserve">.</w:t>
       </w:r>
     </w:p>
-    <w:bookmarkEnd w:id="289"/>
-    <w:bookmarkStart w:id="290" w:name="ref_MasColellWhinstonGreen1995"/>
+    <w:bookmarkEnd w:id="288"/>
+    <w:bookmarkStart w:id="289" w:name="ref_MasColellWhinstonGreen1995"/>
     <w:p>
       <w:pPr>
         <w:pStyle w:val="Bibliography"/>
@@ -49992,8 +49950,8 @@
         <w:t xml:space="preserve">. Nueva York: Oxford University Press.</w:t>
       </w:r>
     </w:p>
-    <w:bookmarkEnd w:id="290"/>
-    <w:bookmarkStart w:id="291" w:name="ref_MatePerez2007Microeconomia"/>
+    <w:bookmarkEnd w:id="289"/>
+    <w:bookmarkStart w:id="290" w:name="ref_MatePerez2007Microeconomia"/>
     <w:p>
       <w:pPr>
         <w:pStyle w:val="Bibliography"/>
@@ -50015,8 +49973,8 @@
         <w:t xml:space="preserve">. Madrid: Pearson Prentice Hall.</w:t>
       </w:r>
     </w:p>
-    <w:bookmarkEnd w:id="291"/>
-    <w:bookmarkStart w:id="292" w:name="ref_Meade1955Customs"/>
+    <w:bookmarkEnd w:id="290"/>
+    <w:bookmarkStart w:id="291" w:name="ref_Meade1955Customs"/>
     <w:p>
       <w:pPr>
         <w:pStyle w:val="Bibliography"/>
@@ -50038,8 +49996,8 @@
         <w:t xml:space="preserve">. Ámsterdam: North-Holland.</w:t>
       </w:r>
     </w:p>
-    <w:bookmarkEnd w:id="292"/>
-    <w:bookmarkStart w:id="293" w:name="ref_Meade1955Trade"/>
+    <w:bookmarkEnd w:id="291"/>
+    <w:bookmarkStart w:id="292" w:name="ref_Meade1955Trade"/>
     <w:p>
       <w:pPr>
         <w:pStyle w:val="Bibliography"/>
@@ -50061,8 +50019,8 @@
         <w:t xml:space="preserve">. Vol. 2. The Theory of International Economic Policy. Londres: Oxford University Press.</w:t>
       </w:r>
     </w:p>
-    <w:bookmarkEnd w:id="293"/>
-    <w:bookmarkStart w:id="294" w:name="ref_Menger1871Grundsatze"/>
+    <w:bookmarkEnd w:id="292"/>
+    <w:bookmarkStart w:id="293" w:name="ref_Menger1871Grundsatze"/>
     <w:p>
       <w:pPr>
         <w:pStyle w:val="Bibliography"/>
@@ -50084,8 +50042,8 @@
         <w:t xml:space="preserve">. Viena: Wilhelm Braumüller.</w:t>
       </w:r>
     </w:p>
-    <w:bookmarkEnd w:id="294"/>
-    <w:bookmarkStart w:id="295" w:name="ref_Minkowski1911Theorie"/>
+    <w:bookmarkEnd w:id="293"/>
+    <w:bookmarkStart w:id="294" w:name="ref_Minkowski1911Theorie"/>
     <w:p>
       <w:pPr>
         <w:pStyle w:val="Bibliography"/>
@@ -50116,8 +50074,8 @@
         <w:t xml:space="preserve">, 2:131-229. Leipzig: Teubner.</w:t>
       </w:r>
     </w:p>
-    <w:bookmarkEnd w:id="295"/>
-    <w:bookmarkStart w:id="296" w:name="ref_Mirrlees1971Exploration"/>
+    <w:bookmarkEnd w:id="294"/>
+    <w:bookmarkStart w:id="295" w:name="ref_Mirrlees1971Exploration"/>
     <w:p>
       <w:pPr>
         <w:pStyle w:val="Bibliography"/>
@@ -50151,8 +50109,8 @@
         <w:t xml:space="preserve">38 (2): 175-208.</w:t>
       </w:r>
     </w:p>
-    <w:bookmarkEnd w:id="296"/>
-    <w:bookmarkStart w:id="298" w:name="ref_MyersonSatterthwaite1983Efficient"/>
+    <w:bookmarkEnd w:id="295"/>
+    <w:bookmarkStart w:id="297" w:name="ref_MyersonSatterthwaite1983Efficient"/>
     <w:p>
       <w:pPr>
         <w:pStyle w:val="Bibliography"/>
@@ -50188,7 +50146,7 @@
       <w:r>
         <w:t xml:space="preserve"> </w:t>
       </w:r>
-      <w:hyperlink r:id="rId297">
+      <w:hyperlink r:id="rId296">
         <w:r>
           <w:rPr>
             <w:rStyle w:val="Hyperlink"/>
@@ -50200,8 +50158,8 @@
         <w:t xml:space="preserve">.</w:t>
       </w:r>
     </w:p>
-    <w:bookmarkEnd w:id="298"/>
-    <w:bookmarkStart w:id="300" w:name="ref_OosterbeekSloofVandeKuilen2004_06775"/>
+    <w:bookmarkEnd w:id="297"/>
+    <w:bookmarkStart w:id="299" w:name="ref_OosterbeekSloofVandeKuilen2004_06775"/>
     <w:p>
       <w:pPr>
         <w:pStyle w:val="Bibliography"/>
@@ -50237,7 +50195,7 @@
       <w:r>
         <w:t xml:space="preserve"> </w:t>
       </w:r>
-      <w:hyperlink r:id="rId299">
+      <w:hyperlink r:id="rId298">
         <w:r>
           <w:rPr>
             <w:rStyle w:val="Hyperlink"/>
@@ -50249,8 +50207,8 @@
         <w:t xml:space="preserve">.</w:t>
       </w:r>
     </w:p>
-    <w:bookmarkEnd w:id="300"/>
-    <w:bookmarkStart w:id="301" w:name="ref_Pareto1906Manuale"/>
+    <w:bookmarkEnd w:id="299"/>
+    <w:bookmarkStart w:id="300" w:name="ref_Pareto1906Manuale"/>
     <w:p>
       <w:pPr>
         <w:pStyle w:val="Bibliography"/>
@@ -50272,8 +50230,8 @@
         <w:t xml:space="preserve">. Milán: Società Editrice Libraria.</w:t>
       </w:r>
     </w:p>
-    <w:bookmarkEnd w:id="301"/>
-    <w:bookmarkStart w:id="303" w:name="ref_UE2023CBAM"/>
+    <w:bookmarkEnd w:id="300"/>
+    <w:bookmarkStart w:id="302" w:name="ref_UE2023CBAM"/>
     <w:p>
       <w:pPr>
         <w:pStyle w:val="Bibliography"/>
@@ -50310,7 +50268,7 @@
       <w:r>
         <w:t xml:space="preserve"> </w:t>
       </w:r>
-      <w:hyperlink r:id="rId302">
+      <w:hyperlink r:id="rId301">
         <w:r>
           <w:rPr>
             <w:rStyle w:val="Hyperlink"/>
@@ -50322,8 +50280,8 @@
         <w:t xml:space="preserve">.</w:t>
       </w:r>
     </w:p>
-    <w:bookmarkEnd w:id="303"/>
-    <w:bookmarkStart w:id="305" w:name="ref_Pigou1920Economics"/>
+    <w:bookmarkEnd w:id="302"/>
+    <w:bookmarkStart w:id="304" w:name="ref_Pigou1920Economics"/>
     <w:p>
       <w:pPr>
         <w:pStyle w:val="Bibliography"/>
@@ -50347,7 +50305,7 @@
       <w:r>
         <w:t xml:space="preserve"> </w:t>
       </w:r>
-      <w:hyperlink r:id="rId304">
+      <w:hyperlink r:id="rId303">
         <w:r>
           <w:rPr>
             <w:rStyle w:val="Hyperlink"/>
@@ -50359,8 +50317,8 @@
         <w:t xml:space="preserve">.</w:t>
       </w:r>
     </w:p>
-    <w:bookmarkEnd w:id="305"/>
-    <w:bookmarkStart w:id="307" w:name="ref_Ramsey1927Contribution"/>
+    <w:bookmarkEnd w:id="304"/>
+    <w:bookmarkStart w:id="306" w:name="ref_Ramsey1927Contribution"/>
     <w:p>
       <w:pPr>
         <w:pStyle w:val="Bibliography"/>
@@ -50396,7 +50354,7 @@
       <w:r>
         <w:t xml:space="preserve"> </w:t>
       </w:r>
-      <w:hyperlink r:id="rId306">
+      <w:hyperlink r:id="rId305">
         <w:r>
           <w:rPr>
             <w:rStyle w:val="Hyperlink"/>
@@ -50408,14 +50366,23 @@
         <w:t xml:space="preserve">.</w:t>
       </w:r>
     </w:p>
-    <w:bookmarkEnd w:id="307"/>
-    <w:bookmarkStart w:id="308" w:name="ref_Robinson1962Essays"/>
+    <w:bookmarkEnd w:id="306"/>
+    <w:bookmarkStart w:id="308" w:name="ref_Rodrik2008Second"/>
     <w:p>
       <w:pPr>
         <w:pStyle w:val="Bibliography"/>
       </w:pPr>
       <w:r>
-        <w:t xml:space="preserve">Robinson, Joan (1962).</w:t>
+        <w:t xml:space="preserve">Rodrik, Dani (2008).</w:t>
+      </w:r>
+      <w:r>
+        <w:t xml:space="preserve"> </w:t>
+      </w:r>
+      <w:r>
+        <w:t xml:space="preserve">«Second-Best Institutions»</w:t>
+      </w:r>
+      <w:r>
+        <w:t xml:space="preserve">.</w:t>
       </w:r>
       <w:r>
         <w:t xml:space="preserve"> </w:t>
@@ -50425,38 +50392,6 @@
           <w:i/>
           <w:iCs/>
         </w:rPr>
-        <w:t xml:space="preserve">Essays in the Theory of Economic Growth</w:t>
-      </w:r>
-      <w:r>
-        <w:t xml:space="preserve">. Londres: Macmillan.</w:t>
-      </w:r>
-    </w:p>
-    <w:bookmarkEnd w:id="308"/>
-    <w:bookmarkStart w:id="310" w:name="ref_Rodrik2008Second"/>
-    <w:p>
-      <w:pPr>
-        <w:pStyle w:val="Bibliography"/>
-      </w:pPr>
-      <w:r>
-        <w:t xml:space="preserve">Rodrik, Dani (2008).</w:t>
-      </w:r>
-      <w:r>
-        <w:t xml:space="preserve"> </w:t>
-      </w:r>
-      <w:r>
-        <w:t xml:space="preserve">«Second-Best Institutions»</w:t>
-      </w:r>
-      <w:r>
-        <w:t xml:space="preserve">.</w:t>
-      </w:r>
-      <w:r>
-        <w:t xml:space="preserve"> </w:t>
-      </w:r>
-      <w:r>
-        <w:rPr>
-          <w:i/>
-          <w:iCs/>
-        </w:rPr>
         <w:t xml:space="preserve">American Economic Review</w:t>
       </w:r>
       <w:r>
@@ -50468,7 +50403,7 @@
       <w:r>
         <w:t xml:space="preserve"> </w:t>
       </w:r>
-      <w:hyperlink r:id="rId309">
+      <w:hyperlink r:id="rId307">
         <w:r>
           <w:rPr>
             <w:rStyle w:val="Hyperlink"/>
@@ -50480,8 +50415,8 @@
         <w:t xml:space="preserve">.</w:t>
       </w:r>
     </w:p>
-    <w:bookmarkEnd w:id="310"/>
-    <w:bookmarkStart w:id="311" w:name="ref_Samuelson1947Foundations"/>
+    <w:bookmarkEnd w:id="308"/>
+    <w:bookmarkStart w:id="309" w:name="ref_Samuelson1947Foundations"/>
     <w:p>
       <w:pPr>
         <w:pStyle w:val="Bibliography"/>
@@ -50503,8 +50438,8 @@
         <w:t xml:space="preserve">. Cambridge (Massachusetts): Harvard University Press.</w:t>
       </w:r>
     </w:p>
-    <w:bookmarkEnd w:id="311"/>
-    <w:bookmarkStart w:id="313" w:name="ref_Samuelson1950Evaluation"/>
+    <w:bookmarkEnd w:id="309"/>
+    <w:bookmarkStart w:id="311" w:name="ref_Samuelson1950Evaluation"/>
     <w:p>
       <w:pPr>
         <w:pStyle w:val="Bibliography"/>
@@ -50540,7 +50475,7 @@
       <w:r>
         <w:t xml:space="preserve"> </w:t>
       </w:r>
-      <w:hyperlink r:id="rId312">
+      <w:hyperlink r:id="rId310">
         <w:r>
           <w:rPr>
             <w:rStyle w:val="Hyperlink"/>
@@ -50552,8 +50487,8 @@
         <w:t xml:space="preserve">.</w:t>
       </w:r>
     </w:p>
-    <w:bookmarkEnd w:id="313"/>
-    <w:bookmarkStart w:id="315" w:name="ref_Satterthwaite1975Strategy"/>
+    <w:bookmarkEnd w:id="311"/>
+    <w:bookmarkStart w:id="313" w:name="ref_Satterthwaite1975Strategy"/>
     <w:p>
       <w:pPr>
         <w:pStyle w:val="Bibliography"/>
@@ -50589,7 +50524,7 @@
       <w:r>
         <w:t xml:space="preserve"> </w:t>
       </w:r>
-      <w:hyperlink r:id="rId314">
+      <w:hyperlink r:id="rId312">
         <w:r>
           <w:rPr>
             <w:rStyle w:val="Hyperlink"/>
@@ -50601,8 +50536,8 @@
         <w:t xml:space="preserve">.</w:t>
       </w:r>
     </w:p>
-    <w:bookmarkEnd w:id="315"/>
-    <w:bookmarkStart w:id="317" w:name="ref_Scitovsky1941Note"/>
+    <w:bookmarkEnd w:id="313"/>
+    <w:bookmarkStart w:id="315" w:name="ref_Scitovsky1941Note"/>
     <w:p>
       <w:pPr>
         <w:pStyle w:val="Bibliography"/>
@@ -50638,7 +50573,7 @@
       <w:r>
         <w:t xml:space="preserve"> </w:t>
       </w:r>
-      <w:hyperlink r:id="rId316">
+      <w:hyperlink r:id="rId314">
         <w:r>
           <w:rPr>
             <w:rStyle w:val="Hyperlink"/>
@@ -50650,8 +50585,8 @@
         <w:t xml:space="preserve">.</w:t>
       </w:r>
     </w:p>
-    <w:bookmarkEnd w:id="317"/>
-    <w:bookmarkStart w:id="318" w:name="ref_Segura1986Analisis"/>
+    <w:bookmarkEnd w:id="315"/>
+    <w:bookmarkStart w:id="316" w:name="ref_Segura1986Analisis"/>
     <w:p>
       <w:pPr>
         <w:pStyle w:val="Bibliography"/>
@@ -50673,8 +50608,8 @@
         <w:t xml:space="preserve">. 3.ª ed. Alianza Universidad Textos. Madrid: Alianza Editorial.</w:t>
       </w:r>
     </w:p>
-    <w:bookmarkEnd w:id="318"/>
-    <w:bookmarkStart w:id="319" w:name="ref_Sen1970Collective"/>
+    <w:bookmarkEnd w:id="316"/>
+    <w:bookmarkStart w:id="317" w:name="ref_Sen1970Collective"/>
     <w:p>
       <w:pPr>
         <w:pStyle w:val="Bibliography"/>
@@ -50696,8 +50631,8 @@
         <w:t xml:space="preserve">. San Francisco: Holden-Day.</w:t>
       </w:r>
     </w:p>
-    <w:bookmarkEnd w:id="319"/>
-    <w:bookmarkStart w:id="320" w:name="ref_Smith1776Wealth"/>
+    <w:bookmarkEnd w:id="317"/>
+    <w:bookmarkStart w:id="318" w:name="ref_Smith1776Wealth"/>
     <w:p>
       <w:pPr>
         <w:pStyle w:val="Bibliography"/>
@@ -50719,8 +50654,8 @@
         <w:t xml:space="preserve">. Londres: W. Strahan y T. Cadell.</w:t>
       </w:r>
     </w:p>
-    <w:bookmarkEnd w:id="320"/>
-    <w:bookmarkStart w:id="322" w:name="ref_Smith1962Experimental"/>
+    <w:bookmarkEnd w:id="318"/>
+    <w:bookmarkStart w:id="320" w:name="ref_Smith1962Experimental"/>
     <w:p>
       <w:pPr>
         <w:pStyle w:val="Bibliography"/>
@@ -50756,7 +50691,7 @@
       <w:r>
         <w:t xml:space="preserve"> </w:t>
       </w:r>
-      <w:hyperlink r:id="rId321">
+      <w:hyperlink r:id="rId319">
         <w:r>
           <w:rPr>
             <w:rStyle w:val="Hyperlink"/>
@@ -50768,8 +50703,8 @@
         <w:t xml:space="preserve">.</w:t>
       </w:r>
     </w:p>
-    <w:bookmarkEnd w:id="322"/>
-    <w:bookmarkStart w:id="323" w:name="ref_Stiglitz2002Information"/>
+    <w:bookmarkEnd w:id="320"/>
+    <w:bookmarkStart w:id="321" w:name="ref_Stiglitz2002Information"/>
     <w:p>
       <w:pPr>
         <w:pStyle w:val="Bibliography"/>
@@ -50803,8 +50738,8 @@
         <w:t xml:space="preserve">92 (3): 460-501.</w:t>
       </w:r>
     </w:p>
-    <w:bookmarkEnd w:id="323"/>
-    <w:bookmarkStart w:id="325" w:name="ref_Nobel1972HicksArrow"/>
+    <w:bookmarkEnd w:id="321"/>
+    <w:bookmarkStart w:id="323" w:name="ref_Nobel1972HicksArrow"/>
     <w:p>
       <w:pPr>
         <w:pStyle w:val="Bibliography"/>
@@ -50824,7 +50759,7 @@
       <w:r>
         <w:t xml:space="preserve"> </w:t>
       </w:r>
-      <w:hyperlink r:id="rId324">
+      <w:hyperlink r:id="rId322">
         <w:r>
           <w:rPr>
             <w:rStyle w:val="Hyperlink"/>
@@ -50836,8 +50771,8 @@
         <w:t xml:space="preserve">.</w:t>
       </w:r>
     </w:p>
-    <w:bookmarkEnd w:id="325"/>
-    <w:bookmarkStart w:id="327" w:name="ref_Nobel1998Sen"/>
+    <w:bookmarkEnd w:id="323"/>
+    <w:bookmarkStart w:id="325" w:name="ref_Nobel1998Sen"/>
     <w:p>
       <w:pPr>
         <w:pStyle w:val="Bibliography"/>
@@ -50857,7 +50792,7 @@
       <w:r>
         <w:t xml:space="preserve"> </w:t>
       </w:r>
-      <w:hyperlink r:id="rId326">
+      <w:hyperlink r:id="rId324">
         <w:r>
           <w:rPr>
             <w:rStyle w:val="Hyperlink"/>
@@ -50869,8 +50804,8 @@
         <w:t xml:space="preserve">.</w:t>
       </w:r>
     </w:p>
-    <w:bookmarkEnd w:id="327"/>
-    <w:bookmarkStart w:id="329" w:name="ref_Nobel2002Smith"/>
+    <w:bookmarkEnd w:id="325"/>
+    <w:bookmarkStart w:id="327" w:name="ref_Nobel2002Smith"/>
     <w:p>
       <w:pPr>
         <w:pStyle w:val="Bibliography"/>
@@ -50890,7 +50825,7 @@
       <w:r>
         <w:t xml:space="preserve"> </w:t>
       </w:r>
-      <w:hyperlink r:id="rId328">
+      <w:hyperlink r:id="rId326">
         <w:r>
           <w:rPr>
             <w:rStyle w:val="Hyperlink"/>
@@ -50902,8 +50837,8 @@
         <w:t xml:space="preserve">.</w:t>
       </w:r>
     </w:p>
-    <w:bookmarkEnd w:id="329"/>
-    <w:bookmarkStart w:id="330" w:name="ref_Varian1992Microeconomic"/>
+    <w:bookmarkEnd w:id="327"/>
+    <w:bookmarkStart w:id="328" w:name="ref_Varian1992Microeconomic"/>
     <w:p>
       <w:pPr>
         <w:pStyle w:val="Bibliography"/>
@@ -50925,8 +50860,8 @@
         <w:t xml:space="preserve">. 3.ª ed. Nueva York: W. W. Norton.</w:t>
       </w:r>
     </w:p>
-    <w:bookmarkEnd w:id="330"/>
-    <w:bookmarkStart w:id="332" w:name="ref_Vickrey1961Counterspeculation"/>
+    <w:bookmarkEnd w:id="328"/>
+    <w:bookmarkStart w:id="330" w:name="ref_Vickrey1961Counterspeculation"/>
     <w:p>
       <w:pPr>
         <w:pStyle w:val="Bibliography"/>
@@ -50962,7 +50897,7 @@
       <w:r>
         <w:t xml:space="preserve"> </w:t>
       </w:r>
-      <w:hyperlink r:id="rId331">
+      <w:hyperlink r:id="rId329">
         <w:r>
           <w:rPr>
             <w:rStyle w:val="Hyperlink"/>
@@ -50974,8 +50909,8 @@
         <w:t xml:space="preserve">.</w:t>
       </w:r>
     </w:p>
-    <w:bookmarkEnd w:id="332"/>
-    <w:bookmarkStart w:id="333" w:name="ref_Viner1950Customs"/>
+    <w:bookmarkEnd w:id="330"/>
+    <w:bookmarkStart w:id="331" w:name="ref_Viner1950Customs"/>
     <w:p>
       <w:pPr>
         <w:pStyle w:val="Bibliography"/>
@@ -50997,8 +50932,8 @@
         <w:t xml:space="preserve">. Nueva York: Carnegie Endowment for International Peace.</w:t>
       </w:r>
     </w:p>
-    <w:bookmarkEnd w:id="333"/>
-    <w:bookmarkStart w:id="334" w:name="ref_Walras1874Elements"/>
+    <w:bookmarkEnd w:id="331"/>
+    <w:bookmarkStart w:id="332" w:name="ref_Walras1874Elements"/>
     <w:p>
       <w:pPr>
         <w:pStyle w:val="Bibliography"/>
@@ -51020,8 +50955,8 @@
         <w:t xml:space="preserve">. Lausana: Corbaz.</w:t>
       </w:r>
     </w:p>
-    <w:bookmarkEnd w:id="334"/>
-    <w:bookmarkStart w:id="335" w:name="ref_Wicksell1958Selected"/>
+    <w:bookmarkEnd w:id="332"/>
+    <w:bookmarkStart w:id="333" w:name="ref_Wicksell1958Selected"/>
     <w:p>
       <w:pPr>
         <w:pStyle w:val="Bibliography"/>
@@ -51043,9 +50978,9 @@
         <w:t xml:space="preserve">. Editado por Erik Lindahl. Londres: Allen &amp; Unwin.</w:t>
       </w:r>
     </w:p>
+    <w:bookmarkEnd w:id="333"/>
+    <w:bookmarkEnd w:id="334"/>
     <w:bookmarkEnd w:id="335"/>
-    <w:bookmarkEnd w:id="336"/>
-    <w:bookmarkEnd w:id="337"/>
     <w:sectPr>
       <w:headerReference r:id="rId9" w:type="default"/>
       <w:footerReference r:id="rIdTceeB" w:type="default"/>
@@ -51285,71 +51220,11 @@
         <w:t xml:space="preserve"> </w:t>
       </w:r>
       <w:r>
-        <w:t xml:space="preserve">Lo popularizó</w:t>
-      </w:r>
-      <w:r>
-        <w:t xml:space="preserve"> </w:t>
-      </w:r>
-      <w:r>
-        <w:rPr>
-          <w:smallCaps/>
-        </w:rPr>
-        <w:t xml:space="preserve">Voltaire</w:t>
-      </w:r>
-      <w:r>
-        <w:t xml:space="preserve"> </w:t>
-      </w:r>
-      <w:r>
-        <w:t xml:space="preserve">en su cuento en verso</w:t>
-      </w:r>
-      <w:r>
-        <w:t xml:space="preserve"> </w:t>
-      </w:r>
-      <w:r>
-        <w:rPr>
-          <w:i/>
-          <w:iCs/>
-        </w:rPr>
-        <w:t xml:space="preserve">La Bégueule</w:t>
-      </w:r>
-      <w:r>
-        <w:t xml:space="preserve"> </w:t>
-      </w:r>
-      <w:r>
-        <w:t xml:space="preserve">(1772): «</w:t>
-      </w:r>
-      <w:r>
-        <w:rPr>
-          <w:i/>
-          <w:iCs/>
-        </w:rPr>
-        <w:t xml:space="preserve">Le mieux est l’ennemi du bien</w:t>
-      </w:r>
-      <w:r>
-        <w:t xml:space="preserve">».</w:t>
+        <w:t xml:space="preserve">Traducción propia de la parte I, cap. I, § 1.</w:t>
       </w:r>
     </w:p>
   </w:footnote>
   <w:footnote w:id="21">
-    <w:p>
-      <w:pPr>
-        <w:pStyle w:val="FootnoteText"/>
-      </w:pPr>
-      <w:r>
-        <w:rPr>
-          <w:rStyle w:val="FootnoteReference"/>
-        </w:rPr>
-        <w:footnoteRef/>
-      </w:r>
-      <w:r>
-        <w:t xml:space="preserve"> </w:t>
-      </w:r>
-      <w:r>
-        <w:t xml:space="preserve">Traducción propia de la parte I, cap. I, § 1.</w:t>
-      </w:r>
-    </w:p>
-  </w:footnote>
-  <w:footnote w:id="22">
     <w:p>
       <w:pPr>
         <w:pStyle w:val="FootnoteText"/>
@@ -51402,7 +51277,7 @@
       <w:r>
         <w:t xml:space="preserve"> </w:t>
       </w:r>
-      <w:hyperlink r:id="rId23">
+      <w:hyperlink r:id="rId22">
         <w:r>
           <w:rPr>
             <w:rStyle w:val="Referenciaatema"/>
@@ -51415,7 +51290,7 @@
       </w:r>
     </w:p>
   </w:footnote>
-  <w:footnote w:id="24">
+  <w:footnote w:id="23">
     <w:p>
       <w:pPr>
         <w:pStyle w:val="FootnoteText"/>
@@ -51507,7 +51382,7 @@
       </w:r>
     </w:p>
   </w:footnote>
-  <w:footnote w:id="25">
+  <w:footnote w:id="24">
     <w:p>
       <w:pPr>
         <w:pStyle w:val="FootnoteText"/>
@@ -51580,7 +51455,7 @@
       </w:r>
     </w:p>
   </w:footnote>
-  <w:footnote w:id="28">
+  <w:footnote w:id="27">
     <w:p>
       <w:pPr>
         <w:pStyle w:val="FootnoteText"/>
@@ -51625,6 +51500,25 @@
       </w:r>
     </w:p>
   </w:footnote>
+  <w:footnote w:id="29">
+    <w:p>
+      <w:pPr>
+        <w:pStyle w:val="FootnoteText"/>
+      </w:pPr>
+      <w:r>
+        <w:rPr>
+          <w:rStyle w:val="FootnoteReference"/>
+        </w:rPr>
+        <w:footnoteRef/>
+      </w:r>
+      <w:r>
+        <w:t xml:space="preserve"> </w:t>
+      </w:r>
+      <w:r>
+        <w:t xml:space="preserve">No importa, por ejemplo, si un bien se produce en una empresa grande o en muchas pequeñas, ni si son de propiedad privada o pública: la organización de la producción solo importa en la medida en que afecte a las utilidades.</w:t>
+      </w:r>
+    </w:p>
+  </w:footnote>
   <w:footnote w:id="30">
     <w:p>
       <w:pPr>
@@ -51640,30 +51534,11 @@
         <w:t xml:space="preserve"> </w:t>
       </w:r>
       <w:r>
-        <w:t xml:space="preserve">No importa, por ejemplo, si un bien se produce en una empresa grande o en muchas pequeñas, ni si son de propiedad privada o pública: la organización de la producción solo importa en la medida en que afecte a las utilidades.</w:t>
+        <w:t xml:space="preserve">Es un juicio de valor fuerte, que muchos no aceptarían en cualquier circunstancia: pocos respetarían sin más la preferencia de quien decide consumir heroína, y a veces se proponen como excepciones el alcohol, el tabaco, la sanidad, la educación o el ahorro.</w:t>
       </w:r>
     </w:p>
   </w:footnote>
-  <w:footnote w:id="31">
-    <w:p>
-      <w:pPr>
-        <w:pStyle w:val="FootnoteText"/>
-      </w:pPr>
-      <w:r>
-        <w:rPr>
-          <w:rStyle w:val="FootnoteReference"/>
-        </w:rPr>
-        <w:footnoteRef/>
-      </w:r>
-      <w:r>
-        <w:t xml:space="preserve"> </w:t>
-      </w:r>
-      <w:r>
-        <w:t xml:space="preserve">Es un juicio de valor fuerte, que muchos no aceptarían en cualquier circunstancia: pocos respetarían sin más la preferencia de quien decide consumir heroína, y a veces se proponen como excepciones el alcohol, el tabaco, la sanidad, la educación o el ahorro.</w:t>
-      </w:r>
-    </w:p>
-  </w:footnote>
-  <w:footnote w:id="33">
+  <w:footnote w:id="32">
     <w:p>
       <w:pPr>
         <w:pStyle w:val="FootnoteText"/>
@@ -51816,7 +51691,7 @@
       </w:r>
     </w:p>
   </w:footnote>
-  <w:footnote w:id="35">
+  <w:footnote w:id="34">
     <w:p>
       <w:pPr>
         <w:pStyle w:val="FootnoteText"/>
@@ -51835,7 +51710,7 @@
       </w:r>
     </w:p>
   </w:footnote>
-  <w:footnote w:id="37">
+  <w:footnote w:id="36">
     <w:p>
       <w:pPr>
         <w:pStyle w:val="FootnoteText"/>
@@ -51943,7 +51818,7 @@
       <w:r>
         <w:t xml:space="preserve"> </w:t>
       </w:r>
-      <w:hyperlink r:id="rId34">
+      <w:hyperlink r:id="rId33">
         <w:r>
           <w:rPr>
             <w:rStyle w:val="Referenciaatema"/>
@@ -51956,7 +51831,7 @@
       </w:r>
     </w:p>
   </w:footnote>
-  <w:footnote w:id="38">
+  <w:footnote w:id="37">
     <w:p>
       <w:pPr>
         <w:pStyle w:val="FootnoteText"/>
@@ -51986,26 +51861,26 @@
       </w:r>
     </w:p>
   </w:footnote>
+  <w:footnote w:id="42">
+    <w:p>
+      <w:pPr>
+        <w:pStyle w:val="FootnoteText"/>
+      </w:pPr>
+      <w:r>
+        <w:rPr>
+          <w:rStyle w:val="FootnoteReference"/>
+        </w:rPr>
+        <w:footnoteRef/>
+      </w:r>
+      <w:r>
+        <w:t xml:space="preserve"> </w:t>
+      </w:r>
+      <w:r>
+        <w:t xml:space="preserve">La FPP es el equilibrio de las empresas llevado al espacio de los bienes. Hace falta porque en el óptimo lo que se produce tiene que ser lo que se consume, y los consumidores deciden en el espacio de los bienes.</w:t>
+      </w:r>
+    </w:p>
+  </w:footnote>
   <w:footnote w:id="43">
-    <w:p>
-      <w:pPr>
-        <w:pStyle w:val="FootnoteText"/>
-      </w:pPr>
-      <w:r>
-        <w:rPr>
-          <w:rStyle w:val="FootnoteReference"/>
-        </w:rPr>
-        <w:footnoteRef/>
-      </w:r>
-      <w:r>
-        <w:t xml:space="preserve"> </w:t>
-      </w:r>
-      <w:r>
-        <w:t xml:space="preserve">La FPP es el equilibrio de las empresas llevado al espacio de los bienes. Hace falta porque en el óptimo lo que se produce tiene que ser lo que se consume, y los consumidores deciden en el espacio de los bienes.</w:t>
-      </w:r>
-    </w:p>
-  </w:footnote>
-  <w:footnote w:id="44">
     <w:p>
       <w:pPr>
         <w:pStyle w:val="FootnoteText"/>
@@ -52113,7 +51988,7 @@
       <w:r>
         <w:t xml:space="preserve"> </w:t>
       </w:r>
-      <w:hyperlink r:id="rId45">
+      <w:hyperlink r:id="rId44">
         <w:r>
           <w:rPr>
             <w:rStyle w:val="Referenciaatema"/>
@@ -52152,7 +52027,7 @@
       </w:r>
     </w:p>
   </w:footnote>
-  <w:footnote w:id="46">
+  <w:footnote w:id="45">
     <w:p>
       <w:pPr>
         <w:pStyle w:val="FootnoteText"/>
@@ -52192,7 +52067,7 @@
       <w:r>
         <w:t xml:space="preserve"> </w:t>
       </w:r>
-      <w:hyperlink r:id="rId26">
+      <w:hyperlink r:id="rId25">
         <w:r>
           <w:rPr>
             <w:rStyle w:val="Referenciaatema"/>
@@ -52205,7 +52080,7 @@
       </w:r>
     </w:p>
   </w:footnote>
-  <w:footnote w:id="48">
+  <w:footnote w:id="47">
     <w:p>
       <w:pPr>
         <w:pStyle w:val="FootnoteText"/>
@@ -52307,7 +52182,7 @@
       <w:r>
         <w:t xml:space="preserve"> </w:t>
       </w:r>
-      <w:hyperlink r:id="rId29">
+      <w:hyperlink r:id="rId28">
         <w:r>
           <w:rPr>
             <w:rStyle w:val="Referenciaatema"/>
@@ -52320,7 +52195,7 @@
       </w:r>
     </w:p>
   </w:footnote>
-  <w:footnote w:id="49">
+  <w:footnote w:id="48">
     <w:p>
       <w:pPr>
         <w:pStyle w:val="FootnoteText"/>
@@ -52454,7 +52329,7 @@
       </w:r>
     </w:p>
   </w:footnote>
-  <w:footnote w:id="54">
+  <w:footnote w:id="53">
     <w:p>
       <w:pPr>
         <w:pStyle w:val="FootnoteText"/>
@@ -52500,7 +52375,7 @@
       </w:r>
     </w:p>
   </w:footnote>
-  <w:footnote w:id="55">
+  <w:footnote w:id="54">
     <w:p>
       <w:pPr>
         <w:pStyle w:val="FootnoteText"/>
@@ -52519,7 +52394,7 @@
       </w:r>
     </w:p>
   </w:footnote>
-  <w:footnote w:id="59">
+  <w:footnote w:id="58">
     <w:p>
       <w:pPr>
         <w:pStyle w:val="FootnoteText"/>
@@ -52565,7 +52440,7 @@
       </w:r>
     </w:p>
   </w:footnote>
-  <w:footnote w:id="64">
+  <w:footnote w:id="63">
     <w:p>
       <w:pPr>
         <w:pStyle w:val="FootnoteText"/>
@@ -52782,7 +52657,7 @@
       </w:r>
     </w:p>
   </w:footnote>
-  <w:footnote w:id="73">
+  <w:footnote w:id="72">
     <w:p>
       <w:pPr>
         <w:pStyle w:val="FootnoteText"/>
@@ -52860,7 +52735,7 @@
       <w:r>
         <w:t xml:space="preserve"> </w:t>
       </w:r>
-      <w:hyperlink r:id="rId66">
+      <w:hyperlink r:id="rId65">
         <w:r>
           <w:rPr>
             <w:rStyle w:val="Referenciaatema"/>
@@ -52873,7 +52748,7 @@
       </w:r>
     </w:p>
   </w:footnote>
-  <w:footnote w:id="74">
+  <w:footnote w:id="73">
     <w:p>
       <w:pPr>
         <w:pStyle w:val="FootnoteText"/>
@@ -53111,7 +52986,7 @@
       <w:r>
         <w:t xml:space="preserve"> </w:t>
       </w:r>
-      <w:hyperlink r:id="rId75">
+      <w:hyperlink r:id="rId74">
         <w:r>
           <w:rPr>
             <w:rStyle w:val="Referenciaatema"/>
@@ -53122,7 +52997,7 @@
       <w:r>
         <w:t xml:space="preserve"> </w:t>
       </w:r>
-      <w:hyperlink r:id="rId76">
+      <w:hyperlink r:id="rId75">
         <w:r>
           <w:rPr>
             <w:rStyle w:val="Referenciaatema"/>
@@ -53135,7 +53010,7 @@
       </w:r>
     </w:p>
   </w:footnote>
-  <w:footnote w:id="77">
+  <w:footnote w:id="76">
     <w:p>
       <w:pPr>
         <w:pStyle w:val="FootnoteText"/>
@@ -53227,7 +53102,7 @@
       </w:r>
     </w:p>
   </w:footnote>
-  <w:footnote w:id="80">
+  <w:footnote w:id="79">
     <w:p>
       <w:pPr>
         <w:pStyle w:val="FootnoteText"/>
@@ -53272,7 +53147,7 @@
       </w:r>
     </w:p>
   </w:footnote>
-  <w:footnote w:id="101">
+  <w:footnote w:id="100">
     <w:p>
       <w:pPr>
         <w:pStyle w:val="FootnoteText"/>
@@ -53291,7 +53166,7 @@
       </w:r>
     </w:p>
   </w:footnote>
-  <w:footnote w:id="105">
+  <w:footnote w:id="104">
     <w:p>
       <w:pPr>
         <w:pStyle w:val="FootnoteText"/>
@@ -53352,7 +53227,7 @@
       </w:r>
     </w:p>
   </w:footnote>
-  <w:footnote w:id="138">
+  <w:footnote w:id="137">
     <w:p>
       <w:pPr>
         <w:pStyle w:val="FootnoteText"/>
@@ -53398,7 +53273,7 @@
       </w:r>
     </w:p>
   </w:footnote>
-  <w:footnote w:id="144">
+  <w:footnote w:id="143">
     <w:p>
       <w:pPr>
         <w:pStyle w:val="FootnoteText"/>
@@ -53443,7 +53318,7 @@
       </w:r>
     </w:p>
   </w:footnote>
-  <w:footnote w:id="157">
+  <w:footnote w:id="156">
     <w:p>
       <w:pPr>
         <w:pStyle w:val="FootnoteText"/>

</xml_diff>